<commit_message>
docs(pdf): Update on initial documents
</commit_message>
<xml_diff>
--- a/CCCS106_Lab01_Report_Barandon_Borja_Musa.docx
+++ b/CCCS106_Lab01_Report_Barandon_Borja_Musa.docx
@@ -6,9 +6,6 @@
       <w:pPr>
         <w:spacing w:after="40"/>
         <w:jc w:val="center"/>
-        <w:rPr>
-          <w:rFonts w:hint="eastAsia"/>
-        </w:rPr>
       </w:pPr>
       <w:r>
         <w:rPr>
@@ -61,9 +58,6 @@
       <w:pPr>
         <w:spacing w:after="280"/>
         <w:jc w:val="center"/>
-        <w:rPr>
-          <w:rFonts w:hint="eastAsia"/>
-        </w:rPr>
       </w:pPr>
       <w:r>
         <w:rPr>
@@ -76,9 +70,6 @@
       <w:pPr>
         <w:spacing w:after="120"/>
         <w:jc w:val="center"/>
-        <w:rPr>
-          <w:rFonts w:hint="eastAsia"/>
-        </w:rPr>
       </w:pPr>
       <w:r>
         <w:rPr>
@@ -93,9 +84,6 @@
       <w:pPr>
         <w:spacing w:after="360"/>
         <w:jc w:val="center"/>
-        <w:rPr>
-          <w:rFonts w:hint="eastAsia"/>
-        </w:rPr>
       </w:pPr>
       <w:r>
         <w:rPr>
@@ -135,9 +123,6 @@
           <w:p>
             <w:pPr>
               <w:spacing w:after="0"/>
-              <w:rPr>
-                <w:rFonts w:hint="eastAsia"/>
-              </w:rPr>
             </w:pPr>
             <w:r>
               <w:rPr>
@@ -162,9 +147,6 @@
           <w:p>
             <w:pPr>
               <w:spacing w:after="0"/>
-              <w:rPr>
-                <w:rFonts w:hint="eastAsia"/>
-              </w:rPr>
             </w:pPr>
             <w:r>
               <w:rPr>
@@ -173,7 +155,6 @@
               </w:rPr>
               <w:t xml:space="preserve">Group No. [ </w:t>
             </w:r>
-            <w:proofErr w:type="gramStart"/>
             <w:r>
               <w:rPr>
                 <w:color w:val="0F172A"/>
@@ -186,15 +167,7 @@
                 <w:color w:val="0F172A"/>
                 <w:sz w:val="19"/>
               </w:rPr>
-              <w:t xml:space="preserve"> ]</w:t>
-            </w:r>
-            <w:proofErr w:type="gramEnd"/>
-            <w:r>
-              <w:rPr>
-                <w:color w:val="0F172A"/>
-                <w:sz w:val="19"/>
-              </w:rPr>
-              <w:t xml:space="preserve">  (</w:t>
+              <w:t xml:space="preserve"> ]  (</w:t>
             </w:r>
             <w:r>
               <w:rPr>
@@ -231,9 +204,6 @@
           <w:p>
             <w:pPr>
               <w:spacing w:after="0"/>
-              <w:rPr>
-                <w:rFonts w:hint="eastAsia"/>
-              </w:rPr>
             </w:pPr>
             <w:r>
               <w:rPr>
@@ -258,9 +228,6 @@
           <w:p>
             <w:pPr>
               <w:spacing w:after="0"/>
-              <w:rPr>
-                <w:rFonts w:hint="eastAsia"/>
-              </w:rPr>
             </w:pPr>
             <w:r>
               <w:rPr>
@@ -290,9 +257,6 @@
           <w:p>
             <w:pPr>
               <w:spacing w:after="0"/>
-              <w:rPr>
-                <w:rFonts w:hint="eastAsia"/>
-              </w:rPr>
             </w:pPr>
             <w:r>
               <w:rPr>
@@ -317,9 +281,6 @@
           <w:p>
             <w:pPr>
               <w:spacing w:after="0"/>
-              <w:rPr>
-                <w:rFonts w:hint="eastAsia"/>
-              </w:rPr>
             </w:pPr>
             <w:r>
               <w:rPr>
@@ -335,17 +296,11 @@
     <w:p>
       <w:pPr>
         <w:spacing w:after="160"/>
-        <w:rPr>
-          <w:rFonts w:hint="eastAsia"/>
-        </w:rPr>
       </w:pPr>
     </w:p>
     <w:p>
       <w:pPr>
         <w:spacing w:before="160" w:after="80"/>
-        <w:rPr>
-          <w:rFonts w:hint="eastAsia"/>
-        </w:rPr>
       </w:pPr>
       <w:r>
         <w:rPr>
@@ -388,9 +343,6 @@
             <w:pPr>
               <w:spacing w:after="0"/>
               <w:jc w:val="center"/>
-              <w:rPr>
-                <w:rFonts w:hint="eastAsia"/>
-              </w:rPr>
             </w:pPr>
             <w:r>
               <w:rPr>
@@ -417,9 +369,6 @@
             <w:pPr>
               <w:spacing w:after="0"/>
               <w:jc w:val="center"/>
-              <w:rPr>
-                <w:rFonts w:hint="eastAsia"/>
-              </w:rPr>
             </w:pPr>
             <w:r>
               <w:rPr>
@@ -446,9 +395,6 @@
             <w:pPr>
               <w:spacing w:after="0"/>
               <w:jc w:val="center"/>
-              <w:rPr>
-                <w:rFonts w:hint="eastAsia"/>
-              </w:rPr>
             </w:pPr>
             <w:r>
               <w:rPr>
@@ -475,9 +421,6 @@
             <w:pPr>
               <w:spacing w:after="0"/>
               <w:jc w:val="center"/>
-              <w:rPr>
-                <w:rFonts w:hint="eastAsia"/>
-              </w:rPr>
             </w:pPr>
             <w:r>
               <w:rPr>
@@ -508,9 +451,6 @@
           <w:p>
             <w:pPr>
               <w:spacing w:after="0"/>
-              <w:rPr>
-                <w:rFonts w:hint="eastAsia"/>
-              </w:rPr>
             </w:pPr>
             <w:r>
               <w:rPr>
@@ -524,15 +464,7 @@
                 <w:b/>
                 <w:sz w:val="18"/>
               </w:rPr>
-              <w:t xml:space="preserve">Borja, Edmar </w:t>
-            </w:r>
-            <w:proofErr w:type="gramStart"/>
-            <w:r>
-              <w:rPr>
-                <w:b/>
-                <w:sz w:val="18"/>
-              </w:rPr>
-              <w:t>B.</w:t>
+              <w:t>Borja, Edmar B.</w:t>
             </w:r>
             <w:r>
               <w:rPr>
@@ -541,7 +473,6 @@
               </w:rPr>
               <w:t xml:space="preserve"> ]</w:t>
             </w:r>
-            <w:proofErr w:type="gramEnd"/>
           </w:p>
         </w:tc>
         <w:tc>
@@ -558,9 +489,6 @@
           <w:p>
             <w:pPr>
               <w:spacing w:after="0"/>
-              <w:rPr>
-                <w:rFonts w:hint="eastAsia"/>
-              </w:rPr>
             </w:pPr>
             <w:r>
               <w:rPr>
@@ -590,15 +518,18 @@
           <w:p>
             <w:pPr>
               <w:spacing w:after="0"/>
-              <w:rPr>
-                <w:rFonts w:hint="eastAsia"/>
-              </w:rPr>
             </w:pPr>
             <w:r>
               <w:rPr>
                 <w:sz w:val="18"/>
               </w:rPr>
-              <w:t>@dev1-username</w:t>
+              <w:t>@</w:t>
+            </w:r>
+            <w:r>
+              <w:rPr>
+                <w:sz w:val="18"/>
+              </w:rPr>
+              <w:t>edborja</w:t>
             </w:r>
           </w:p>
         </w:tc>
@@ -616,9 +547,6 @@
           <w:p>
             <w:pPr>
               <w:spacing w:after="0"/>
-              <w:rPr>
-                <w:rFonts w:hint="eastAsia"/>
-              </w:rPr>
             </w:pPr>
             <w:r>
               <w:rPr>
@@ -654,9 +582,6 @@
           <w:p>
             <w:pPr>
               <w:spacing w:after="0"/>
-              <w:rPr>
-                <w:rFonts w:hint="eastAsia"/>
-              </w:rPr>
             </w:pPr>
             <w:r>
               <w:rPr>
@@ -670,23 +595,7 @@
                 <w:b/>
                 <w:sz w:val="18"/>
               </w:rPr>
-              <w:t xml:space="preserve">Barandon, </w:t>
-            </w:r>
-            <w:proofErr w:type="spellStart"/>
-            <w:r>
-              <w:rPr>
-                <w:b/>
-                <w:sz w:val="18"/>
-              </w:rPr>
-              <w:t>Noelee</w:t>
-            </w:r>
-            <w:proofErr w:type="spellEnd"/>
-            <w:r>
-              <w:rPr>
-                <w:b/>
-                <w:sz w:val="18"/>
-              </w:rPr>
-              <w:t xml:space="preserve"> Anthony S.</w:t>
+              <w:t>Barandon, Noelee Anthony S.</w:t>
             </w:r>
             <w:r>
               <w:rPr>
@@ -711,9 +620,6 @@
           <w:p>
             <w:pPr>
               <w:spacing w:after="0"/>
-              <w:rPr>
-                <w:rFonts w:hint="eastAsia"/>
-              </w:rPr>
             </w:pPr>
             <w:r>
               <w:rPr>
@@ -749,15 +655,24 @@
           <w:p>
             <w:pPr>
               <w:spacing w:after="0"/>
-              <w:rPr>
-                <w:rFonts w:hint="eastAsia"/>
-              </w:rPr>
             </w:pPr>
             <w:r>
               <w:rPr>
                 <w:sz w:val="18"/>
               </w:rPr>
-              <w:t>@dev2-username</w:t>
+              <w:t>@</w:t>
+            </w:r>
+            <w:r>
+              <w:rPr>
+                <w:sz w:val="18"/>
+              </w:rPr>
+              <w:t>nonoelee</w:t>
+            </w:r>
+            <w:r>
+              <w:rPr>
+                <w:sz w:val="18"/>
+              </w:rPr>
+              <w:t>-ui</w:t>
             </w:r>
           </w:p>
         </w:tc>
@@ -775,9 +690,6 @@
           <w:p>
             <w:pPr>
               <w:spacing w:after="0"/>
-              <w:rPr>
-                <w:rFonts w:hint="eastAsia"/>
-              </w:rPr>
             </w:pPr>
             <w:r>
               <w:rPr>
@@ -813,9 +725,6 @@
           <w:p>
             <w:pPr>
               <w:spacing w:after="0"/>
-              <w:rPr>
-                <w:rFonts w:hint="eastAsia"/>
-              </w:rPr>
             </w:pPr>
             <w:r>
               <w:rPr>
@@ -829,15 +738,7 @@
                 <w:b/>
                 <w:sz w:val="18"/>
               </w:rPr>
-              <w:t xml:space="preserve">Musa, Eduardo Gabriel </w:t>
-            </w:r>
-            <w:proofErr w:type="gramStart"/>
-            <w:r>
-              <w:rPr>
-                <w:b/>
-                <w:sz w:val="18"/>
-              </w:rPr>
-              <w:t>S.</w:t>
+              <w:t>Musa, Eduardo Gabriel S.</w:t>
             </w:r>
             <w:r>
               <w:rPr>
@@ -846,7 +747,6 @@
               </w:rPr>
               <w:t xml:space="preserve"> ]</w:t>
             </w:r>
-            <w:proofErr w:type="gramEnd"/>
           </w:p>
         </w:tc>
         <w:tc>
@@ -863,9 +763,6 @@
           <w:p>
             <w:pPr>
               <w:spacing w:after="0"/>
-              <w:rPr>
-                <w:rFonts w:hint="eastAsia"/>
-              </w:rPr>
             </w:pPr>
             <w:r>
               <w:rPr>
@@ -895,9 +792,6 @@
           <w:p>
             <w:pPr>
               <w:spacing w:after="0"/>
-              <w:rPr>
-                <w:rFonts w:hint="eastAsia"/>
-              </w:rPr>
             </w:pPr>
             <w:r>
               <w:rPr>
@@ -927,9 +821,6 @@
           <w:p>
             <w:pPr>
               <w:spacing w:after="0"/>
-              <w:rPr>
-                <w:rFonts w:hint="eastAsia"/>
-              </w:rPr>
             </w:pPr>
             <w:r>
               <w:rPr>
@@ -949,11 +840,6 @@
       </w:tr>
     </w:tbl>
     <w:p>
-      <w:pPr>
-        <w:rPr>
-          <w:rFonts w:hint="eastAsia"/>
-        </w:rPr>
-      </w:pPr>
       <w:r>
         <w:br w:type="page"/>
       </w:r>
@@ -969,11 +855,6 @@
       </w:r>
     </w:p>
     <w:p>
-      <w:pPr>
-        <w:rPr>
-          <w:rFonts w:hint="eastAsia"/>
-        </w:rPr>
-      </w:pPr>
       <w:r>
         <w:rPr>
           <w:b/>
@@ -991,11 +872,6 @@
       </w:hyperlink>
     </w:p>
     <w:p>
-      <w:pPr>
-        <w:rPr>
-          <w:rFonts w:hint="eastAsia"/>
-        </w:rPr>
-      </w:pPr>
       <w:r>
         <w:t>Proof of team collaboration setup on GitHub. The screenshot below shows the repository Settings &gt; Collaborators page confirming that Developer 1 has invited Developer 2 and Developer 3 as official contributors with accepted statuses.</w:t>
       </w:r>
@@ -1035,9 +911,6 @@
             <w:pPr>
               <w:spacing w:before="240" w:after="80"/>
               <w:jc w:val="center"/>
-              <w:rPr>
-                <w:rFonts w:hint="eastAsia"/>
-              </w:rPr>
             </w:pPr>
             <w:r>
               <w:rPr>
@@ -1086,9 +959,6 @@
       <w:pPr>
         <w:spacing w:before="80" w:after="280"/>
         <w:jc w:val="center"/>
-        <w:rPr>
-          <w:rFonts w:hint="eastAsia"/>
-        </w:rPr>
       </w:pPr>
       <w:r>
         <w:rPr>
@@ -1108,11 +978,6 @@
       </w:r>
     </w:p>
     <w:p>
-      <w:pPr>
-        <w:rPr>
-          <w:rFonts w:hint="eastAsia"/>
-        </w:rPr>
-      </w:pPr>
       <w:r>
         <w:t>Pre-flight workstation audit executed via 'python verify_setup.py' inside the active virtual environment (.venv). All six (6) audit checks must report [PASS] verifying Python 3.10+, virtualenv isolation, Flet SDK v0.86.5+, Git binary detection, configured institutional user identity, and .gitignore hygiene.</w:t>
       </w:r>
@@ -1152,9 +1017,6 @@
             <w:pPr>
               <w:spacing w:before="240" w:after="80"/>
               <w:jc w:val="center"/>
-              <w:rPr>
-                <w:rFonts w:hint="eastAsia"/>
-              </w:rPr>
             </w:pPr>
             <w:r>
               <w:rPr>
@@ -1203,9 +1065,6 @@
       <w:pPr>
         <w:spacing w:before="80" w:after="280"/>
         <w:jc w:val="center"/>
-        <w:rPr>
-          <w:rFonts w:hint="eastAsia"/>
-        </w:rPr>
       </w:pPr>
       <w:r>
         <w:rPr>
@@ -1225,11 +1084,6 @@
       </w:r>
     </w:p>
     <w:p>
-      <w:pPr>
-        <w:rPr>
-          <w:rFonts w:hint="eastAsia"/>
-        </w:rPr>
-      </w:pPr>
       <w:r>
         <w:t>Demonstration of repository hygiene. The screenshot proves that the working tree is clean with zero uncommitted changes, and that .venv/ is completely untracked (verified by running 'git ls-files .venv', returning empty output).</w:t>
       </w:r>
@@ -1269,9 +1123,6 @@
             <w:pPr>
               <w:spacing w:before="240" w:after="80"/>
               <w:jc w:val="center"/>
-              <w:rPr>
-                <w:rFonts w:hint="eastAsia"/>
-              </w:rPr>
             </w:pPr>
             <w:r>
               <w:rPr>
@@ -1320,9 +1171,6 @@
       <w:pPr>
         <w:spacing w:before="80" w:after="280"/>
         <w:jc w:val="center"/>
-        <w:rPr>
-          <w:rFonts w:hint="eastAsia"/>
-        </w:rPr>
       </w:pPr>
       <w:r>
         <w:rPr>
@@ -1333,11 +1181,6 @@
       </w:r>
     </w:p>
     <w:p>
-      <w:pPr>
-        <w:rPr>
-          <w:rFonts w:hint="eastAsia"/>
-        </w:rPr>
-      </w:pPr>
       <w:r>
         <w:lastRenderedPageBreak/>
         <w:br w:type="page"/>
@@ -1354,11 +1197,6 @@
       </w:r>
     </w:p>
     <w:p>
-      <w:pPr>
-        <w:rPr>
-          <w:rFonts w:hint="eastAsia"/>
-        </w:rPr>
-      </w:pPr>
       <w:r>
         <w:t>Desktop window screenshots demonstrating the running collaborative Flet GUI application across its three core interactive states: Initial Launch, Sprint Goal Milestone Reached, and Dark Mode theme toggle.</w:t>
       </w:r>
@@ -1398,9 +1236,6 @@
             <w:pPr>
               <w:spacing w:before="240" w:after="80"/>
               <w:jc w:val="center"/>
-              <w:rPr>
-                <w:rFonts w:hint="eastAsia"/>
-              </w:rPr>
             </w:pPr>
             <w:r>
               <w:rPr>
@@ -1449,9 +1284,6 @@
       <w:pPr>
         <w:spacing w:before="80" w:after="280"/>
         <w:jc w:val="center"/>
-        <w:rPr>
-          <w:rFonts w:hint="eastAsia"/>
-        </w:rPr>
       </w:pPr>
       <w:r>
         <w:rPr>
@@ -1496,9 +1328,6 @@
             <w:pPr>
               <w:spacing w:before="240" w:after="80"/>
               <w:jc w:val="center"/>
-              <w:rPr>
-                <w:rFonts w:hint="eastAsia"/>
-              </w:rPr>
             </w:pPr>
             <w:r>
               <w:rPr>
@@ -1547,9 +1376,6 @@
       <w:pPr>
         <w:spacing w:before="80" w:after="280"/>
         <w:jc w:val="center"/>
-        <w:rPr>
-          <w:rFonts w:hint="eastAsia"/>
-        </w:rPr>
       </w:pPr>
       <w:r>
         <w:rPr>
@@ -1594,9 +1420,6 @@
             <w:pPr>
               <w:spacing w:before="240" w:after="80"/>
               <w:jc w:val="center"/>
-              <w:rPr>
-                <w:rFonts w:hint="eastAsia"/>
-              </w:rPr>
             </w:pPr>
             <w:r>
               <w:rPr>
@@ -1645,9 +1468,6 @@
       <w:pPr>
         <w:spacing w:before="80" w:after="280"/>
         <w:jc w:val="center"/>
-        <w:rPr>
-          <w:rFonts w:hint="eastAsia"/>
-        </w:rPr>
       </w:pPr>
       <w:r>
         <w:rPr>
@@ -1658,11 +1478,6 @@
       </w:r>
     </w:p>
     <w:p>
-      <w:pPr>
-        <w:rPr>
-          <w:rFonts w:hint="eastAsia"/>
-        </w:rPr>
-      </w:pPr>
       <w:r>
         <w:br w:type="page"/>
       </w:r>
@@ -1678,11 +1493,6 @@
       </w:r>
     </w:p>
     <w:p>
-      <w:pPr>
-        <w:rPr>
-          <w:rFonts w:hint="eastAsia"/>
-        </w:rPr>
-      </w:pPr>
       <w:r>
         <w:t>Summary of individual contributions and commit accountability across all three triad developers.</w:t>
       </w:r>
@@ -1720,9 +1530,6 @@
             <w:pPr>
               <w:spacing w:after="0"/>
               <w:jc w:val="center"/>
-              <w:rPr>
-                <w:rFonts w:hint="eastAsia"/>
-              </w:rPr>
             </w:pPr>
             <w:r>
               <w:rPr>
@@ -1749,9 +1556,6 @@
             <w:pPr>
               <w:spacing w:after="0"/>
               <w:jc w:val="center"/>
-              <w:rPr>
-                <w:rFonts w:hint="eastAsia"/>
-              </w:rPr>
             </w:pPr>
             <w:r>
               <w:rPr>
@@ -1778,9 +1582,6 @@
             <w:pPr>
               <w:spacing w:after="0"/>
               <w:jc w:val="center"/>
-              <w:rPr>
-                <w:rFonts w:hint="eastAsia"/>
-              </w:rPr>
             </w:pPr>
             <w:r>
               <w:rPr>
@@ -1807,9 +1608,6 @@
             <w:pPr>
               <w:spacing w:after="0"/>
               <w:jc w:val="center"/>
-              <w:rPr>
-                <w:rFonts w:hint="eastAsia"/>
-              </w:rPr>
             </w:pPr>
             <w:r>
               <w:rPr>
@@ -1836,9 +1634,6 @@
             <w:pPr>
               <w:spacing w:after="0"/>
               <w:jc w:val="center"/>
-              <w:rPr>
-                <w:rFonts w:hint="eastAsia"/>
-              </w:rPr>
             </w:pPr>
             <w:r>
               <w:rPr>
@@ -1869,9 +1664,6 @@
           <w:p>
             <w:pPr>
               <w:spacing w:after="0"/>
-              <w:rPr>
-                <w:rFonts w:hint="eastAsia"/>
-              </w:rPr>
             </w:pPr>
             <w:r>
               <w:rPr>
@@ -1885,15 +1677,7 @@
                 <w:b/>
                 <w:sz w:val="17"/>
               </w:rPr>
-              <w:t xml:space="preserve">Borja, Edmar </w:t>
-            </w:r>
-            <w:proofErr w:type="gramStart"/>
-            <w:r>
-              <w:rPr>
-                <w:b/>
-                <w:sz w:val="17"/>
-              </w:rPr>
-              <w:t>B.</w:t>
+              <w:t>Borja, Edmar B.</w:t>
             </w:r>
             <w:r>
               <w:rPr>
@@ -1902,7 +1686,6 @@
               </w:rPr>
               <w:t xml:space="preserve"> ]</w:t>
             </w:r>
-            <w:proofErr w:type="gramEnd"/>
           </w:p>
         </w:tc>
         <w:tc>
@@ -1919,9 +1702,6 @@
           <w:p>
             <w:pPr>
               <w:spacing w:after="0"/>
-              <w:rPr>
-                <w:rFonts w:hint="eastAsia"/>
-              </w:rPr>
             </w:pPr>
             <w:r>
               <w:rPr>
@@ -1952,15 +1732,12 @@
           <w:p>
             <w:pPr>
               <w:spacing w:after="0"/>
-              <w:rPr>
-                <w:rFonts w:hint="eastAsia"/>
-              </w:rPr>
             </w:pPr>
             <w:r>
               <w:rPr>
                 <w:sz w:val="17"/>
               </w:rPr>
-              <w:t>feature/dev1-profile</w:t>
+              <w:t>branch</w:t>
             </w:r>
           </w:p>
         </w:tc>
@@ -1978,9 +1755,6 @@
           <w:p>
             <w:pPr>
               <w:spacing w:after="0"/>
-              <w:rPr>
-                <w:rFonts w:hint="eastAsia"/>
-              </w:rPr>
             </w:pPr>
             <w:r>
               <w:rPr>
@@ -2004,9 +1778,6 @@
           <w:p>
             <w:pPr>
               <w:spacing w:after="0"/>
-              <w:rPr>
-                <w:rFonts w:hint="eastAsia"/>
-              </w:rPr>
             </w:pPr>
             <w:r>
               <w:rPr>
@@ -2035,9 +1806,6 @@
           <w:p>
             <w:pPr>
               <w:spacing w:after="0"/>
-              <w:rPr>
-                <w:rFonts w:hint="eastAsia"/>
-              </w:rPr>
             </w:pPr>
             <w:r>
               <w:rPr>
@@ -2051,23 +1819,7 @@
                 <w:b/>
                 <w:sz w:val="17"/>
               </w:rPr>
-              <w:t xml:space="preserve">Barandon, </w:t>
-            </w:r>
-            <w:proofErr w:type="spellStart"/>
-            <w:r>
-              <w:rPr>
-                <w:b/>
-                <w:sz w:val="17"/>
-              </w:rPr>
-              <w:t>Noelee</w:t>
-            </w:r>
-            <w:proofErr w:type="spellEnd"/>
-            <w:r>
-              <w:rPr>
-                <w:b/>
-                <w:sz w:val="17"/>
-              </w:rPr>
-              <w:t xml:space="preserve"> Anthony S.</w:t>
+              <w:t>Barandon, Noelee Anthony S.</w:t>
             </w:r>
             <w:r>
               <w:rPr>
@@ -2092,9 +1844,6 @@
           <w:p>
             <w:pPr>
               <w:spacing w:after="0"/>
-              <w:rPr>
-                <w:rFonts w:hint="eastAsia"/>
-              </w:rPr>
             </w:pPr>
             <w:r>
               <w:rPr>
@@ -2125,9 +1874,6 @@
           <w:p>
             <w:pPr>
               <w:spacing w:after="0"/>
-              <w:rPr>
-                <w:rFonts w:hint="eastAsia"/>
-              </w:rPr>
             </w:pPr>
             <w:r>
               <w:rPr>
@@ -2151,9 +1897,6 @@
           <w:p>
             <w:pPr>
               <w:spacing w:after="0"/>
-              <w:rPr>
-                <w:rFonts w:hint="eastAsia"/>
-              </w:rPr>
             </w:pPr>
             <w:r>
               <w:rPr>
@@ -2177,9 +1920,6 @@
           <w:p>
             <w:pPr>
               <w:spacing w:after="0"/>
-              <w:rPr>
-                <w:rFonts w:hint="eastAsia"/>
-              </w:rPr>
             </w:pPr>
             <w:r>
               <w:rPr>
@@ -2208,9 +1948,6 @@
           <w:p>
             <w:pPr>
               <w:spacing w:after="0"/>
-              <w:rPr>
-                <w:rFonts w:hint="eastAsia"/>
-              </w:rPr>
             </w:pPr>
             <w:r>
               <w:rPr>
@@ -2224,15 +1961,7 @@
                 <w:b/>
                 <w:sz w:val="17"/>
               </w:rPr>
-              <w:t xml:space="preserve">Musa, Eduardo Gabriel </w:t>
-            </w:r>
-            <w:proofErr w:type="gramStart"/>
-            <w:r>
-              <w:rPr>
-                <w:b/>
-                <w:sz w:val="17"/>
-              </w:rPr>
-              <w:t>S.</w:t>
+              <w:t>Musa, Eduardo Gabriel S.</w:t>
             </w:r>
             <w:r>
               <w:rPr>
@@ -2241,7 +1970,6 @@
               </w:rPr>
               <w:t xml:space="preserve"> ]</w:t>
             </w:r>
-            <w:proofErr w:type="gramEnd"/>
           </w:p>
         </w:tc>
         <w:tc>
@@ -2258,9 +1986,6 @@
           <w:p>
             <w:pPr>
               <w:spacing w:after="0"/>
-              <w:rPr>
-                <w:rFonts w:hint="eastAsia"/>
-              </w:rPr>
             </w:pPr>
             <w:r>
               <w:rPr>
@@ -2291,15 +2016,12 @@
           <w:p>
             <w:pPr>
               <w:spacing w:after="0"/>
-              <w:rPr>
-                <w:rFonts w:hint="eastAsia"/>
-              </w:rPr>
             </w:pPr>
             <w:r>
               <w:rPr>
                 <w:sz w:val="17"/>
               </w:rPr>
-              <w:t>feature/dev3-features</w:t>
+              <w:t>mymitz</w:t>
             </w:r>
           </w:p>
         </w:tc>
@@ -2317,9 +2039,6 @@
           <w:p>
             <w:pPr>
               <w:spacing w:after="0"/>
-              <w:rPr>
-                <w:rFonts w:hint="eastAsia"/>
-              </w:rPr>
             </w:pPr>
             <w:r>
               <w:rPr>
@@ -2343,9 +2062,6 @@
           <w:p>
             <w:pPr>
               <w:spacing w:after="0"/>
-              <w:rPr>
-                <w:rFonts w:hint="eastAsia"/>
-              </w:rPr>
             </w:pPr>
             <w:r>
               <w:rPr>
@@ -2357,13 +2073,7 @@
         </w:tc>
       </w:tr>
     </w:tbl>
-    <w:p>
-      <w:pPr>
-        <w:rPr>
-          <w:rFonts w:hint="eastAsia"/>
-        </w:rPr>
-      </w:pPr>
-    </w:p>
+    <w:p/>
     <w:p>
       <w:pPr>
         <w:pStyle w:val="Heading2"/>
@@ -2375,9 +2085,6 @@
     <w:p>
       <w:pPr>
         <w:spacing w:before="80" w:after="40"/>
-        <w:rPr>
-          <w:rFonts w:hint="eastAsia"/>
-        </w:rPr>
       </w:pPr>
       <w:r>
         <w:rPr>
@@ -2391,9 +2098,6 @@
     <w:p>
       <w:pPr>
         <w:spacing w:after="160"/>
-        <w:rPr>
-          <w:rFonts w:hint="eastAsia"/>
-        </w:rPr>
       </w:pPr>
       <w:r>
         <w:rPr>
@@ -2407,9 +2111,6 @@
     <w:p>
       <w:pPr>
         <w:spacing w:before="80" w:after="40"/>
-        <w:rPr>
-          <w:rFonts w:hint="eastAsia"/>
-        </w:rPr>
       </w:pPr>
       <w:r>
         <w:rPr>
@@ -2423,9 +2124,6 @@
     <w:p>
       <w:pPr>
         <w:spacing w:after="160"/>
-        <w:rPr>
-          <w:rFonts w:hint="eastAsia"/>
-        </w:rPr>
       </w:pPr>
       <w:r>
         <w:rPr>
@@ -2439,9 +2137,6 @@
     <w:p>
       <w:pPr>
         <w:spacing w:before="80" w:after="40"/>
-        <w:rPr>
-          <w:rFonts w:hint="eastAsia"/>
-        </w:rPr>
       </w:pPr>
       <w:r>
         <w:rPr>
@@ -2455,9 +2150,6 @@
     <w:p>
       <w:pPr>
         <w:spacing w:after="160"/>
-        <w:rPr>
-          <w:rFonts w:hint="eastAsia"/>
-        </w:rPr>
       </w:pPr>
       <w:r>
         <w:rPr>
@@ -2469,11 +2161,6 @@
       </w:r>
     </w:p>
     <w:p>
-      <w:pPr>
-        <w:rPr>
-          <w:rFonts w:hint="eastAsia"/>
-        </w:rPr>
-      </w:pPr>
       <w:r>
         <w:br w:type="page"/>
       </w:r>
@@ -2489,11 +2176,6 @@
       </w:r>
     </w:p>
     <w:p>
-      <w:pPr>
-        <w:rPr>
-          <w:rFonts w:hint="eastAsia"/>
-        </w:rPr>
-      </w:pPr>
       <w:r>
         <w:t>Verbatim ASCII commit history exported using 'git log --oneline --graph --all &gt; git_log_proof.txt'. This demonstrates the complete sequential feature branching and merge timeline across all three developers.</w:t>
       </w:r>
@@ -2526,9 +2208,6 @@
           <w:p>
             <w:pPr>
               <w:spacing w:after="0"/>
-              <w:rPr>
-                <w:rFonts w:hint="eastAsia"/>
-              </w:rPr>
             </w:pPr>
             <w:r>
               <w:rPr>
@@ -2687,9 +2366,6 @@
     <w:p>
       <w:pPr>
         <w:spacing w:after="0" w:line="240" w:lineRule="auto"/>
-        <w:rPr>
-          <w:rFonts w:hint="eastAsia"/>
-        </w:rPr>
       </w:pPr>
       <w:r>
         <w:separator/>
@@ -2700,9 +2376,6 @@
     <w:p>
       <w:pPr>
         <w:spacing w:after="0" w:line="240" w:lineRule="auto"/>
-        <w:rPr>
-          <w:rFonts w:hint="eastAsia"/>
-        </w:rPr>
       </w:pPr>
       <w:r>
         <w:continuationSeparator/>
@@ -2718,9 +2391,6 @@
     <w:pPr>
       <w:pStyle w:val="Footer"/>
       <w:jc w:val="center"/>
-      <w:rPr>
-        <w:rFonts w:hint="eastAsia"/>
-      </w:rPr>
     </w:pPr>
     <w:r>
       <w:rPr>
@@ -2739,9 +2409,6 @@
     <w:p>
       <w:pPr>
         <w:spacing w:after="0" w:line="240" w:lineRule="auto"/>
-        <w:rPr>
-          <w:rFonts w:hint="eastAsia"/>
-        </w:rPr>
       </w:pPr>
       <w:r>
         <w:separator/>
@@ -2752,9 +2419,6 @@
     <w:p>
       <w:pPr>
         <w:spacing w:after="0" w:line="240" w:lineRule="auto"/>
-        <w:rPr>
-          <w:rFonts w:hint="eastAsia"/>
-        </w:rPr>
       </w:pPr>
       <w:r>
         <w:continuationSeparator/>
@@ -2770,9 +2434,6 @@
     <w:pPr>
       <w:pStyle w:val="Header"/>
       <w:jc w:val="right"/>
-      <w:rPr>
-        <w:rFonts w:hint="eastAsia"/>
-      </w:rPr>
     </w:pPr>
     <w:r>
       <w:rPr>

</xml_diff>

<commit_message>
docs(pdf): Update screenshots on Section 1-3
</commit_message>
<xml_diff>
--- a/CCCS106_Lab01_Report_Barandon_Borja_Musa.docx
+++ b/CCCS106_Lab01_Report_Barandon_Borja_Musa.docx
@@ -155,6 +155,7 @@
               </w:rPr>
               <w:t xml:space="preserve">Group No. [ </w:t>
             </w:r>
+            <w:proofErr w:type="gramStart"/>
             <w:r>
               <w:rPr>
                 <w:color w:val="0F172A"/>
@@ -167,7 +168,15 @@
                 <w:color w:val="0F172A"/>
                 <w:sz w:val="19"/>
               </w:rPr>
-              <w:t xml:space="preserve"> ]  (</w:t>
+              <w:t xml:space="preserve"> ]</w:t>
+            </w:r>
+            <w:proofErr w:type="gramEnd"/>
+            <w:r>
+              <w:rPr>
+                <w:color w:val="0F172A"/>
+                <w:sz w:val="19"/>
+              </w:rPr>
+              <w:t xml:space="preserve">  (</w:t>
             </w:r>
             <w:r>
               <w:rPr>
@@ -234,8 +243,17 @@
                 <w:color w:val="0F172A"/>
                 <w:sz w:val="19"/>
               </w:rPr>
-              <w:t>[ Month DD, 2026 ]</w:t>
+              <w:t xml:space="preserve">[ Month DD, </w:t>
             </w:r>
+            <w:proofErr w:type="gramStart"/>
+            <w:r>
+              <w:rPr>
+                <w:color w:val="0F172A"/>
+                <w:sz w:val="19"/>
+              </w:rPr>
+              <w:t>2026 ]</w:t>
+            </w:r>
+            <w:proofErr w:type="gramEnd"/>
           </w:p>
         </w:tc>
       </w:tr>
@@ -464,7 +482,15 @@
                 <w:b/>
                 <w:sz w:val="18"/>
               </w:rPr>
-              <w:t>Borja, Edmar B.</w:t>
+              <w:t xml:space="preserve">Borja, Edmar </w:t>
+            </w:r>
+            <w:proofErr w:type="gramStart"/>
+            <w:r>
+              <w:rPr>
+                <w:b/>
+                <w:sz w:val="18"/>
+              </w:rPr>
+              <w:t>B.</w:t>
             </w:r>
             <w:r>
               <w:rPr>
@@ -473,6 +499,7 @@
               </w:rPr>
               <w:t xml:space="preserve"> ]</w:t>
             </w:r>
+            <w:proofErr w:type="gramEnd"/>
           </w:p>
         </w:tc>
         <w:tc>
@@ -595,7 +622,23 @@
                 <w:b/>
                 <w:sz w:val="18"/>
               </w:rPr>
-              <w:t>Barandon, Noelee Anthony S.</w:t>
+              <w:t xml:space="preserve">Barandon, </w:t>
+            </w:r>
+            <w:proofErr w:type="spellStart"/>
+            <w:r>
+              <w:rPr>
+                <w:b/>
+                <w:sz w:val="18"/>
+              </w:rPr>
+              <w:t>Noelee</w:t>
+            </w:r>
+            <w:proofErr w:type="spellEnd"/>
+            <w:r>
+              <w:rPr>
+                <w:b/>
+                <w:sz w:val="18"/>
+              </w:rPr>
+              <w:t xml:space="preserve"> Anthony S.</w:t>
             </w:r>
             <w:r>
               <w:rPr>
@@ -738,7 +781,15 @@
                 <w:b/>
                 <w:sz w:val="18"/>
               </w:rPr>
-              <w:t>Musa, Eduardo Gabriel S.</w:t>
+              <w:t xml:space="preserve">Musa, Eduardo Gabriel </w:t>
+            </w:r>
+            <w:proofErr w:type="gramStart"/>
+            <w:r>
+              <w:rPr>
+                <w:b/>
+                <w:sz w:val="18"/>
+              </w:rPr>
+              <w:t>S.</w:t>
             </w:r>
             <w:r>
               <w:rPr>
@@ -747,6 +798,7 @@
               </w:rPr>
               <w:t xml:space="preserve"> ]</w:t>
             </w:r>
+            <w:proofErr w:type="gramEnd"/>
           </w:p>
         </w:tc>
         <w:tc>
@@ -914,42 +966,83 @@
             </w:pPr>
             <w:r>
               <w:rPr>
-                <w:b/>
-                <w:color w:val="475569"/>
-                <w:sz w:val="22"/>
+                <w:noProof/>
               </w:rPr>
-              <w:t>[ PASTE / INSERT SCREENSHOT IMAGE HERE ]</w:t>
+              <w:drawing>
+                <wp:inline distT="0" distB="0" distL="0" distR="0" wp14:anchorId="0518C69C" wp14:editId="00B97449">
+                  <wp:extent cx="5689600" cy="2905125"/>
+                  <wp:effectExtent l="0" t="0" r="6350" b="9525"/>
+                  <wp:docPr id="128030443" name="Picture 1"/>
+                  <wp:cNvGraphicFramePr>
+                    <a:graphicFrameLocks xmlns:a="http://schemas.openxmlformats.org/drawingml/2006/main" noChangeAspect="1"/>
+                  </wp:cNvGraphicFramePr>
+                  <a:graphic xmlns:a="http://schemas.openxmlformats.org/drawingml/2006/main">
+                    <a:graphicData uri="http://schemas.openxmlformats.org/drawingml/2006/picture">
+                      <pic:pic xmlns:pic="http://schemas.openxmlformats.org/drawingml/2006/picture">
+                        <pic:nvPicPr>
+                          <pic:cNvPr id="128030443" name="Picture 128030443"/>
+                          <pic:cNvPicPr/>
+                        </pic:nvPicPr>
+                        <pic:blipFill>
+                          <a:blip r:embed="rId9"/>
+                          <a:stretch>
+                            <a:fillRect/>
+                          </a:stretch>
+                        </pic:blipFill>
+                        <pic:spPr>
+                          <a:xfrm>
+                            <a:off x="0" y="0"/>
+                            <a:ext cx="5689600" cy="2905125"/>
+                          </a:xfrm>
+                          <a:prstGeom prst="rect">
+                            <a:avLst/>
+                          </a:prstGeom>
+                        </pic:spPr>
+                      </pic:pic>
+                    </a:graphicData>
+                  </a:graphic>
+                </wp:inline>
+              </w:drawing>
             </w:r>
             <w:r>
               <w:rPr>
-                <w:b/>
-                <w:color w:val="475569"/>
-                <w:sz w:val="22"/>
+                <w:noProof/>
               </w:rPr>
-              <w:br/>
-            </w:r>
-            <w:r>
-              <w:rPr>
-                <w:i/>
-                <w:color w:val="64748B"/>
-                <w:sz w:val="19"/>
-              </w:rPr>
-              <w:t>Reference: GitHub Collaborators Verification (Settings &gt; Collaborators)</w:t>
-            </w:r>
-            <w:r>
-              <w:rPr>
-                <w:i/>
-                <w:color w:val="64748B"/>
-                <w:sz w:val="19"/>
-              </w:rPr>
-              <w:br/>
-            </w:r>
-            <w:r>
-              <w:rPr>
-                <w:color w:val="94A3B8"/>
-                <w:sz w:val="18"/>
-              </w:rPr>
-              <w:t>Requirement: Screenshot showing Developer 1 (Owner), Developer 2, and Developer 3 with accepted invitations.</w:t>
+              <w:drawing>
+                <wp:inline distT="0" distB="0" distL="0" distR="0" wp14:anchorId="3CE4899B" wp14:editId="7AABF0CB">
+                  <wp:extent cx="5689600" cy="2835275"/>
+                  <wp:effectExtent l="0" t="0" r="6350" b="3175"/>
+                  <wp:docPr id="877353589" name="Picture 2"/>
+                  <wp:cNvGraphicFramePr>
+                    <a:graphicFrameLocks xmlns:a="http://schemas.openxmlformats.org/drawingml/2006/main" noChangeAspect="1"/>
+                  </wp:cNvGraphicFramePr>
+                  <a:graphic xmlns:a="http://schemas.openxmlformats.org/drawingml/2006/main">
+                    <a:graphicData uri="http://schemas.openxmlformats.org/drawingml/2006/picture">
+                      <pic:pic xmlns:pic="http://schemas.openxmlformats.org/drawingml/2006/picture">
+                        <pic:nvPicPr>
+                          <pic:cNvPr id="877353589" name="Picture 877353589"/>
+                          <pic:cNvPicPr/>
+                        </pic:nvPicPr>
+                        <pic:blipFill>
+                          <a:blip r:embed="rId10"/>
+                          <a:stretch>
+                            <a:fillRect/>
+                          </a:stretch>
+                        </pic:blipFill>
+                        <pic:spPr>
+                          <a:xfrm>
+                            <a:off x="0" y="0"/>
+                            <a:ext cx="5689600" cy="2835275"/>
+                          </a:xfrm>
+                          <a:prstGeom prst="rect">
+                            <a:avLst/>
+                          </a:prstGeom>
+                        </pic:spPr>
+                      </pic:pic>
+                    </a:graphicData>
+                  </a:graphic>
+                </wp:inline>
+              </w:drawing>
             </w:r>
           </w:p>
         </w:tc>
@@ -974,12 +1067,42 @@
         <w:spacing w:before="280" w:after="120"/>
       </w:pPr>
       <w:r>
+        <w:lastRenderedPageBreak/>
         <w:t>Section 2: Automated Pre-Flight Diagnostics Audit</w:t>
       </w:r>
     </w:p>
     <w:p>
       <w:r>
-        <w:t>Pre-flight workstation audit executed via 'python verify_setup.py' inside the active virtual environment (.venv). All six (6) audit checks must report [PASS] verifying Python 3.10+, virtualenv isolation, Flet SDK v0.86.5+, Git binary detection, configured institutional user identity, and .gitignore hygiene.</w:t>
+        <w:t>Pre-flight workstation audit executed via 'python verify_setup.py' inside the active virtual environment (.</w:t>
+      </w:r>
+      <w:proofErr w:type="spellStart"/>
+      <w:r>
+        <w:t>venv</w:t>
+      </w:r>
+      <w:proofErr w:type="spellEnd"/>
+      <w:r>
+        <w:t xml:space="preserve">). All six (6) audit checks must report [PASS] verifying Python 3.10+, </w:t>
+      </w:r>
+      <w:proofErr w:type="spellStart"/>
+      <w:r>
+        <w:t>virtualenv</w:t>
+      </w:r>
+      <w:proofErr w:type="spellEnd"/>
+      <w:r>
+        <w:t xml:space="preserve"> isolation, Flet SDK v0.86.5+, Git binary detection, configured institutional user identity, </w:t>
+      </w:r>
+      <w:proofErr w:type="gramStart"/>
+      <w:r>
+        <w:t>and .</w:t>
+      </w:r>
+      <w:proofErr w:type="spellStart"/>
+      <w:r>
+        <w:t>gitignore</w:t>
+      </w:r>
+      <w:proofErr w:type="spellEnd"/>
+      <w:proofErr w:type="gramEnd"/>
+      <w:r>
+        <w:t xml:space="preserve"> hygiene.</w:t>
       </w:r>
     </w:p>
     <w:tbl>
@@ -1020,42 +1143,43 @@
             </w:pPr>
             <w:r>
               <w:rPr>
-                <w:b/>
-                <w:color w:val="475569"/>
-                <w:sz w:val="22"/>
+                <w:noProof/>
               </w:rPr>
-              <w:t>[ PASTE / INSERT SCREENSHOT IMAGE HERE ]</w:t>
-            </w:r>
-            <w:r>
-              <w:rPr>
-                <w:b/>
-                <w:color w:val="475569"/>
-                <w:sz w:val="22"/>
-              </w:rPr>
-              <w:br/>
-            </w:r>
-            <w:r>
-              <w:rPr>
-                <w:i/>
-                <w:color w:val="64748B"/>
-                <w:sz w:val="19"/>
-              </w:rPr>
-              <w:t>Reference: Pre-flight Environment Diagnostics Audit (verify_setup.py)</w:t>
-            </w:r>
-            <w:r>
-              <w:rPr>
-                <w:i/>
-                <w:color w:val="64748B"/>
-                <w:sz w:val="19"/>
-              </w:rPr>
-              <w:br/>
-            </w:r>
-            <w:r>
-              <w:rPr>
-                <w:color w:val="94A3B8"/>
-                <w:sz w:val="18"/>
-              </w:rPr>
-              <w:t>Requirement: Terminal screenshot displaying green CSPC header and 6/6 [PASS] checks.</w:t>
+              <w:drawing>
+                <wp:inline distT="0" distB="0" distL="0" distR="0" wp14:anchorId="1EB0B58C" wp14:editId="11126A7D">
+                  <wp:extent cx="5689600" cy="1958340"/>
+                  <wp:effectExtent l="0" t="0" r="6350" b="3810"/>
+                  <wp:docPr id="1139409109" name="Picture 3"/>
+                  <wp:cNvGraphicFramePr>
+                    <a:graphicFrameLocks xmlns:a="http://schemas.openxmlformats.org/drawingml/2006/main" noChangeAspect="1"/>
+                  </wp:cNvGraphicFramePr>
+                  <a:graphic xmlns:a="http://schemas.openxmlformats.org/drawingml/2006/main">
+                    <a:graphicData uri="http://schemas.openxmlformats.org/drawingml/2006/picture">
+                      <pic:pic xmlns:pic="http://schemas.openxmlformats.org/drawingml/2006/picture">
+                        <pic:nvPicPr>
+                          <pic:cNvPr id="1139409109" name="Picture 1139409109"/>
+                          <pic:cNvPicPr/>
+                        </pic:nvPicPr>
+                        <pic:blipFill>
+                          <a:blip r:embed="rId11"/>
+                          <a:stretch>
+                            <a:fillRect/>
+                          </a:stretch>
+                        </pic:blipFill>
+                        <pic:spPr>
+                          <a:xfrm>
+                            <a:off x="0" y="0"/>
+                            <a:ext cx="5689600" cy="1958340"/>
+                          </a:xfrm>
+                          <a:prstGeom prst="rect">
+                            <a:avLst/>
+                          </a:prstGeom>
+                        </pic:spPr>
+                      </pic:pic>
+                    </a:graphicData>
+                  </a:graphic>
+                </wp:inline>
+              </w:drawing>
             </w:r>
           </w:p>
         </w:tc>
@@ -1080,12 +1204,46 @@
         <w:spacing w:before="280" w:after="120"/>
       </w:pPr>
       <w:r>
-        <w:t>Section 3: Git Working Tree Cleanliness &amp; .gitignore Audit</w:t>
+        <w:t xml:space="preserve">Section 3: Git Working Tree Cleanliness </w:t>
+      </w:r>
+      <w:proofErr w:type="gramStart"/>
+      <w:r>
+        <w:t>&amp; .</w:t>
+      </w:r>
+      <w:proofErr w:type="spellStart"/>
+      <w:r>
+        <w:t>gitignore</w:t>
+      </w:r>
+      <w:proofErr w:type="spellEnd"/>
+      <w:proofErr w:type="gramEnd"/>
+      <w:r>
+        <w:t xml:space="preserve"> Audit</w:t>
       </w:r>
     </w:p>
     <w:p>
       <w:r>
-        <w:t>Demonstration of repository hygiene. The screenshot proves that the working tree is clean with zero uncommitted changes, and that .venv/ is completely untracked (verified by running 'git ls-files .venv', returning empty output).</w:t>
+        <w:t xml:space="preserve">Demonstration of repository hygiene. The screenshot proves that the working tree is clean with zero uncommitted changes, and </w:t>
+      </w:r>
+      <w:proofErr w:type="gramStart"/>
+      <w:r>
+        <w:t>that .</w:t>
+      </w:r>
+      <w:proofErr w:type="spellStart"/>
+      <w:r>
+        <w:t>venv</w:t>
+      </w:r>
+      <w:proofErr w:type="spellEnd"/>
+      <w:proofErr w:type="gramEnd"/>
+      <w:r>
+        <w:t>/ is completely untracked (verified by running 'git ls-files .</w:t>
+      </w:r>
+      <w:proofErr w:type="spellStart"/>
+      <w:r>
+        <w:t>venv</w:t>
+      </w:r>
+      <w:proofErr w:type="spellEnd"/>
+      <w:r>
+        <w:t>', returning empty output).</w:t>
       </w:r>
     </w:p>
     <w:tbl>
@@ -1126,42 +1284,43 @@
             </w:pPr>
             <w:r>
               <w:rPr>
-                <w:b/>
-                <w:color w:val="475569"/>
-                <w:sz w:val="22"/>
+                <w:noProof/>
               </w:rPr>
-              <w:t>[ PASTE / INSERT SCREENSHOT IMAGE HERE ]</w:t>
-            </w:r>
-            <w:r>
-              <w:rPr>
-                <w:b/>
-                <w:color w:val="475569"/>
-                <w:sz w:val="22"/>
-              </w:rPr>
-              <w:br/>
-            </w:r>
-            <w:r>
-              <w:rPr>
-                <w:i/>
-                <w:color w:val="64748B"/>
-                <w:sz w:val="19"/>
-              </w:rPr>
-              <w:t>Reference: Git Working Tree Cleanliness &amp; .gitignore Hygiene Proof</w:t>
-            </w:r>
-            <w:r>
-              <w:rPr>
-                <w:i/>
-                <w:color w:val="64748B"/>
-                <w:sz w:val="19"/>
-              </w:rPr>
-              <w:br/>
-            </w:r>
-            <w:r>
-              <w:rPr>
-                <w:color w:val="94A3B8"/>
-                <w:sz w:val="18"/>
-              </w:rPr>
-              <w:t>Requirement: Terminal screenshot of 'git status' reporting working tree clean and empty 'git ls-files .venv'.</w:t>
+              <w:drawing>
+                <wp:inline distT="0" distB="0" distL="0" distR="0" wp14:anchorId="5B540D4C" wp14:editId="0EE53A76">
+                  <wp:extent cx="5689600" cy="406400"/>
+                  <wp:effectExtent l="0" t="0" r="6350" b="0"/>
+                  <wp:docPr id="646645710" name="Picture 4"/>
+                  <wp:cNvGraphicFramePr>
+                    <a:graphicFrameLocks xmlns:a="http://schemas.openxmlformats.org/drawingml/2006/main" noChangeAspect="1"/>
+                  </wp:cNvGraphicFramePr>
+                  <a:graphic xmlns:a="http://schemas.openxmlformats.org/drawingml/2006/main">
+                    <a:graphicData uri="http://schemas.openxmlformats.org/drawingml/2006/picture">
+                      <pic:pic xmlns:pic="http://schemas.openxmlformats.org/drawingml/2006/picture">
+                        <pic:nvPicPr>
+                          <pic:cNvPr id="646645710" name="Picture 646645710"/>
+                          <pic:cNvPicPr/>
+                        </pic:nvPicPr>
+                        <pic:blipFill>
+                          <a:blip r:embed="rId12"/>
+                          <a:stretch>
+                            <a:fillRect/>
+                          </a:stretch>
+                        </pic:blipFill>
+                        <pic:spPr>
+                          <a:xfrm>
+                            <a:off x="0" y="0"/>
+                            <a:ext cx="5689600" cy="406400"/>
+                          </a:xfrm>
+                          <a:prstGeom prst="rect">
+                            <a:avLst/>
+                          </a:prstGeom>
+                        </pic:spPr>
+                      </pic:pic>
+                    </a:graphicData>
+                  </a:graphic>
+                </wp:inline>
+              </w:drawing>
             </w:r>
           </w:p>
         </w:tc>
@@ -1177,12 +1336,36 @@
           <w:b/>
           <w:sz w:val="19"/>
         </w:rPr>
-        <w:t>Figure 3: Git Working Tree Cleanliness &amp; .gitignore Hygiene Proof</w:t>
+        <w:t xml:space="preserve">Figure 3: Git Working Tree Cleanliness </w:t>
+      </w:r>
+      <w:proofErr w:type="gramStart"/>
+      <w:r>
+        <w:rPr>
+          <w:b/>
+          <w:sz w:val="19"/>
+        </w:rPr>
+        <w:t>&amp; .</w:t>
+      </w:r>
+      <w:proofErr w:type="spellStart"/>
+      <w:r>
+        <w:rPr>
+          <w:b/>
+          <w:sz w:val="19"/>
+        </w:rPr>
+        <w:t>gitignore</w:t>
+      </w:r>
+      <w:proofErr w:type="spellEnd"/>
+      <w:proofErr w:type="gramEnd"/>
+      <w:r>
+        <w:rPr>
+          <w:b/>
+          <w:sz w:val="19"/>
+        </w:rPr>
+        <w:t xml:space="preserve"> Hygiene Proof</w:t>
       </w:r>
     </w:p>
     <w:p>
       <w:r>
-        <w:lastRenderedPageBreak/>
         <w:br w:type="page"/>
       </w:r>
     </w:p>
@@ -1243,8 +1426,18 @@
                 <w:color w:val="475569"/>
                 <w:sz w:val="22"/>
               </w:rPr>
-              <w:t>[ PASTE / INSERT SCREENSHOT IMAGE HERE ]</w:t>
+              <w:t xml:space="preserve">[ PASTE / INSERT SCREENSHOT IMAGE </w:t>
             </w:r>
+            <w:proofErr w:type="gramStart"/>
+            <w:r>
+              <w:rPr>
+                <w:b/>
+                <w:color w:val="475569"/>
+                <w:sz w:val="22"/>
+              </w:rPr>
+              <w:t>HERE ]</w:t>
+            </w:r>
+            <w:proofErr w:type="gramEnd"/>
             <w:r>
               <w:rPr>
                 <w:b/>
@@ -1274,7 +1467,23 @@
                 <w:color w:val="94A3B8"/>
                 <w:sz w:val="18"/>
               </w:rPr>
-              <w:t>Requirement: Window showing CSPC header, green ISOLATED (.venv) badge, 3 team member cards, 0 tasks completed, and In Progress status.</w:t>
+              <w:t>Requirement: Window showing CSPC header, green ISOLATED (.</w:t>
+            </w:r>
+            <w:proofErr w:type="spellStart"/>
+            <w:r>
+              <w:rPr>
+                <w:color w:val="94A3B8"/>
+                <w:sz w:val="18"/>
+              </w:rPr>
+              <w:t>venv</w:t>
+            </w:r>
+            <w:proofErr w:type="spellEnd"/>
+            <w:r>
+              <w:rPr>
+                <w:color w:val="94A3B8"/>
+                <w:sz w:val="18"/>
+              </w:rPr>
+              <w:t>) badge, 3 team member cards, 0 tasks completed, and In Progress status.</w:t>
             </w:r>
           </w:p>
         </w:tc>
@@ -1335,8 +1544,18 @@
                 <w:color w:val="475569"/>
                 <w:sz w:val="22"/>
               </w:rPr>
-              <w:t>[ PASTE / INSERT SCREENSHOT IMAGE HERE ]</w:t>
+              <w:t xml:space="preserve">[ PASTE / INSERT SCREENSHOT IMAGE </w:t>
             </w:r>
+            <w:proofErr w:type="gramStart"/>
+            <w:r>
+              <w:rPr>
+                <w:b/>
+                <w:color w:val="475569"/>
+                <w:sz w:val="22"/>
+              </w:rPr>
+              <w:t>HERE ]</w:t>
+            </w:r>
+            <w:proofErr w:type="gramEnd"/>
             <w:r>
               <w:rPr>
                 <w:b/>
@@ -1427,8 +1646,18 @@
                 <w:color w:val="475569"/>
                 <w:sz w:val="22"/>
               </w:rPr>
-              <w:t>[ PASTE / INSERT SCREENSHOT IMAGE HERE ]</w:t>
+              <w:t xml:space="preserve">[ PASTE / INSERT SCREENSHOT IMAGE </w:t>
             </w:r>
+            <w:proofErr w:type="gramStart"/>
+            <w:r>
+              <w:rPr>
+                <w:b/>
+                <w:color w:val="475569"/>
+                <w:sz w:val="22"/>
+              </w:rPr>
+              <w:t>HERE ]</w:t>
+            </w:r>
+            <w:proofErr w:type="gramEnd"/>
             <w:r>
               <w:rPr>
                 <w:b/>
@@ -1677,7 +1906,15 @@
                 <w:b/>
                 <w:sz w:val="17"/>
               </w:rPr>
-              <w:t>Borja, Edmar B.</w:t>
+              <w:t xml:space="preserve">Borja, Edmar </w:t>
+            </w:r>
+            <w:proofErr w:type="gramStart"/>
+            <w:r>
+              <w:rPr>
+                <w:b/>
+                <w:sz w:val="17"/>
+              </w:rPr>
+              <w:t>B.</w:t>
             </w:r>
             <w:r>
               <w:rPr>
@@ -1686,6 +1923,7 @@
               </w:rPr>
               <w:t xml:space="preserve"> ]</w:t>
             </w:r>
+            <w:proofErr w:type="gramEnd"/>
           </w:p>
         </w:tc>
         <w:tc>
@@ -1783,7 +2021,29 @@
               <w:rPr>
                 <w:sz w:val="17"/>
               </w:rPr>
-              <w:t>Initialized repo, setup .gitignore, integrated card 1, configured remote repo &amp; pushed main.</w:t>
+              <w:t xml:space="preserve">Initialized repo, </w:t>
+            </w:r>
+            <w:proofErr w:type="gramStart"/>
+            <w:r>
+              <w:rPr>
+                <w:sz w:val="17"/>
+              </w:rPr>
+              <w:t>setup .</w:t>
+            </w:r>
+            <w:proofErr w:type="spellStart"/>
+            <w:r>
+              <w:rPr>
+                <w:sz w:val="17"/>
+              </w:rPr>
+              <w:t>gitignore</w:t>
+            </w:r>
+            <w:proofErr w:type="spellEnd"/>
+            <w:proofErr w:type="gramEnd"/>
+            <w:r>
+              <w:rPr>
+                <w:sz w:val="17"/>
+              </w:rPr>
+              <w:t>, integrated card 1, configured remote repo &amp; pushed main.</w:t>
             </w:r>
           </w:p>
         </w:tc>
@@ -1819,7 +2079,23 @@
                 <w:b/>
                 <w:sz w:val="17"/>
               </w:rPr>
-              <w:t>Barandon, Noelee Anthony S.</w:t>
+              <w:t xml:space="preserve">Barandon, </w:t>
+            </w:r>
+            <w:proofErr w:type="spellStart"/>
+            <w:r>
+              <w:rPr>
+                <w:b/>
+                <w:sz w:val="17"/>
+              </w:rPr>
+              <w:t>Noelee</w:t>
+            </w:r>
+            <w:proofErr w:type="spellEnd"/>
+            <w:r>
+              <w:rPr>
+                <w:b/>
+                <w:sz w:val="17"/>
+              </w:rPr>
+              <w:t xml:space="preserve"> Anthony S.</w:t>
             </w:r>
             <w:r>
               <w:rPr>
@@ -1961,7 +2237,15 @@
                 <w:b/>
                 <w:sz w:val="17"/>
               </w:rPr>
-              <w:t>Musa, Eduardo Gabriel S.</w:t>
+              <w:t xml:space="preserve">Musa, Eduardo Gabriel </w:t>
+            </w:r>
+            <w:proofErr w:type="gramStart"/>
+            <w:r>
+              <w:rPr>
+                <w:b/>
+                <w:sz w:val="17"/>
+              </w:rPr>
+              <w:t>S.</w:t>
             </w:r>
             <w:r>
               <w:rPr>
@@ -1970,6 +2254,7 @@
               </w:rPr>
               <w:t xml:space="preserve"> ]</w:t>
             </w:r>
+            <w:proofErr w:type="gramEnd"/>
           </w:p>
         </w:tc>
         <w:tc>
@@ -2017,12 +2302,14 @@
             <w:pPr>
               <w:spacing w:after="0"/>
             </w:pPr>
+            <w:proofErr w:type="spellStart"/>
             <w:r>
               <w:rPr>
                 <w:sz w:val="17"/>
               </w:rPr>
               <w:t>mymitz</w:t>
             </w:r>
+            <w:proofErr w:type="spellEnd"/>
           </w:p>
         </w:tc>
         <w:tc>
@@ -2105,8 +2392,46 @@
           <w:color w:val="64748B"/>
           <w:sz w:val="19"/>
         </w:rPr>
-        <w:t>[ Write 3-4 sentences describing what you learned regarding virtual environment isolation, .gitignore configuration rules, and coordinating remote repository invitations on GitHub... ]</w:t>
+        <w:t>[ Write 3-4 sentences describing what you learned regarding virtual environment isolation</w:t>
       </w:r>
+      <w:proofErr w:type="gramStart"/>
+      <w:r>
+        <w:rPr>
+          <w:i/>
+          <w:color w:val="64748B"/>
+          <w:sz w:val="19"/>
+        </w:rPr>
+        <w:t>, .</w:t>
+      </w:r>
+      <w:proofErr w:type="spellStart"/>
+      <w:r>
+        <w:rPr>
+          <w:i/>
+          <w:color w:val="64748B"/>
+          <w:sz w:val="19"/>
+        </w:rPr>
+        <w:t>gitignore</w:t>
+      </w:r>
+      <w:proofErr w:type="spellEnd"/>
+      <w:proofErr w:type="gramEnd"/>
+      <w:r>
+        <w:rPr>
+          <w:i/>
+          <w:color w:val="64748B"/>
+          <w:sz w:val="19"/>
+        </w:rPr>
+        <w:t xml:space="preserve"> configuration rules, and coordinating remote repository invitations on GitHub</w:t>
+      </w:r>
+      <w:proofErr w:type="gramStart"/>
+      <w:r>
+        <w:rPr>
+          <w:i/>
+          <w:color w:val="64748B"/>
+          <w:sz w:val="19"/>
+        </w:rPr>
+        <w:t>... ]</w:t>
+      </w:r>
+      <w:proofErr w:type="gramEnd"/>
     </w:p>
     <w:p>
       <w:pPr>
@@ -2131,8 +2456,18 @@
           <w:color w:val="64748B"/>
           <w:sz w:val="19"/>
         </w:rPr>
-        <w:t>[ Write 3-4 sentences describing what you learned about cloning remote repositories, syncing upstream changes with 'git pull origin main', and implementing reactive event handlers... ]</w:t>
+        <w:t>[ Write 3-4 sentences describing what you learned about cloning remote repositories, syncing upstream changes with 'git pull origin main', and implementing reactive event handlers</w:t>
       </w:r>
+      <w:proofErr w:type="gramStart"/>
+      <w:r>
+        <w:rPr>
+          <w:i/>
+          <w:color w:val="64748B"/>
+          <w:sz w:val="19"/>
+        </w:rPr>
+        <w:t>... ]</w:t>
+      </w:r>
+      <w:proofErr w:type="gramEnd"/>
     </w:p>
     <w:p>
       <w:pPr>
@@ -2157,8 +2492,18 @@
           <w:color w:val="64748B"/>
           <w:sz w:val="19"/>
         </w:rPr>
-        <w:t>[ Write 3-4 sentences describing what you learned about feature branching safety, enforcing state boundary constraints, and testing Material 3 controls in Flet... ]</w:t>
+        <w:t>[ Write 3-4 sentences describing what you learned about feature branching safety, enforcing state boundary constraints, and testing Material 3 controls in Flet</w:t>
       </w:r>
+      <w:proofErr w:type="gramStart"/>
+      <w:r>
+        <w:rPr>
+          <w:i/>
+          <w:color w:val="64748B"/>
+          <w:sz w:val="19"/>
+        </w:rPr>
+        <w:t>... ]</w:t>
+      </w:r>
+      <w:proofErr w:type="gramEnd"/>
     </w:p>
     <w:p>
       <w:r>
@@ -2177,7 +2522,15 @@
     </w:p>
     <w:p>
       <w:r>
-        <w:t>Verbatim ASCII commit history exported using 'git log --oneline --graph --all &gt; git_log_proof.txt'. This demonstrates the complete sequential feature branching and merge timeline across all three developers.</w:t>
+        <w:t>Verbatim ASCII commit history exported using 'git log --</w:t>
+      </w:r>
+      <w:proofErr w:type="spellStart"/>
+      <w:r>
+        <w:t>oneline</w:t>
+      </w:r>
+      <w:proofErr w:type="spellEnd"/>
+      <w:r>
+        <w:t xml:space="preserve"> --graph --all &gt; git_log_proof.txt'. This demonstrates the complete sequential feature branching and merge timeline across all three developers.</w:t>
       </w:r>
     </w:p>
     <w:tbl>
@@ -2323,7 +2676,43 @@
                 <w:sz w:val="17"/>
               </w:rPr>
               <w:br/>
-              <w:t>* 3a2e901 chore(init): baseline repository with modern flet app and verification tool</w:t>
+              <w:t>* 3a2e901 chore(</w:t>
+            </w:r>
+            <w:proofErr w:type="spellStart"/>
+            <w:r>
+              <w:rPr>
+                <w:rFonts w:ascii="Courier New" w:hAnsi="Courier New"/>
+                <w:color w:val="E2E8F0"/>
+                <w:sz w:val="17"/>
+              </w:rPr>
+              <w:t>init</w:t>
+            </w:r>
+            <w:proofErr w:type="spellEnd"/>
+            <w:r>
+              <w:rPr>
+                <w:rFonts w:ascii="Courier New" w:hAnsi="Courier New"/>
+                <w:color w:val="E2E8F0"/>
+                <w:sz w:val="17"/>
+              </w:rPr>
+              <w:t xml:space="preserve">): baseline repository with modern </w:t>
+            </w:r>
+            <w:proofErr w:type="spellStart"/>
+            <w:r>
+              <w:rPr>
+                <w:rFonts w:ascii="Courier New" w:hAnsi="Courier New"/>
+                <w:color w:val="E2E8F0"/>
+                <w:sz w:val="17"/>
+              </w:rPr>
+              <w:t>flet</w:t>
+            </w:r>
+            <w:proofErr w:type="spellEnd"/>
+            <w:r>
+              <w:rPr>
+                <w:rFonts w:ascii="Courier New" w:hAnsi="Courier New"/>
+                <w:color w:val="E2E8F0"/>
+                <w:sz w:val="17"/>
+              </w:rPr>
+              <w:t xml:space="preserve"> app and verification tool</w:t>
             </w:r>
             <w:r>
               <w:rPr>
@@ -2348,8 +2737,8 @@
     </w:tbl>
     <w:p/>
     <w:sectPr>
-      <w:headerReference w:type="default" r:id="rId9"/>
-      <w:footerReference w:type="default" r:id="rId10"/>
+      <w:headerReference w:type="default" r:id="rId13"/>
+      <w:footerReference w:type="default" r:id="rId14"/>
       <w:pgSz w:w="12240" w:h="15840"/>
       <w:pgMar w:top="1440" w:right="1440" w:bottom="1440" w:left="1440" w:header="720" w:footer="720" w:gutter="0"/>
       <w:cols w:space="720"/>

</xml_diff>

<commit_message>
docs(pdf): Initial update on Appendix
</commit_message>
<xml_diff>
--- a/CCCS106_Lab01_Report_Barandon_Borja_Musa.docx
+++ b/CCCS106_Lab01_Report_Barandon_Borja_Musa.docx
@@ -155,7 +155,6 @@
               </w:rPr>
               <w:t xml:space="preserve">Group No. [ </w:t>
             </w:r>
-            <w:proofErr w:type="gramStart"/>
             <w:r>
               <w:rPr>
                 <w:color w:val="0F172A"/>
@@ -168,15 +167,7 @@
                 <w:color w:val="0F172A"/>
                 <w:sz w:val="19"/>
               </w:rPr>
-              <w:t xml:space="preserve"> ]</w:t>
-            </w:r>
-            <w:proofErr w:type="gramEnd"/>
-            <w:r>
-              <w:rPr>
-                <w:color w:val="0F172A"/>
-                <w:sz w:val="19"/>
-              </w:rPr>
-              <w:t xml:space="preserve">  (</w:t>
+              <w:t xml:space="preserve"> ]  (</w:t>
             </w:r>
             <w:r>
               <w:rPr>
@@ -243,17 +234,8 @@
                 <w:color w:val="0F172A"/>
                 <w:sz w:val="19"/>
               </w:rPr>
-              <w:t xml:space="preserve">[ Month DD, </w:t>
+              <w:t>[ Month DD, 2026 ]</w:t>
             </w:r>
-            <w:proofErr w:type="gramStart"/>
-            <w:r>
-              <w:rPr>
-                <w:color w:val="0F172A"/>
-                <w:sz w:val="19"/>
-              </w:rPr>
-              <w:t>2026 ]</w:t>
-            </w:r>
-            <w:proofErr w:type="gramEnd"/>
           </w:p>
         </w:tc>
       </w:tr>
@@ -482,15 +464,7 @@
                 <w:b/>
                 <w:sz w:val="18"/>
               </w:rPr>
-              <w:t xml:space="preserve">Borja, Edmar </w:t>
-            </w:r>
-            <w:proofErr w:type="gramStart"/>
-            <w:r>
-              <w:rPr>
-                <w:b/>
-                <w:sz w:val="18"/>
-              </w:rPr>
-              <w:t>B.</w:t>
+              <w:t>Borja, Edmar B.</w:t>
             </w:r>
             <w:r>
               <w:rPr>
@@ -499,7 +473,6 @@
               </w:rPr>
               <w:t xml:space="preserve"> ]</w:t>
             </w:r>
-            <w:proofErr w:type="gramEnd"/>
           </w:p>
         </w:tc>
         <w:tc>
@@ -781,15 +754,7 @@
                 <w:b/>
                 <w:sz w:val="18"/>
               </w:rPr>
-              <w:t xml:space="preserve">Musa, Eduardo Gabriel </w:t>
-            </w:r>
-            <w:proofErr w:type="gramStart"/>
-            <w:r>
-              <w:rPr>
-                <w:b/>
-                <w:sz w:val="18"/>
-              </w:rPr>
-              <w:t>S.</w:t>
+              <w:t>Musa, Eduardo Gabriel S.</w:t>
             </w:r>
             <w:r>
               <w:rPr>
@@ -798,7 +763,6 @@
               </w:rPr>
               <w:t xml:space="preserve"> ]</w:t>
             </w:r>
-            <w:proofErr w:type="gramEnd"/>
           </w:p>
         </w:tc>
         <w:tc>
@@ -1089,18 +1053,13 @@
       </w:r>
       <w:proofErr w:type="spellEnd"/>
       <w:r>
-        <w:t xml:space="preserve"> isolation, Flet SDK v0.86.5+, Git binary detection, configured institutional user identity, </w:t>
-      </w:r>
-      <w:proofErr w:type="gramStart"/>
-      <w:r>
-        <w:t>and .</w:t>
+        <w:t xml:space="preserve"> isolation, Flet SDK v0.86.5+, Git binary detection, configured institutional user identity, and .</w:t>
       </w:r>
       <w:proofErr w:type="spellStart"/>
       <w:r>
         <w:t>gitignore</w:t>
       </w:r>
       <w:proofErr w:type="spellEnd"/>
-      <w:proofErr w:type="gramEnd"/>
       <w:r>
         <w:t xml:space="preserve"> hygiene.</w:t>
       </w:r>
@@ -1204,36 +1163,26 @@
         <w:spacing w:before="280" w:after="120"/>
       </w:pPr>
       <w:r>
-        <w:t xml:space="preserve">Section 3: Git Working Tree Cleanliness </w:t>
-      </w:r>
-      <w:proofErr w:type="gramStart"/>
-      <w:r>
-        <w:t>&amp; .</w:t>
+        <w:t>Section 3: Git Working Tree Cleanliness &amp; .</w:t>
       </w:r>
       <w:proofErr w:type="spellStart"/>
       <w:r>
         <w:t>gitignore</w:t>
       </w:r>
       <w:proofErr w:type="spellEnd"/>
-      <w:proofErr w:type="gramEnd"/>
       <w:r>
         <w:t xml:space="preserve"> Audit</w:t>
       </w:r>
     </w:p>
     <w:p>
       <w:r>
-        <w:t xml:space="preserve">Demonstration of repository hygiene. The screenshot proves that the working tree is clean with zero uncommitted changes, and </w:t>
-      </w:r>
-      <w:proofErr w:type="gramStart"/>
-      <w:r>
-        <w:t>that .</w:t>
+        <w:t>Demonstration of repository hygiene. The screenshot proves that the working tree is clean with zero uncommitted changes, and that .</w:t>
       </w:r>
       <w:proofErr w:type="spellStart"/>
       <w:r>
         <w:t>venv</w:t>
       </w:r>
       <w:proofErr w:type="spellEnd"/>
-      <w:proofErr w:type="gramEnd"/>
       <w:r>
         <w:t>/ is completely untracked (verified by running 'git ls-files .</w:t>
       </w:r>
@@ -1336,15 +1285,7 @@
           <w:b/>
           <w:sz w:val="19"/>
         </w:rPr>
-        <w:t xml:space="preserve">Figure 3: Git Working Tree Cleanliness </w:t>
-      </w:r>
-      <w:proofErr w:type="gramStart"/>
-      <w:r>
-        <w:rPr>
-          <w:b/>
-          <w:sz w:val="19"/>
-        </w:rPr>
-        <w:t>&amp; .</w:t>
+        <w:t>Figure 3: Git Working Tree Cleanliness &amp; .</w:t>
       </w:r>
       <w:proofErr w:type="spellStart"/>
       <w:r>
@@ -1355,7 +1296,6 @@
         <w:t>gitignore</w:t>
       </w:r>
       <w:proofErr w:type="spellEnd"/>
-      <w:proofErr w:type="gramEnd"/>
       <w:r>
         <w:rPr>
           <w:b/>
@@ -1426,18 +1366,8 @@
                 <w:color w:val="475569"/>
                 <w:sz w:val="22"/>
               </w:rPr>
-              <w:t xml:space="preserve">[ PASTE / INSERT SCREENSHOT IMAGE </w:t>
+              <w:t>[ PASTE / INSERT SCREENSHOT IMAGE HERE ]</w:t>
             </w:r>
-            <w:proofErr w:type="gramStart"/>
-            <w:r>
-              <w:rPr>
-                <w:b/>
-                <w:color w:val="475569"/>
-                <w:sz w:val="22"/>
-              </w:rPr>
-              <w:t>HERE ]</w:t>
-            </w:r>
-            <w:proofErr w:type="gramEnd"/>
             <w:r>
               <w:rPr>
                 <w:b/>
@@ -1544,18 +1474,8 @@
                 <w:color w:val="475569"/>
                 <w:sz w:val="22"/>
               </w:rPr>
-              <w:t xml:space="preserve">[ PASTE / INSERT SCREENSHOT IMAGE </w:t>
+              <w:t>[ PASTE / INSERT SCREENSHOT IMAGE HERE ]</w:t>
             </w:r>
-            <w:proofErr w:type="gramStart"/>
-            <w:r>
-              <w:rPr>
-                <w:b/>
-                <w:color w:val="475569"/>
-                <w:sz w:val="22"/>
-              </w:rPr>
-              <w:t>HERE ]</w:t>
-            </w:r>
-            <w:proofErr w:type="gramEnd"/>
             <w:r>
               <w:rPr>
                 <w:b/>
@@ -1646,18 +1566,8 @@
                 <w:color w:val="475569"/>
                 <w:sz w:val="22"/>
               </w:rPr>
-              <w:t xml:space="preserve">[ PASTE / INSERT SCREENSHOT IMAGE </w:t>
+              <w:t>[ PASTE / INSERT SCREENSHOT IMAGE HERE ]</w:t>
             </w:r>
-            <w:proofErr w:type="gramStart"/>
-            <w:r>
-              <w:rPr>
-                <w:b/>
-                <w:color w:val="475569"/>
-                <w:sz w:val="22"/>
-              </w:rPr>
-              <w:t>HERE ]</w:t>
-            </w:r>
-            <w:proofErr w:type="gramEnd"/>
             <w:r>
               <w:rPr>
                 <w:b/>
@@ -1906,15 +1816,7 @@
                 <w:b/>
                 <w:sz w:val="17"/>
               </w:rPr>
-              <w:t xml:space="preserve">Borja, Edmar </w:t>
-            </w:r>
-            <w:proofErr w:type="gramStart"/>
-            <w:r>
-              <w:rPr>
-                <w:b/>
-                <w:sz w:val="17"/>
-              </w:rPr>
-              <w:t>B.</w:t>
+              <w:t>Borja, Edmar B.</w:t>
             </w:r>
             <w:r>
               <w:rPr>
@@ -1923,7 +1825,6 @@
               </w:rPr>
               <w:t xml:space="preserve"> ]</w:t>
             </w:r>
-            <w:proofErr w:type="gramEnd"/>
           </w:p>
         </w:tc>
         <w:tc>
@@ -2021,14 +1922,7 @@
               <w:rPr>
                 <w:sz w:val="17"/>
               </w:rPr>
-              <w:t xml:space="preserve">Initialized repo, </w:t>
-            </w:r>
-            <w:proofErr w:type="gramStart"/>
-            <w:r>
-              <w:rPr>
-                <w:sz w:val="17"/>
-              </w:rPr>
-              <w:t>setup .</w:t>
+              <w:t>Initialized repo, setup .</w:t>
             </w:r>
             <w:proofErr w:type="spellStart"/>
             <w:r>
@@ -2038,7 +1932,6 @@
               <w:t>gitignore</w:t>
             </w:r>
             <w:proofErr w:type="spellEnd"/>
-            <w:proofErr w:type="gramEnd"/>
             <w:r>
               <w:rPr>
                 <w:sz w:val="17"/>
@@ -2237,15 +2130,7 @@
                 <w:b/>
                 <w:sz w:val="17"/>
               </w:rPr>
-              <w:t xml:space="preserve">Musa, Eduardo Gabriel </w:t>
-            </w:r>
-            <w:proofErr w:type="gramStart"/>
-            <w:r>
-              <w:rPr>
-                <w:b/>
-                <w:sz w:val="17"/>
-              </w:rPr>
-              <w:t>S.</w:t>
+              <w:t>Musa, Eduardo Gabriel S.</w:t>
             </w:r>
             <w:r>
               <w:rPr>
@@ -2254,7 +2139,6 @@
               </w:rPr>
               <w:t xml:space="preserve"> ]</w:t>
             </w:r>
-            <w:proofErr w:type="gramEnd"/>
           </w:p>
         </w:tc>
         <w:tc>
@@ -2392,16 +2276,7 @@
           <w:color w:val="64748B"/>
           <w:sz w:val="19"/>
         </w:rPr>
-        <w:t>[ Write 3-4 sentences describing what you learned regarding virtual environment isolation</w:t>
-      </w:r>
-      <w:proofErr w:type="gramStart"/>
-      <w:r>
-        <w:rPr>
-          <w:i/>
-          <w:color w:val="64748B"/>
-          <w:sz w:val="19"/>
-        </w:rPr>
-        <w:t>, .</w:t>
+        <w:t>[ Write 3-4 sentences describing what you learned regarding virtual environment isolation, .</w:t>
       </w:r>
       <w:proofErr w:type="spellStart"/>
       <w:r>
@@ -2413,25 +2288,14 @@
         <w:t>gitignore</w:t>
       </w:r>
       <w:proofErr w:type="spellEnd"/>
-      <w:proofErr w:type="gramEnd"/>
       <w:r>
         <w:rPr>
           <w:i/>
           <w:color w:val="64748B"/>
           <w:sz w:val="19"/>
         </w:rPr>
-        <w:t xml:space="preserve"> configuration rules, and coordinating remote repository invitations on GitHub</w:t>
+        <w:t xml:space="preserve"> configuration rules, and coordinating remote repository invitations on GitHub... ]</w:t>
       </w:r>
-      <w:proofErr w:type="gramStart"/>
-      <w:r>
-        <w:rPr>
-          <w:i/>
-          <w:color w:val="64748B"/>
-          <w:sz w:val="19"/>
-        </w:rPr>
-        <w:t>... ]</w:t>
-      </w:r>
-      <w:proofErr w:type="gramEnd"/>
     </w:p>
     <w:p>
       <w:pPr>
@@ -2456,18 +2320,8 @@
           <w:color w:val="64748B"/>
           <w:sz w:val="19"/>
         </w:rPr>
-        <w:t>[ Write 3-4 sentences describing what you learned about cloning remote repositories, syncing upstream changes with 'git pull origin main', and implementing reactive event handlers</w:t>
+        <w:t>[ Write 3-4 sentences describing what you learned about cloning remote repositories, syncing upstream changes with 'git pull origin main', and implementing reactive event handlers... ]</w:t>
       </w:r>
-      <w:proofErr w:type="gramStart"/>
-      <w:r>
-        <w:rPr>
-          <w:i/>
-          <w:color w:val="64748B"/>
-          <w:sz w:val="19"/>
-        </w:rPr>
-        <w:t>... ]</w:t>
-      </w:r>
-      <w:proofErr w:type="gramEnd"/>
     </w:p>
     <w:p>
       <w:pPr>
@@ -2492,18 +2346,8 @@
           <w:color w:val="64748B"/>
           <w:sz w:val="19"/>
         </w:rPr>
-        <w:t>[ Write 3-4 sentences describing what you learned about feature branching safety, enforcing state boundary constraints, and testing Material 3 controls in Flet</w:t>
+        <w:t>[ Write 3-4 sentences describing what you learned about feature branching safety, enforcing state boundary constraints, and testing Material 3 controls in Flet... ]</w:t>
       </w:r>
-      <w:proofErr w:type="gramStart"/>
-      <w:r>
-        <w:rPr>
-          <w:i/>
-          <w:color w:val="64748B"/>
-          <w:sz w:val="19"/>
-        </w:rPr>
-        <w:t>... ]</w:t>
-      </w:r>
-      <w:proofErr w:type="gramEnd"/>
     </w:p>
     <w:p>
       <w:r>
@@ -2561,6 +2405,11 @@
           <w:p>
             <w:pPr>
               <w:spacing w:after="0"/>
+              <w:rPr>
+                <w:rFonts w:ascii="Courier New" w:hAnsi="Courier New"/>
+                <w:color w:val="E2E8F0"/>
+                <w:sz w:val="17"/>
+              </w:rPr>
             </w:pPr>
             <w:r>
               <w:rPr>
@@ -2568,115 +2417,79 @@
                 <w:color w:val="E2E8F0"/>
                 <w:sz w:val="17"/>
               </w:rPr>
-              <w:t>*   9f8a123 (HEAD -&gt; main, origin/main) feat(milestone): integrate developer 3 profile and sprint goal milestone badge</w:t>
+              <w:t>* 5f1dcee docs(pdf): Update screenshots on Section 1-3</w:t>
             </w:r>
+          </w:p>
+          <w:p>
+            <w:pPr>
+              <w:spacing w:after="0"/>
+              <w:rPr>
+                <w:rFonts w:ascii="Courier New" w:hAnsi="Courier New"/>
+                <w:color w:val="E2E8F0"/>
+                <w:sz w:val="17"/>
+              </w:rPr>
+            </w:pPr>
             <w:r>
               <w:rPr>
                 <w:rFonts w:ascii="Courier New" w:hAnsi="Courier New"/>
                 <w:color w:val="E2E8F0"/>
                 <w:sz w:val="17"/>
               </w:rPr>
-              <w:br/>
-              <w:t xml:space="preserve">|\  </w:t>
+              <w:t>| * 75e0006 docs(pdf): Update screenshots on Section 1-3</w:t>
             </w:r>
+          </w:p>
+          <w:p>
+            <w:pPr>
+              <w:spacing w:after="0"/>
+              <w:rPr>
+                <w:rFonts w:ascii="Courier New" w:hAnsi="Courier New"/>
+                <w:color w:val="E2E8F0"/>
+                <w:sz w:val="17"/>
+              </w:rPr>
+            </w:pPr>
             <w:r>
               <w:rPr>
                 <w:rFonts w:ascii="Courier New" w:hAnsi="Courier New"/>
                 <w:color w:val="E2E8F0"/>
                 <w:sz w:val="17"/>
               </w:rPr>
-              <w:br/>
-              <w:t>| * 8e7b456 (feature/dev3-features) feat(milestone): integrate developer 3 profile and sprint goal milestone badge</w:t>
+              <w:t xml:space="preserve">|/  </w:t>
             </w:r>
+          </w:p>
+          <w:p>
+            <w:pPr>
+              <w:spacing w:after="0"/>
+              <w:rPr>
+                <w:rFonts w:ascii="Courier New" w:hAnsi="Courier New"/>
+                <w:color w:val="E2E8F0"/>
+                <w:sz w:val="17"/>
+              </w:rPr>
+            </w:pPr>
             <w:r>
               <w:rPr>
                 <w:rFonts w:ascii="Courier New" w:hAnsi="Courier New"/>
                 <w:color w:val="E2E8F0"/>
                 <w:sz w:val="17"/>
               </w:rPr>
-              <w:br/>
-              <w:t xml:space="preserve">|/  </w:t>
+              <w:t>* ee577a8 docs(pdf): Update on initial documents</w:t>
             </w:r>
+          </w:p>
+          <w:p>
+            <w:pPr>
+              <w:spacing w:after="0"/>
+              <w:rPr>
+                <w:rFonts w:ascii="Courier New" w:hAnsi="Courier New"/>
+                <w:color w:val="E2E8F0"/>
+                <w:sz w:val="17"/>
+              </w:rPr>
+            </w:pPr>
             <w:r>
               <w:rPr>
                 <w:rFonts w:ascii="Courier New" w:hAnsi="Courier New"/>
                 <w:color w:val="E2E8F0"/>
                 <w:sz w:val="17"/>
               </w:rPr>
-              <w:br/>
-              <w:t>*   7d6c789 feat(state): integrate developer 2 profile and task counter handlers</w:t>
-            </w:r>
-            <w:r>
-              <w:rPr>
-                <w:rFonts w:ascii="Courier New" w:hAnsi="Courier New"/>
-                <w:color w:val="E2E8F0"/>
-                <w:sz w:val="17"/>
-              </w:rPr>
-              <w:br/>
-              <w:t xml:space="preserve">|\  </w:t>
-            </w:r>
-            <w:r>
-              <w:rPr>
-                <w:rFonts w:ascii="Courier New" w:hAnsi="Courier New"/>
-                <w:color w:val="E2E8F0"/>
-                <w:sz w:val="17"/>
-              </w:rPr>
-              <w:br/>
-              <w:t>| * 6c5d012 (feature/dev2-state) feat(state): integrate developer 2 profile and task counter handlers</w:t>
-            </w:r>
-            <w:r>
-              <w:rPr>
-                <w:rFonts w:ascii="Courier New" w:hAnsi="Courier New"/>
-                <w:color w:val="E2E8F0"/>
-                <w:sz w:val="17"/>
-              </w:rPr>
-              <w:br/>
-              <w:t xml:space="preserve">|/  </w:t>
-            </w:r>
-            <w:r>
-              <w:rPr>
-                <w:rFonts w:ascii="Courier New" w:hAnsi="Courier New"/>
-                <w:color w:val="E2E8F0"/>
-                <w:sz w:val="17"/>
-              </w:rPr>
-              <w:br/>
-              <w:t>*   5b4e345 feat(profile): integrate developer 1 profile card</w:t>
-            </w:r>
-            <w:r>
-              <w:rPr>
-                <w:rFonts w:ascii="Courier New" w:hAnsi="Courier New"/>
-                <w:color w:val="E2E8F0"/>
-                <w:sz w:val="17"/>
-              </w:rPr>
-              <w:br/>
-              <w:t xml:space="preserve">|\  </w:t>
-            </w:r>
-            <w:r>
-              <w:rPr>
-                <w:rFonts w:ascii="Courier New" w:hAnsi="Courier New"/>
-                <w:color w:val="E2E8F0"/>
-                <w:sz w:val="17"/>
-              </w:rPr>
-              <w:br/>
-              <w:t>| * 4a3f678 (feature/dev1-profile) feat(profile): integrate developer 1 profile card</w:t>
-            </w:r>
-            <w:r>
-              <w:rPr>
-                <w:rFonts w:ascii="Courier New" w:hAnsi="Courier New"/>
-                <w:color w:val="E2E8F0"/>
-                <w:sz w:val="17"/>
-              </w:rPr>
-              <w:br/>
-              <w:t xml:space="preserve">|/  </w:t>
-            </w:r>
-            <w:r>
-              <w:rPr>
-                <w:rFonts w:ascii="Courier New" w:hAnsi="Courier New"/>
-                <w:color w:val="E2E8F0"/>
-                <w:sz w:val="17"/>
-              </w:rPr>
-              <w:br/>
-              <w:t>* 3a2e901 chore(</w:t>
+              <w:t xml:space="preserve">* 8a11075 </w:t>
             </w:r>
             <w:proofErr w:type="spellStart"/>
             <w:r>
@@ -2685,7 +2498,53 @@
                 <w:color w:val="E2E8F0"/>
                 <w:sz w:val="17"/>
               </w:rPr>
-              <w:t>init</w:t>
+              <w:t>pfp</w:t>
+            </w:r>
+            <w:proofErr w:type="spellEnd"/>
+          </w:p>
+          <w:p>
+            <w:pPr>
+              <w:spacing w:after="0"/>
+              <w:rPr>
+                <w:rFonts w:ascii="Courier New" w:hAnsi="Courier New"/>
+                <w:color w:val="E2E8F0"/>
+                <w:sz w:val="17"/>
+              </w:rPr>
+            </w:pPr>
+            <w:r>
+              <w:rPr>
+                <w:rFonts w:ascii="Courier New" w:hAnsi="Courier New"/>
+                <w:color w:val="E2E8F0"/>
+                <w:sz w:val="17"/>
+              </w:rPr>
+              <w:t>* ed90fe8 update the profile on collaborative team roster</w:t>
+            </w:r>
+          </w:p>
+          <w:p>
+            <w:pPr>
+              <w:spacing w:after="0"/>
+              <w:rPr>
+                <w:rFonts w:ascii="Courier New" w:hAnsi="Courier New"/>
+                <w:color w:val="E2E8F0"/>
+                <w:sz w:val="17"/>
+              </w:rPr>
+            </w:pPr>
+            <w:r>
+              <w:rPr>
+                <w:rFonts w:ascii="Courier New" w:hAnsi="Courier New"/>
+                <w:color w:val="E2E8F0"/>
+                <w:sz w:val="17"/>
+              </w:rPr>
+              <w:t>* 65b1dc5 Create Ni-</w:t>
+            </w:r>
+            <w:proofErr w:type="spellStart"/>
+            <w:r>
+              <w:rPr>
+                <w:rFonts w:ascii="Courier New" w:hAnsi="Courier New"/>
+                <w:color w:val="E2E8F0"/>
+                <w:sz w:val="17"/>
+              </w:rPr>
+              <w:t>Git.code</w:t>
             </w:r>
             <w:proofErr w:type="spellEnd"/>
             <w:r>
@@ -2694,42 +2553,56 @@
                 <w:color w:val="E2E8F0"/>
                 <w:sz w:val="17"/>
               </w:rPr>
-              <w:t xml:space="preserve">): baseline repository with modern </w:t>
+              <w:t>-workspace</w:t>
             </w:r>
-            <w:proofErr w:type="spellStart"/>
+          </w:p>
+          <w:p>
+            <w:pPr>
+              <w:spacing w:after="0"/>
+              <w:rPr>
+                <w:rFonts w:ascii="Courier New" w:hAnsi="Courier New"/>
+                <w:color w:val="E2E8F0"/>
+                <w:sz w:val="17"/>
+              </w:rPr>
+            </w:pPr>
             <w:r>
               <w:rPr>
                 <w:rFonts w:ascii="Courier New" w:hAnsi="Courier New"/>
                 <w:color w:val="E2E8F0"/>
                 <w:sz w:val="17"/>
               </w:rPr>
-              <w:t>flet</w:t>
+              <w:t>* c0cf354 Small change and update of my profile, no major changes yet</w:t>
             </w:r>
-            <w:proofErr w:type="spellEnd"/>
+          </w:p>
+          <w:p>
+            <w:pPr>
+              <w:spacing w:after="0"/>
+              <w:rPr>
+                <w:rFonts w:ascii="Courier New" w:hAnsi="Courier New"/>
+                <w:color w:val="E2E8F0"/>
+                <w:sz w:val="17"/>
+              </w:rPr>
+            </w:pPr>
             <w:r>
               <w:rPr>
                 <w:rFonts w:ascii="Courier New" w:hAnsi="Courier New"/>
                 <w:color w:val="E2E8F0"/>
                 <w:sz w:val="17"/>
               </w:rPr>
-              <w:t xml:space="preserve"> app and verification tool</w:t>
+              <w:t>* fe4b95f Initial Update and Change</w:t>
             </w:r>
+          </w:p>
+          <w:p>
+            <w:pPr>
+              <w:spacing w:after="0"/>
+            </w:pPr>
             <w:r>
               <w:rPr>
                 <w:rFonts w:ascii="Courier New" w:hAnsi="Courier New"/>
                 <w:color w:val="E2E8F0"/>
                 <w:sz w:val="17"/>
               </w:rPr>
-              <w:br/>
-            </w:r>
-            <w:r>
-              <w:rPr>
-                <w:rFonts w:ascii="Courier New" w:hAnsi="Courier New"/>
-                <w:color w:val="E2E8F0"/>
-                <w:sz w:val="17"/>
-              </w:rPr>
-              <w:br/>
-              <w:t>[ REPLACE THE SAMPLE COMMIT LOG ABOVE WITH YOUR GROUP'S ACTUAL git_log_proof.txt OUTPUT ]</w:t>
+              <w:t>* f08c58a Initial commit</w:t>
             </w:r>
           </w:p>
         </w:tc>

</xml_diff>

<commit_message>
docs(pdf): Initial update on contributions in section 5
</commit_message>
<xml_diff>
--- a/CCCS106_Lab01_Report_Barandon_Borja_Musa.docx
+++ b/CCCS106_Lab01_Report_Barandon_Borja_Musa.docx
@@ -595,23 +595,7 @@
                 <w:b/>
                 <w:sz w:val="18"/>
               </w:rPr>
-              <w:t xml:space="preserve">Barandon, </w:t>
-            </w:r>
-            <w:proofErr w:type="spellStart"/>
-            <w:r>
-              <w:rPr>
-                <w:b/>
-                <w:sz w:val="18"/>
-              </w:rPr>
-              <w:t>Noelee</w:t>
-            </w:r>
-            <w:proofErr w:type="spellEnd"/>
-            <w:r>
-              <w:rPr>
-                <w:b/>
-                <w:sz w:val="18"/>
-              </w:rPr>
-              <w:t xml:space="preserve"> Anthony S.</w:t>
+              <w:t>Barandon, Noelee Anthony S.</w:t>
             </w:r>
             <w:r>
               <w:rPr>
@@ -1037,31 +1021,7 @@
     </w:p>
     <w:p>
       <w:r>
-        <w:t>Pre-flight workstation audit executed via 'python verify_setup.py' inside the active virtual environment (.</w:t>
-      </w:r>
-      <w:proofErr w:type="spellStart"/>
-      <w:r>
-        <w:t>venv</w:t>
-      </w:r>
-      <w:proofErr w:type="spellEnd"/>
-      <w:r>
-        <w:t xml:space="preserve">). All six (6) audit checks must report [PASS] verifying Python 3.10+, </w:t>
-      </w:r>
-      <w:proofErr w:type="spellStart"/>
-      <w:r>
-        <w:t>virtualenv</w:t>
-      </w:r>
-      <w:proofErr w:type="spellEnd"/>
-      <w:r>
-        <w:t xml:space="preserve"> isolation, Flet SDK v0.86.5+, Git binary detection, configured institutional user identity, and .</w:t>
-      </w:r>
-      <w:proofErr w:type="spellStart"/>
-      <w:r>
-        <w:t>gitignore</w:t>
-      </w:r>
-      <w:proofErr w:type="spellEnd"/>
-      <w:r>
-        <w:t xml:space="preserve"> hygiene.</w:t>
+        <w:t>Pre-flight workstation audit executed via 'python verify_setup.py' inside the active virtual environment (.venv). All six (6) audit checks must report [PASS] verifying Python 3.10+, virtualenv isolation, Flet SDK v0.86.5+, Git binary detection, configured institutional user identity, and .gitignore hygiene.</w:t>
       </w:r>
     </w:p>
     <w:tbl>
@@ -1163,36 +1123,12 @@
         <w:spacing w:before="280" w:after="120"/>
       </w:pPr>
       <w:r>
-        <w:t>Section 3: Git Working Tree Cleanliness &amp; .</w:t>
-      </w:r>
-      <w:proofErr w:type="spellStart"/>
-      <w:r>
-        <w:t>gitignore</w:t>
-      </w:r>
-      <w:proofErr w:type="spellEnd"/>
-      <w:r>
-        <w:t xml:space="preserve"> Audit</w:t>
+        <w:t>Section 3: Git Working Tree Cleanliness &amp; .gitignore Audit</w:t>
       </w:r>
     </w:p>
     <w:p>
       <w:r>
-        <w:t>Demonstration of repository hygiene. The screenshot proves that the working tree is clean with zero uncommitted changes, and that .</w:t>
-      </w:r>
-      <w:proofErr w:type="spellStart"/>
-      <w:r>
-        <w:t>venv</w:t>
-      </w:r>
-      <w:proofErr w:type="spellEnd"/>
-      <w:r>
-        <w:t>/ is completely untracked (verified by running 'git ls-files .</w:t>
-      </w:r>
-      <w:proofErr w:type="spellStart"/>
-      <w:r>
-        <w:t>venv</w:t>
-      </w:r>
-      <w:proofErr w:type="spellEnd"/>
-      <w:r>
-        <w:t>', returning empty output).</w:t>
+        <w:t>Demonstration of repository hygiene. The screenshot proves that the working tree is clean with zero uncommitted changes, and that .venv/ is completely untracked (verified by running 'git ls-files .venv', returning empty output).</w:t>
       </w:r>
     </w:p>
     <w:tbl>
@@ -1285,23 +1221,7 @@
           <w:b/>
           <w:sz w:val="19"/>
         </w:rPr>
-        <w:t>Figure 3: Git Working Tree Cleanliness &amp; .</w:t>
-      </w:r>
-      <w:proofErr w:type="spellStart"/>
-      <w:r>
-        <w:rPr>
-          <w:b/>
-          <w:sz w:val="19"/>
-        </w:rPr>
-        <w:t>gitignore</w:t>
-      </w:r>
-      <w:proofErr w:type="spellEnd"/>
-      <w:r>
-        <w:rPr>
-          <w:b/>
-          <w:sz w:val="19"/>
-        </w:rPr>
-        <w:t xml:space="preserve"> Hygiene Proof</w:t>
+        <w:t>Figure 3: Git Working Tree Cleanliness &amp; .gitignore Hygiene Proof</w:t>
       </w:r>
     </w:p>
     <w:p>
@@ -1397,23 +1317,7 @@
                 <w:color w:val="94A3B8"/>
                 <w:sz w:val="18"/>
               </w:rPr>
-              <w:t>Requirement: Window showing CSPC header, green ISOLATED (.</w:t>
-            </w:r>
-            <w:proofErr w:type="spellStart"/>
-            <w:r>
-              <w:rPr>
-                <w:color w:val="94A3B8"/>
-                <w:sz w:val="18"/>
-              </w:rPr>
-              <w:t>venv</w:t>
-            </w:r>
-            <w:proofErr w:type="spellEnd"/>
-            <w:r>
-              <w:rPr>
-                <w:color w:val="94A3B8"/>
-                <w:sz w:val="18"/>
-              </w:rPr>
-              <w:t>) badge, 3 team member cards, 0 tasks completed, and In Progress status.</w:t>
+              <w:t>Requirement: Window showing CSPC header, green ISOLATED (.venv) badge, 3 team member cards, 0 tasks completed, and In Progress status.</w:t>
             </w:r>
           </w:p>
         </w:tc>
@@ -1894,12 +1798,81 @@
           <w:p>
             <w:pPr>
               <w:spacing w:after="0"/>
+              <w:rPr>
+                <w:sz w:val="17"/>
+              </w:rPr>
             </w:pPr>
             <w:r>
               <w:rPr>
                 <w:sz w:val="17"/>
               </w:rPr>
-              <w:t>[abc1234]</w:t>
+              <w:t>[</w:t>
+            </w:r>
+            <w:r>
+              <w:rPr>
+                <w:sz w:val="17"/>
+              </w:rPr>
+              <w:t>f08c58a</w:t>
+            </w:r>
+            <w:r>
+              <w:rPr>
+                <w:sz w:val="17"/>
+              </w:rPr>
+              <w:t>,</w:t>
+            </w:r>
+          </w:p>
+          <w:p>
+            <w:pPr>
+              <w:spacing w:after="0"/>
+              <w:rPr>
+                <w:sz w:val="17"/>
+              </w:rPr>
+            </w:pPr>
+            <w:r>
+              <w:rPr>
+                <w:sz w:val="17"/>
+              </w:rPr>
+              <w:t>fe4b95f</w:t>
+            </w:r>
+            <w:r>
+              <w:rPr>
+                <w:sz w:val="17"/>
+              </w:rPr>
+              <w:t>,</w:t>
+            </w:r>
+          </w:p>
+          <w:p>
+            <w:pPr>
+              <w:spacing w:after="0"/>
+              <w:rPr>
+                <w:sz w:val="17"/>
+              </w:rPr>
+            </w:pPr>
+            <w:r>
+              <w:rPr>
+                <w:sz w:val="17"/>
+              </w:rPr>
+              <w:t>65b1dc5</w:t>
+            </w:r>
+          </w:p>
+          <w:p>
+            <w:pPr>
+              <w:spacing w:after="0"/>
+              <w:rPr>
+                <w:sz w:val="17"/>
+              </w:rPr>
+            </w:pPr>
+            <w:r>
+              <w:rPr>
+                <w:sz w:val="17"/>
+              </w:rPr>
+              <w:t>ed90fe8</w:t>
+            </w:r>
+            <w:r>
+              <w:rPr>
+                <w:sz w:val="17"/>
+              </w:rPr>
+              <w:t>]</w:t>
             </w:r>
           </w:p>
         </w:tc>
@@ -1922,21 +1895,19 @@
               <w:rPr>
                 <w:sz w:val="17"/>
               </w:rPr>
-              <w:t>Initialized repo, setup .</w:t>
+              <w:t>Initialized repo, setup .gitignore, integrated card 1, configured remote repo &amp; pushed main</w:t>
             </w:r>
-            <w:proofErr w:type="spellStart"/>
             <w:r>
               <w:rPr>
                 <w:sz w:val="17"/>
               </w:rPr>
-              <w:t>gitignore</w:t>
+              <w:t>, dev-1 profile update</w:t>
             </w:r>
-            <w:proofErr w:type="spellEnd"/>
             <w:r>
               <w:rPr>
                 <w:sz w:val="17"/>
               </w:rPr>
-              <w:t>, integrated card 1, configured remote repo &amp; pushed main.</w:t>
+              <w:t>.</w:t>
             </w:r>
           </w:p>
         </w:tc>
@@ -1972,23 +1943,7 @@
                 <w:b/>
                 <w:sz w:val="17"/>
               </w:rPr>
-              <w:t xml:space="preserve">Barandon, </w:t>
-            </w:r>
-            <w:proofErr w:type="spellStart"/>
-            <w:r>
-              <w:rPr>
-                <w:b/>
-                <w:sz w:val="17"/>
-              </w:rPr>
-              <w:t>Noelee</w:t>
-            </w:r>
-            <w:proofErr w:type="spellEnd"/>
-            <w:r>
-              <w:rPr>
-                <w:b/>
-                <w:sz w:val="17"/>
-              </w:rPr>
-              <w:t xml:space="preserve"> Anthony S.</w:t>
+              <w:t>Barandon, Noelee Anthony S.</w:t>
             </w:r>
             <w:r>
               <w:rPr>
@@ -2071,7 +2026,19 @@
               <w:rPr>
                 <w:sz w:val="17"/>
               </w:rPr>
-              <w:t>[def5678]</w:t>
+              <w:t>[</w:t>
+            </w:r>
+            <w:r>
+              <w:rPr>
+                <w:sz w:val="17"/>
+              </w:rPr>
+              <w:t>8a11075</w:t>
+            </w:r>
+            <w:r>
+              <w:rPr>
+                <w:sz w:val="17"/>
+              </w:rPr>
+              <w:t>]</w:t>
             </w:r>
           </w:p>
         </w:tc>
@@ -2094,7 +2061,19 @@
               <w:rPr>
                 <w:sz w:val="17"/>
               </w:rPr>
-              <w:t>Synced main, integrated card 2, connected increment/reset event handlers, merged &amp; pushed.</w:t>
+              <w:t>Synced main, integrated card 2, connected increment/reset event handlers, merged &amp; pushed</w:t>
+            </w:r>
+            <w:r>
+              <w:rPr>
+                <w:sz w:val="17"/>
+              </w:rPr>
+              <w:t>, dev-2 profile update</w:t>
+            </w:r>
+            <w:r>
+              <w:rPr>
+                <w:sz w:val="17"/>
+              </w:rPr>
+              <w:t>.</w:t>
             </w:r>
           </w:p>
         </w:tc>
@@ -2186,14 +2165,12 @@
             <w:pPr>
               <w:spacing w:after="0"/>
             </w:pPr>
-            <w:proofErr w:type="spellStart"/>
             <w:r>
               <w:rPr>
                 <w:sz w:val="17"/>
               </w:rPr>
               <w:t>mymitz</w:t>
             </w:r>
-            <w:proofErr w:type="spellEnd"/>
           </w:p>
         </w:tc>
         <w:tc>
@@ -2210,12 +2187,64 @@
           <w:p>
             <w:pPr>
               <w:spacing w:after="0"/>
+              <w:rPr>
+                <w:sz w:val="17"/>
+              </w:rPr>
             </w:pPr>
             <w:r>
               <w:rPr>
                 <w:sz w:val="17"/>
               </w:rPr>
-              <w:t>[ghi9012]</w:t>
+              <w:t>[</w:t>
+            </w:r>
+            <w:r>
+              <w:rPr>
+                <w:sz w:val="17"/>
+              </w:rPr>
+              <w:t>c0cf354</w:t>
+            </w:r>
+            <w:r>
+              <w:rPr>
+                <w:sz w:val="17"/>
+              </w:rPr>
+              <w:t>,</w:t>
+            </w:r>
+          </w:p>
+          <w:p>
+            <w:pPr>
+              <w:spacing w:after="0"/>
+              <w:rPr>
+                <w:sz w:val="17"/>
+              </w:rPr>
+            </w:pPr>
+            <w:r>
+              <w:rPr>
+                <w:sz w:val="17"/>
+              </w:rPr>
+              <w:t>ee577a8</w:t>
+            </w:r>
+            <w:r>
+              <w:rPr>
+                <w:sz w:val="17"/>
+              </w:rPr>
+              <w:t>,</w:t>
+            </w:r>
+          </w:p>
+          <w:p>
+            <w:pPr>
+              <w:spacing w:after="0"/>
+            </w:pPr>
+            <w:r>
+              <w:rPr>
+                <w:sz w:val="17"/>
+              </w:rPr>
+              <w:t>5f1dcee</w:t>
+            </w:r>
+            <w:r>
+              <w:rPr>
+                <w:sz w:val="17"/>
+              </w:rPr>
+              <w:t>]</w:t>
             </w:r>
           </w:p>
         </w:tc>
@@ -2238,7 +2267,31 @@
               <w:rPr>
                 <w:sz w:val="17"/>
               </w:rPr>
-              <w:t>Synced main, integrated card 3, built milestone badge logic &amp; boundary constraints, merged &amp; pushed.</w:t>
+              <w:t xml:space="preserve">Synced main, </w:t>
+            </w:r>
+            <w:r>
+              <w:rPr>
+                <w:sz w:val="17"/>
+              </w:rPr>
+              <w:t xml:space="preserve">dev-3 </w:t>
+            </w:r>
+            <w:r>
+              <w:rPr>
+                <w:sz w:val="17"/>
+              </w:rPr>
+              <w:t xml:space="preserve">profile update, </w:t>
+            </w:r>
+            <w:r>
+              <w:rPr>
+                <w:sz w:val="17"/>
+              </w:rPr>
+              <w:t>initial document updates</w:t>
+            </w:r>
+            <w:r>
+              <w:rPr>
+                <w:sz w:val="17"/>
+              </w:rPr>
+              <w:t>.</w:t>
             </w:r>
           </w:p>
         </w:tc>
@@ -2276,25 +2329,7 @@
           <w:color w:val="64748B"/>
           <w:sz w:val="19"/>
         </w:rPr>
-        <w:t>[ Write 3-4 sentences describing what you learned regarding virtual environment isolation, .</w:t>
-      </w:r>
-      <w:proofErr w:type="spellStart"/>
-      <w:r>
-        <w:rPr>
-          <w:i/>
-          <w:color w:val="64748B"/>
-          <w:sz w:val="19"/>
-        </w:rPr>
-        <w:t>gitignore</w:t>
-      </w:r>
-      <w:proofErr w:type="spellEnd"/>
-      <w:r>
-        <w:rPr>
-          <w:i/>
-          <w:color w:val="64748B"/>
-          <w:sz w:val="19"/>
-        </w:rPr>
-        <w:t xml:space="preserve"> configuration rules, and coordinating remote repository invitations on GitHub... ]</w:t>
+        <w:t>[ Write 3-4 sentences describing what you learned regarding virtual environment isolation, .gitignore configuration rules, and coordinating remote repository invitations on GitHub... ]</w:t>
       </w:r>
     </w:p>
     <w:p>
@@ -2366,15 +2401,7 @@
     </w:p>
     <w:p>
       <w:r>
-        <w:t>Verbatim ASCII commit history exported using 'git log --</w:t>
-      </w:r>
-      <w:proofErr w:type="spellStart"/>
-      <w:r>
-        <w:t>oneline</w:t>
-      </w:r>
-      <w:proofErr w:type="spellEnd"/>
-      <w:r>
-        <w:t xml:space="preserve"> --graph --all &gt; git_log_proof.txt'. This demonstrates the complete sequential feature branching and merge timeline across all three developers.</w:t>
+        <w:t>Verbatim ASCII commit history exported using 'git log --oneline --graph --all &gt; git_log_proof.txt'. This demonstrates the complete sequential feature branching and merge timeline across all three developers.</w:t>
       </w:r>
     </w:p>
     <w:tbl>
@@ -2489,18 +2516,8 @@
                 <w:color w:val="E2E8F0"/>
                 <w:sz w:val="17"/>
               </w:rPr>
-              <w:t xml:space="preserve">* 8a11075 </w:t>
+              <w:t>* 8a11075 pfp</w:t>
             </w:r>
-            <w:proofErr w:type="spellStart"/>
-            <w:r>
-              <w:rPr>
-                <w:rFonts w:ascii="Courier New" w:hAnsi="Courier New"/>
-                <w:color w:val="E2E8F0"/>
-                <w:sz w:val="17"/>
-              </w:rPr>
-              <w:t>pfp</w:t>
-            </w:r>
-            <w:proofErr w:type="spellEnd"/>
           </w:p>
           <w:p>
             <w:pPr>
@@ -2535,25 +2552,7 @@
                 <w:color w:val="E2E8F0"/>
                 <w:sz w:val="17"/>
               </w:rPr>
-              <w:t>* 65b1dc5 Create Ni-</w:t>
-            </w:r>
-            <w:proofErr w:type="spellStart"/>
-            <w:r>
-              <w:rPr>
-                <w:rFonts w:ascii="Courier New" w:hAnsi="Courier New"/>
-                <w:color w:val="E2E8F0"/>
-                <w:sz w:val="17"/>
-              </w:rPr>
-              <w:t>Git.code</w:t>
-            </w:r>
-            <w:proofErr w:type="spellEnd"/>
-            <w:r>
-              <w:rPr>
-                <w:rFonts w:ascii="Courier New" w:hAnsi="Courier New"/>
-                <w:color w:val="E2E8F0"/>
-                <w:sz w:val="17"/>
-              </w:rPr>
-              <w:t>-workspace</w:t>
+              <w:t>* 65b1dc5 Create Ni-Git.code-workspace</w:t>
             </w:r>
           </w:p>
           <w:p>

</xml_diff>

<commit_message>
docs(pdf): Update on contribution in section 5
</commit_message>
<xml_diff>
--- a/CCCS106_Lab01_Report_Barandon_Borja_Musa.docx
+++ b/CCCS106_Lab01_Report_Barandon_Borja_Musa.docx
@@ -155,7 +155,6 @@
               </w:rPr>
               <w:t xml:space="preserve">Group No. [ </w:t>
             </w:r>
-            <w:proofErr w:type="gramStart"/>
             <w:r>
               <w:rPr>
                 <w:color w:val="0F172A"/>
@@ -168,15 +167,7 @@
                 <w:color w:val="0F172A"/>
                 <w:sz w:val="19"/>
               </w:rPr>
-              <w:t xml:space="preserve"> ]</w:t>
-            </w:r>
-            <w:proofErr w:type="gramEnd"/>
-            <w:r>
-              <w:rPr>
-                <w:color w:val="0F172A"/>
-                <w:sz w:val="19"/>
-              </w:rPr>
-              <w:t xml:space="preserve">  (</w:t>
+              <w:t xml:space="preserve"> ]  (</w:t>
             </w:r>
             <w:r>
               <w:rPr>
@@ -243,17 +234,8 @@
                 <w:color w:val="0F172A"/>
                 <w:sz w:val="19"/>
               </w:rPr>
-              <w:t xml:space="preserve">[ Month DD, </w:t>
+              <w:t>[ Month DD, 2026 ]</w:t>
             </w:r>
-            <w:proofErr w:type="gramStart"/>
-            <w:r>
-              <w:rPr>
-                <w:color w:val="0F172A"/>
-                <w:sz w:val="19"/>
-              </w:rPr>
-              <w:t>2026 ]</w:t>
-            </w:r>
-            <w:proofErr w:type="gramEnd"/>
           </w:p>
         </w:tc>
       </w:tr>
@@ -482,15 +464,7 @@
                 <w:b/>
                 <w:sz w:val="18"/>
               </w:rPr>
-              <w:t xml:space="preserve">Borja, Edmar </w:t>
-            </w:r>
-            <w:proofErr w:type="gramStart"/>
-            <w:r>
-              <w:rPr>
-                <w:b/>
-                <w:sz w:val="18"/>
-              </w:rPr>
-              <w:t>B.</w:t>
+              <w:t>Borja, Edmar B.</w:t>
             </w:r>
             <w:r>
               <w:rPr>
@@ -499,7 +473,6 @@
               </w:rPr>
               <w:t xml:space="preserve"> ]</w:t>
             </w:r>
-            <w:proofErr w:type="gramEnd"/>
           </w:p>
         </w:tc>
         <w:tc>
@@ -622,23 +595,7 @@
                 <w:b/>
                 <w:sz w:val="18"/>
               </w:rPr>
-              <w:t xml:space="preserve">Barandon, </w:t>
-            </w:r>
-            <w:proofErr w:type="spellStart"/>
-            <w:r>
-              <w:rPr>
-                <w:b/>
-                <w:sz w:val="18"/>
-              </w:rPr>
-              <w:t>Noelee</w:t>
-            </w:r>
-            <w:proofErr w:type="spellEnd"/>
-            <w:r>
-              <w:rPr>
-                <w:b/>
-                <w:sz w:val="18"/>
-              </w:rPr>
-              <w:t xml:space="preserve"> Anthony S.</w:t>
+              <w:t>Barandon, Noelee Anthony S.</w:t>
             </w:r>
             <w:r>
               <w:rPr>
@@ -781,15 +738,7 @@
                 <w:b/>
                 <w:sz w:val="18"/>
               </w:rPr>
-              <w:t xml:space="preserve">Musa, Eduardo Gabriel </w:t>
-            </w:r>
-            <w:proofErr w:type="gramStart"/>
-            <w:r>
-              <w:rPr>
-                <w:b/>
-                <w:sz w:val="18"/>
-              </w:rPr>
-              <w:t>S.</w:t>
+              <w:t>Musa, Eduardo Gabriel S.</w:t>
             </w:r>
             <w:r>
               <w:rPr>
@@ -798,7 +747,6 @@
               </w:rPr>
               <w:t xml:space="preserve"> ]</w:t>
             </w:r>
-            <w:proofErr w:type="gramEnd"/>
           </w:p>
         </w:tc>
         <w:tc>
@@ -1073,36 +1021,7 @@
     </w:p>
     <w:p>
       <w:r>
-        <w:t>Pre-flight workstation audit executed via 'python verify_setup.py' inside the active virtual environment (.</w:t>
-      </w:r>
-      <w:proofErr w:type="spellStart"/>
-      <w:r>
-        <w:t>venv</w:t>
-      </w:r>
-      <w:proofErr w:type="spellEnd"/>
-      <w:r>
-        <w:t xml:space="preserve">). All six (6) audit checks must report [PASS] verifying Python 3.10+, </w:t>
-      </w:r>
-      <w:proofErr w:type="spellStart"/>
-      <w:r>
-        <w:t>virtualenv</w:t>
-      </w:r>
-      <w:proofErr w:type="spellEnd"/>
-      <w:r>
-        <w:t xml:space="preserve"> isolation, Flet SDK v0.86.5+, Git binary detection, configured institutional user identity, </w:t>
-      </w:r>
-      <w:proofErr w:type="gramStart"/>
-      <w:r>
-        <w:t>and .</w:t>
-      </w:r>
-      <w:proofErr w:type="spellStart"/>
-      <w:r>
-        <w:t>gitignore</w:t>
-      </w:r>
-      <w:proofErr w:type="spellEnd"/>
-      <w:proofErr w:type="gramEnd"/>
-      <w:r>
-        <w:t xml:space="preserve"> hygiene.</w:t>
+        <w:t>Pre-flight workstation audit executed via 'python verify_setup.py' inside the active virtual environment (.venv). All six (6) audit checks must report [PASS] verifying Python 3.10+, virtualenv isolation, Flet SDK v0.86.5+, Git binary detection, configured institutional user identity, and .gitignore hygiene.</w:t>
       </w:r>
     </w:p>
     <w:tbl>
@@ -1204,46 +1123,12 @@
         <w:spacing w:before="280" w:after="120"/>
       </w:pPr>
       <w:r>
-        <w:t xml:space="preserve">Section 3: Git Working Tree Cleanliness </w:t>
-      </w:r>
-      <w:proofErr w:type="gramStart"/>
-      <w:r>
-        <w:t>&amp; .</w:t>
-      </w:r>
-      <w:proofErr w:type="spellStart"/>
-      <w:r>
-        <w:t>gitignore</w:t>
-      </w:r>
-      <w:proofErr w:type="spellEnd"/>
-      <w:proofErr w:type="gramEnd"/>
-      <w:r>
-        <w:t xml:space="preserve"> Audit</w:t>
+        <w:t>Section 3: Git Working Tree Cleanliness &amp; .gitignore Audit</w:t>
       </w:r>
     </w:p>
     <w:p>
       <w:r>
-        <w:t xml:space="preserve">Demonstration of repository hygiene. The screenshot proves that the working tree is clean with zero uncommitted changes, and </w:t>
-      </w:r>
-      <w:proofErr w:type="gramStart"/>
-      <w:r>
-        <w:t>that .</w:t>
-      </w:r>
-      <w:proofErr w:type="spellStart"/>
-      <w:r>
-        <w:t>venv</w:t>
-      </w:r>
-      <w:proofErr w:type="spellEnd"/>
-      <w:proofErr w:type="gramEnd"/>
-      <w:r>
-        <w:t>/ is completely untracked (verified by running 'git ls-files .</w:t>
-      </w:r>
-      <w:proofErr w:type="spellStart"/>
-      <w:r>
-        <w:t>venv</w:t>
-      </w:r>
-      <w:proofErr w:type="spellEnd"/>
-      <w:r>
-        <w:t>', returning empty output).</w:t>
+        <w:t>Demonstration of repository hygiene. The screenshot proves that the working tree is clean with zero uncommitted changes, and that .venv/ is completely untracked (verified by running 'git ls-files .venv', returning empty output).</w:t>
       </w:r>
     </w:p>
     <w:tbl>
@@ -1336,32 +1221,7 @@
           <w:b/>
           <w:sz w:val="19"/>
         </w:rPr>
-        <w:t xml:space="preserve">Figure 3: Git Working Tree Cleanliness </w:t>
-      </w:r>
-      <w:proofErr w:type="gramStart"/>
-      <w:r>
-        <w:rPr>
-          <w:b/>
-          <w:sz w:val="19"/>
-        </w:rPr>
-        <w:t>&amp; .</w:t>
-      </w:r>
-      <w:proofErr w:type="spellStart"/>
-      <w:r>
-        <w:rPr>
-          <w:b/>
-          <w:sz w:val="19"/>
-        </w:rPr>
-        <w:t>gitignore</w:t>
-      </w:r>
-      <w:proofErr w:type="spellEnd"/>
-      <w:proofErr w:type="gramEnd"/>
-      <w:r>
-        <w:rPr>
-          <w:b/>
-          <w:sz w:val="19"/>
-        </w:rPr>
-        <w:t xml:space="preserve"> Hygiene Proof</w:t>
+        <w:t>Figure 3: Git Working Tree Cleanliness &amp; .gitignore Hygiene Proof</w:t>
       </w:r>
     </w:p>
     <w:p>
@@ -1426,18 +1286,8 @@
                 <w:color w:val="475569"/>
                 <w:sz w:val="22"/>
               </w:rPr>
-              <w:t xml:space="preserve">[ PASTE / INSERT SCREENSHOT IMAGE </w:t>
+              <w:t>[ PASTE / INSERT SCREENSHOT IMAGE HERE ]</w:t>
             </w:r>
-            <w:proofErr w:type="gramStart"/>
-            <w:r>
-              <w:rPr>
-                <w:b/>
-                <w:color w:val="475569"/>
-                <w:sz w:val="22"/>
-              </w:rPr>
-              <w:t>HERE ]</w:t>
-            </w:r>
-            <w:proofErr w:type="gramEnd"/>
             <w:r>
               <w:rPr>
                 <w:b/>
@@ -1467,23 +1317,7 @@
                 <w:color w:val="94A3B8"/>
                 <w:sz w:val="18"/>
               </w:rPr>
-              <w:t>Requirement: Window showing CSPC header, green ISOLATED (.</w:t>
-            </w:r>
-            <w:proofErr w:type="spellStart"/>
-            <w:r>
-              <w:rPr>
-                <w:color w:val="94A3B8"/>
-                <w:sz w:val="18"/>
-              </w:rPr>
-              <w:t>venv</w:t>
-            </w:r>
-            <w:proofErr w:type="spellEnd"/>
-            <w:r>
-              <w:rPr>
-                <w:color w:val="94A3B8"/>
-                <w:sz w:val="18"/>
-              </w:rPr>
-              <w:t>) badge, 3 team member cards, 0 tasks completed, and In Progress status.</w:t>
+              <w:t>Requirement: Window showing CSPC header, green ISOLATED (.venv) badge, 3 team member cards, 0 tasks completed, and In Progress status.</w:t>
             </w:r>
           </w:p>
         </w:tc>
@@ -1544,18 +1378,8 @@
                 <w:color w:val="475569"/>
                 <w:sz w:val="22"/>
               </w:rPr>
-              <w:t xml:space="preserve">[ PASTE / INSERT SCREENSHOT IMAGE </w:t>
+              <w:t>[ PASTE / INSERT SCREENSHOT IMAGE HERE ]</w:t>
             </w:r>
-            <w:proofErr w:type="gramStart"/>
-            <w:r>
-              <w:rPr>
-                <w:b/>
-                <w:color w:val="475569"/>
-                <w:sz w:val="22"/>
-              </w:rPr>
-              <w:t>HERE ]</w:t>
-            </w:r>
-            <w:proofErr w:type="gramEnd"/>
             <w:r>
               <w:rPr>
                 <w:b/>
@@ -1646,18 +1470,8 @@
                 <w:color w:val="475569"/>
                 <w:sz w:val="22"/>
               </w:rPr>
-              <w:t xml:space="preserve">[ PASTE / INSERT SCREENSHOT IMAGE </w:t>
+              <w:t>[ PASTE / INSERT SCREENSHOT IMAGE HERE ]</w:t>
             </w:r>
-            <w:proofErr w:type="gramStart"/>
-            <w:r>
-              <w:rPr>
-                <w:b/>
-                <w:color w:val="475569"/>
-                <w:sz w:val="22"/>
-              </w:rPr>
-              <w:t>HERE ]</w:t>
-            </w:r>
-            <w:proofErr w:type="gramEnd"/>
             <w:r>
               <w:rPr>
                 <w:b/>
@@ -1906,15 +1720,7 @@
                 <w:b/>
                 <w:sz w:val="17"/>
               </w:rPr>
-              <w:t xml:space="preserve">Borja, Edmar </w:t>
-            </w:r>
-            <w:proofErr w:type="gramStart"/>
-            <w:r>
-              <w:rPr>
-                <w:b/>
-                <w:sz w:val="17"/>
-              </w:rPr>
-              <w:t>B.</w:t>
+              <w:t>Borja, Edmar B.</w:t>
             </w:r>
             <w:r>
               <w:rPr>
@@ -1923,7 +1729,6 @@
               </w:rPr>
               <w:t xml:space="preserve"> ]</w:t>
             </w:r>
-            <w:proofErr w:type="gramEnd"/>
           </w:p>
         </w:tc>
         <w:tc>
@@ -1993,12 +1798,81 @@
           <w:p>
             <w:pPr>
               <w:spacing w:after="0"/>
+              <w:rPr>
+                <w:sz w:val="17"/>
+              </w:rPr>
             </w:pPr>
             <w:r>
               <w:rPr>
                 <w:sz w:val="17"/>
               </w:rPr>
-              <w:t>[abc1234]</w:t>
+              <w:t>[</w:t>
+            </w:r>
+            <w:r>
+              <w:rPr>
+                <w:sz w:val="17"/>
+              </w:rPr>
+              <w:t>f08c58a</w:t>
+            </w:r>
+            <w:r>
+              <w:rPr>
+                <w:sz w:val="17"/>
+              </w:rPr>
+              <w:t>,</w:t>
+            </w:r>
+          </w:p>
+          <w:p>
+            <w:pPr>
+              <w:spacing w:after="0"/>
+              <w:rPr>
+                <w:sz w:val="17"/>
+              </w:rPr>
+            </w:pPr>
+            <w:r>
+              <w:rPr>
+                <w:sz w:val="17"/>
+              </w:rPr>
+              <w:t>fe4b95f</w:t>
+            </w:r>
+            <w:r>
+              <w:rPr>
+                <w:sz w:val="17"/>
+              </w:rPr>
+              <w:t>,</w:t>
+            </w:r>
+          </w:p>
+          <w:p>
+            <w:pPr>
+              <w:spacing w:after="0"/>
+              <w:rPr>
+                <w:sz w:val="17"/>
+              </w:rPr>
+            </w:pPr>
+            <w:r>
+              <w:rPr>
+                <w:sz w:val="17"/>
+              </w:rPr>
+              <w:t>65b1dc5</w:t>
+            </w:r>
+          </w:p>
+          <w:p>
+            <w:pPr>
+              <w:spacing w:after="0"/>
+              <w:rPr>
+                <w:sz w:val="17"/>
+              </w:rPr>
+            </w:pPr>
+            <w:r>
+              <w:rPr>
+                <w:sz w:val="17"/>
+              </w:rPr>
+              <w:t>ed90fe8</w:t>
+            </w:r>
+            <w:r>
+              <w:rPr>
+                <w:sz w:val="17"/>
+              </w:rPr>
+              <w:t>]</w:t>
             </w:r>
           </w:p>
         </w:tc>
@@ -2021,29 +1895,19 @@
               <w:rPr>
                 <w:sz w:val="17"/>
               </w:rPr>
-              <w:t xml:space="preserve">Initialized repo, </w:t>
+              <w:t>Initialized repo, setup .gitignore, integrated card 1, configured remote repo &amp; pushed main</w:t>
             </w:r>
-            <w:proofErr w:type="gramStart"/>
             <w:r>
               <w:rPr>
                 <w:sz w:val="17"/>
               </w:rPr>
-              <w:t>setup .</w:t>
+              <w:t>, dev-1 profile update</w:t>
             </w:r>
-            <w:proofErr w:type="spellStart"/>
             <w:r>
               <w:rPr>
                 <w:sz w:val="17"/>
               </w:rPr>
-              <w:t>gitignore</w:t>
-            </w:r>
-            <w:proofErr w:type="spellEnd"/>
-            <w:proofErr w:type="gramEnd"/>
-            <w:r>
-              <w:rPr>
-                <w:sz w:val="17"/>
-              </w:rPr>
-              <w:t>, integrated card 1, configured remote repo &amp; pushed main.</w:t>
+              <w:t>.</w:t>
             </w:r>
           </w:p>
         </w:tc>
@@ -2079,23 +1943,7 @@
                 <w:b/>
                 <w:sz w:val="17"/>
               </w:rPr>
-              <w:t xml:space="preserve">Barandon, </w:t>
-            </w:r>
-            <w:proofErr w:type="spellStart"/>
-            <w:r>
-              <w:rPr>
-                <w:b/>
-                <w:sz w:val="17"/>
-              </w:rPr>
-              <w:t>Noelee</w:t>
-            </w:r>
-            <w:proofErr w:type="spellEnd"/>
-            <w:r>
-              <w:rPr>
-                <w:b/>
-                <w:sz w:val="17"/>
-              </w:rPr>
-              <w:t xml:space="preserve"> Anthony S.</w:t>
+              <w:t>Barandon, Noelee Anthony S.</w:t>
             </w:r>
             <w:r>
               <w:rPr>
@@ -2178,7 +2026,19 @@
               <w:rPr>
                 <w:sz w:val="17"/>
               </w:rPr>
-              <w:t>[def5678]</w:t>
+              <w:t>[</w:t>
+            </w:r>
+            <w:r>
+              <w:rPr>
+                <w:sz w:val="17"/>
+              </w:rPr>
+              <w:t>8a11075</w:t>
+            </w:r>
+            <w:r>
+              <w:rPr>
+                <w:sz w:val="17"/>
+              </w:rPr>
+              <w:t>]</w:t>
             </w:r>
           </w:p>
         </w:tc>
@@ -2201,7 +2061,19 @@
               <w:rPr>
                 <w:sz w:val="17"/>
               </w:rPr>
-              <w:t>Synced main, integrated card 2, connected increment/reset event handlers, merged &amp; pushed.</w:t>
+              <w:t>Synced main, integrated card 2, connected increment/reset event handlers, merged &amp; pushed</w:t>
+            </w:r>
+            <w:r>
+              <w:rPr>
+                <w:sz w:val="17"/>
+              </w:rPr>
+              <w:t>, dev-2 profile update</w:t>
+            </w:r>
+            <w:r>
+              <w:rPr>
+                <w:sz w:val="17"/>
+              </w:rPr>
+              <w:t>.</w:t>
             </w:r>
           </w:p>
         </w:tc>
@@ -2237,15 +2109,7 @@
                 <w:b/>
                 <w:sz w:val="17"/>
               </w:rPr>
-              <w:t xml:space="preserve">Musa, Eduardo Gabriel </w:t>
-            </w:r>
-            <w:proofErr w:type="gramStart"/>
-            <w:r>
-              <w:rPr>
-                <w:b/>
-                <w:sz w:val="17"/>
-              </w:rPr>
-              <w:t>S.</w:t>
+              <w:t>Musa, Eduardo Gabriel S.</w:t>
             </w:r>
             <w:r>
               <w:rPr>
@@ -2254,7 +2118,6 @@
               </w:rPr>
               <w:t xml:space="preserve"> ]</w:t>
             </w:r>
-            <w:proofErr w:type="gramEnd"/>
           </w:p>
         </w:tc>
         <w:tc>
@@ -2302,14 +2165,12 @@
             <w:pPr>
               <w:spacing w:after="0"/>
             </w:pPr>
-            <w:proofErr w:type="spellStart"/>
             <w:r>
               <w:rPr>
                 <w:sz w:val="17"/>
               </w:rPr>
               <w:t>mymitz</w:t>
             </w:r>
-            <w:proofErr w:type="spellEnd"/>
           </w:p>
         </w:tc>
         <w:tc>
@@ -2326,12 +2187,64 @@
           <w:p>
             <w:pPr>
               <w:spacing w:after="0"/>
+              <w:rPr>
+                <w:sz w:val="17"/>
+              </w:rPr>
             </w:pPr>
             <w:r>
               <w:rPr>
                 <w:sz w:val="17"/>
               </w:rPr>
-              <w:t>[ghi9012]</w:t>
+              <w:t>[</w:t>
+            </w:r>
+            <w:r>
+              <w:rPr>
+                <w:sz w:val="17"/>
+              </w:rPr>
+              <w:t>c0cf354</w:t>
+            </w:r>
+            <w:r>
+              <w:rPr>
+                <w:sz w:val="17"/>
+              </w:rPr>
+              <w:t>,</w:t>
+            </w:r>
+          </w:p>
+          <w:p>
+            <w:pPr>
+              <w:spacing w:after="0"/>
+              <w:rPr>
+                <w:sz w:val="17"/>
+              </w:rPr>
+            </w:pPr>
+            <w:r>
+              <w:rPr>
+                <w:sz w:val="17"/>
+              </w:rPr>
+              <w:t>ee577a8</w:t>
+            </w:r>
+            <w:r>
+              <w:rPr>
+                <w:sz w:val="17"/>
+              </w:rPr>
+              <w:t>,</w:t>
+            </w:r>
+          </w:p>
+          <w:p>
+            <w:pPr>
+              <w:spacing w:after="0"/>
+            </w:pPr>
+            <w:r>
+              <w:rPr>
+                <w:sz w:val="17"/>
+              </w:rPr>
+              <w:t>5f1dcee</w:t>
+            </w:r>
+            <w:r>
+              <w:rPr>
+                <w:sz w:val="17"/>
+              </w:rPr>
+              <w:t>]</w:t>
             </w:r>
           </w:p>
         </w:tc>
@@ -2354,7 +2267,31 @@
               <w:rPr>
                 <w:sz w:val="17"/>
               </w:rPr>
-              <w:t>Synced main, integrated card 3, built milestone badge logic &amp; boundary constraints, merged &amp; pushed.</w:t>
+              <w:t xml:space="preserve">Synced main, </w:t>
+            </w:r>
+            <w:r>
+              <w:rPr>
+                <w:sz w:val="17"/>
+              </w:rPr>
+              <w:t xml:space="preserve">dev-3 </w:t>
+            </w:r>
+            <w:r>
+              <w:rPr>
+                <w:sz w:val="17"/>
+              </w:rPr>
+              <w:t xml:space="preserve">profile update, </w:t>
+            </w:r>
+            <w:r>
+              <w:rPr>
+                <w:sz w:val="17"/>
+              </w:rPr>
+              <w:t>initial document updates</w:t>
+            </w:r>
+            <w:r>
+              <w:rPr>
+                <w:sz w:val="17"/>
+              </w:rPr>
+              <w:t>.</w:t>
             </w:r>
           </w:p>
         </w:tc>
@@ -2392,46 +2329,8 @@
           <w:color w:val="64748B"/>
           <w:sz w:val="19"/>
         </w:rPr>
-        <w:t>[ Write 3-4 sentences describing what you learned regarding virtual environment isolation</w:t>
+        <w:t>[ Write 3-4 sentences describing what you learned regarding virtual environment isolation, .gitignore configuration rules, and coordinating remote repository invitations on GitHub... ]</w:t>
       </w:r>
-      <w:proofErr w:type="gramStart"/>
-      <w:r>
-        <w:rPr>
-          <w:i/>
-          <w:color w:val="64748B"/>
-          <w:sz w:val="19"/>
-        </w:rPr>
-        <w:t>, .</w:t>
-      </w:r>
-      <w:proofErr w:type="spellStart"/>
-      <w:r>
-        <w:rPr>
-          <w:i/>
-          <w:color w:val="64748B"/>
-          <w:sz w:val="19"/>
-        </w:rPr>
-        <w:t>gitignore</w:t>
-      </w:r>
-      <w:proofErr w:type="spellEnd"/>
-      <w:proofErr w:type="gramEnd"/>
-      <w:r>
-        <w:rPr>
-          <w:i/>
-          <w:color w:val="64748B"/>
-          <w:sz w:val="19"/>
-        </w:rPr>
-        <w:t xml:space="preserve"> configuration rules, and coordinating remote repository invitations on GitHub</w:t>
-      </w:r>
-      <w:proofErr w:type="gramStart"/>
-      <w:r>
-        <w:rPr>
-          <w:i/>
-          <w:color w:val="64748B"/>
-          <w:sz w:val="19"/>
-        </w:rPr>
-        <w:t>... ]</w:t>
-      </w:r>
-      <w:proofErr w:type="gramEnd"/>
     </w:p>
     <w:p>
       <w:pPr>
@@ -2456,18 +2355,8 @@
           <w:color w:val="64748B"/>
           <w:sz w:val="19"/>
         </w:rPr>
-        <w:t>[ Write 3-4 sentences describing what you learned about cloning remote repositories, syncing upstream changes with 'git pull origin main', and implementing reactive event handlers</w:t>
+        <w:t>[ Write 3-4 sentences describing what you learned about cloning remote repositories, syncing upstream changes with 'git pull origin main', and implementing reactive event handlers... ]</w:t>
       </w:r>
-      <w:proofErr w:type="gramStart"/>
-      <w:r>
-        <w:rPr>
-          <w:i/>
-          <w:color w:val="64748B"/>
-          <w:sz w:val="19"/>
-        </w:rPr>
-        <w:t>... ]</w:t>
-      </w:r>
-      <w:proofErr w:type="gramEnd"/>
     </w:p>
     <w:p>
       <w:pPr>
@@ -2492,18 +2381,8 @@
           <w:color w:val="64748B"/>
           <w:sz w:val="19"/>
         </w:rPr>
-        <w:t>[ Write 3-4 sentences describing what you learned about feature branching safety, enforcing state boundary constraints, and testing Material 3 controls in Flet</w:t>
+        <w:t>[ Write 3-4 sentences describing what you learned about feature branching safety, enforcing state boundary constraints, and testing Material 3 controls in Flet... ]</w:t>
       </w:r>
-      <w:proofErr w:type="gramStart"/>
-      <w:r>
-        <w:rPr>
-          <w:i/>
-          <w:color w:val="64748B"/>
-          <w:sz w:val="19"/>
-        </w:rPr>
-        <w:t>... ]</w:t>
-      </w:r>
-      <w:proofErr w:type="gramEnd"/>
     </w:p>
     <w:p>
       <w:r>
@@ -2522,15 +2401,7 @@
     </w:p>
     <w:p>
       <w:r>
-        <w:t>Verbatim ASCII commit history exported using 'git log --</w:t>
-      </w:r>
-      <w:proofErr w:type="spellStart"/>
-      <w:r>
-        <w:t>oneline</w:t>
-      </w:r>
-      <w:proofErr w:type="spellEnd"/>
-      <w:r>
-        <w:t xml:space="preserve"> --graph --all &gt; git_log_proof.txt'. This demonstrates the complete sequential feature branching and merge timeline across all three developers.</w:t>
+        <w:t>Verbatim ASCII commit history exported using 'git log --oneline --graph --all &gt; git_log_proof.txt'. This demonstrates the complete sequential feature branching and merge timeline across all three developers.</w:t>
       </w:r>
     </w:p>
     <w:tbl>
@@ -2561,6 +2432,11 @@
           <w:p>
             <w:pPr>
               <w:spacing w:after="0"/>
+              <w:rPr>
+                <w:rFonts w:ascii="Courier New" w:hAnsi="Courier New"/>
+                <w:color w:val="E2E8F0"/>
+                <w:sz w:val="17"/>
+              </w:rPr>
             </w:pPr>
             <w:r>
               <w:rPr>
@@ -2568,168 +2444,164 @@
                 <w:color w:val="E2E8F0"/>
                 <w:sz w:val="17"/>
               </w:rPr>
-              <w:t>*   9f8a123 (HEAD -&gt; main, origin/main) feat(milestone): integrate developer 3 profile and sprint goal milestone badge</w:t>
+              <w:t>* 5f1dcee docs(pdf): Update screenshots on Section 1-3</w:t>
             </w:r>
+          </w:p>
+          <w:p>
+            <w:pPr>
+              <w:spacing w:after="0"/>
+              <w:rPr>
+                <w:rFonts w:ascii="Courier New" w:hAnsi="Courier New"/>
+                <w:color w:val="E2E8F0"/>
+                <w:sz w:val="17"/>
+              </w:rPr>
+            </w:pPr>
             <w:r>
               <w:rPr>
                 <w:rFonts w:ascii="Courier New" w:hAnsi="Courier New"/>
                 <w:color w:val="E2E8F0"/>
                 <w:sz w:val="17"/>
               </w:rPr>
-              <w:br/>
-              <w:t xml:space="preserve">|\  </w:t>
+              <w:t>| * 75e0006 docs(pdf): Update screenshots on Section 1-3</w:t>
             </w:r>
+          </w:p>
+          <w:p>
+            <w:pPr>
+              <w:spacing w:after="0"/>
+              <w:rPr>
+                <w:rFonts w:ascii="Courier New" w:hAnsi="Courier New"/>
+                <w:color w:val="E2E8F0"/>
+                <w:sz w:val="17"/>
+              </w:rPr>
+            </w:pPr>
             <w:r>
               <w:rPr>
                 <w:rFonts w:ascii="Courier New" w:hAnsi="Courier New"/>
                 <w:color w:val="E2E8F0"/>
                 <w:sz w:val="17"/>
               </w:rPr>
-              <w:br/>
-              <w:t>| * 8e7b456 (feature/dev3-features) feat(milestone): integrate developer 3 profile and sprint goal milestone badge</w:t>
+              <w:t xml:space="preserve">|/  </w:t>
             </w:r>
+          </w:p>
+          <w:p>
+            <w:pPr>
+              <w:spacing w:after="0"/>
+              <w:rPr>
+                <w:rFonts w:ascii="Courier New" w:hAnsi="Courier New"/>
+                <w:color w:val="E2E8F0"/>
+                <w:sz w:val="17"/>
+              </w:rPr>
+            </w:pPr>
             <w:r>
               <w:rPr>
                 <w:rFonts w:ascii="Courier New" w:hAnsi="Courier New"/>
                 <w:color w:val="E2E8F0"/>
                 <w:sz w:val="17"/>
               </w:rPr>
-              <w:br/>
-              <w:t xml:space="preserve">|/  </w:t>
+              <w:t>* ee577a8 docs(pdf): Update on initial documents</w:t>
             </w:r>
+          </w:p>
+          <w:p>
+            <w:pPr>
+              <w:spacing w:after="0"/>
+              <w:rPr>
+                <w:rFonts w:ascii="Courier New" w:hAnsi="Courier New"/>
+                <w:color w:val="E2E8F0"/>
+                <w:sz w:val="17"/>
+              </w:rPr>
+            </w:pPr>
             <w:r>
               <w:rPr>
                 <w:rFonts w:ascii="Courier New" w:hAnsi="Courier New"/>
                 <w:color w:val="E2E8F0"/>
                 <w:sz w:val="17"/>
               </w:rPr>
-              <w:br/>
-              <w:t>*   7d6c789 feat(state): integrate developer 2 profile and task counter handlers</w:t>
+              <w:t>* 8a11075 pfp</w:t>
             </w:r>
+          </w:p>
+          <w:p>
+            <w:pPr>
+              <w:spacing w:after="0"/>
+              <w:rPr>
+                <w:rFonts w:ascii="Courier New" w:hAnsi="Courier New"/>
+                <w:color w:val="E2E8F0"/>
+                <w:sz w:val="17"/>
+              </w:rPr>
+            </w:pPr>
             <w:r>
               <w:rPr>
                 <w:rFonts w:ascii="Courier New" w:hAnsi="Courier New"/>
                 <w:color w:val="E2E8F0"/>
                 <w:sz w:val="17"/>
               </w:rPr>
-              <w:br/>
-              <w:t xml:space="preserve">|\  </w:t>
+              <w:t>* ed90fe8 update the profile on collaborative team roster</w:t>
             </w:r>
+          </w:p>
+          <w:p>
+            <w:pPr>
+              <w:spacing w:after="0"/>
+              <w:rPr>
+                <w:rFonts w:ascii="Courier New" w:hAnsi="Courier New"/>
+                <w:color w:val="E2E8F0"/>
+                <w:sz w:val="17"/>
+              </w:rPr>
+            </w:pPr>
             <w:r>
               <w:rPr>
                 <w:rFonts w:ascii="Courier New" w:hAnsi="Courier New"/>
                 <w:color w:val="E2E8F0"/>
                 <w:sz w:val="17"/>
               </w:rPr>
-              <w:br/>
-              <w:t>| * 6c5d012 (feature/dev2-state) feat(state): integrate developer 2 profile and task counter handlers</w:t>
+              <w:t>* 65b1dc5 Create Ni-Git.code-workspace</w:t>
             </w:r>
+          </w:p>
+          <w:p>
+            <w:pPr>
+              <w:spacing w:after="0"/>
+              <w:rPr>
+                <w:rFonts w:ascii="Courier New" w:hAnsi="Courier New"/>
+                <w:color w:val="E2E8F0"/>
+                <w:sz w:val="17"/>
+              </w:rPr>
+            </w:pPr>
             <w:r>
               <w:rPr>
                 <w:rFonts w:ascii="Courier New" w:hAnsi="Courier New"/>
                 <w:color w:val="E2E8F0"/>
                 <w:sz w:val="17"/>
               </w:rPr>
-              <w:br/>
-              <w:t xml:space="preserve">|/  </w:t>
+              <w:t>* c0cf354 Small change and update of my profile, no major changes yet</w:t>
             </w:r>
+          </w:p>
+          <w:p>
+            <w:pPr>
+              <w:spacing w:after="0"/>
+              <w:rPr>
+                <w:rFonts w:ascii="Courier New" w:hAnsi="Courier New"/>
+                <w:color w:val="E2E8F0"/>
+                <w:sz w:val="17"/>
+              </w:rPr>
+            </w:pPr>
             <w:r>
               <w:rPr>
                 <w:rFonts w:ascii="Courier New" w:hAnsi="Courier New"/>
                 <w:color w:val="E2E8F0"/>
                 <w:sz w:val="17"/>
               </w:rPr>
-              <w:br/>
-              <w:t>*   5b4e345 feat(profile): integrate developer 1 profile card</w:t>
+              <w:t>* fe4b95f Initial Update and Change</w:t>
             </w:r>
+          </w:p>
+          <w:p>
+            <w:pPr>
+              <w:spacing w:after="0"/>
+            </w:pPr>
             <w:r>
               <w:rPr>
                 <w:rFonts w:ascii="Courier New" w:hAnsi="Courier New"/>
                 <w:color w:val="E2E8F0"/>
                 <w:sz w:val="17"/>
               </w:rPr>
-              <w:br/>
-              <w:t xml:space="preserve">|\  </w:t>
-            </w:r>
-            <w:r>
-              <w:rPr>
-                <w:rFonts w:ascii="Courier New" w:hAnsi="Courier New"/>
-                <w:color w:val="E2E8F0"/>
-                <w:sz w:val="17"/>
-              </w:rPr>
-              <w:br/>
-              <w:t>| * 4a3f678 (feature/dev1-profile) feat(profile): integrate developer 1 profile card</w:t>
-            </w:r>
-            <w:r>
-              <w:rPr>
-                <w:rFonts w:ascii="Courier New" w:hAnsi="Courier New"/>
-                <w:color w:val="E2E8F0"/>
-                <w:sz w:val="17"/>
-              </w:rPr>
-              <w:br/>
-              <w:t xml:space="preserve">|/  </w:t>
-            </w:r>
-            <w:r>
-              <w:rPr>
-                <w:rFonts w:ascii="Courier New" w:hAnsi="Courier New"/>
-                <w:color w:val="E2E8F0"/>
-                <w:sz w:val="17"/>
-              </w:rPr>
-              <w:br/>
-              <w:t>* 3a2e901 chore(</w:t>
-            </w:r>
-            <w:proofErr w:type="spellStart"/>
-            <w:r>
-              <w:rPr>
-                <w:rFonts w:ascii="Courier New" w:hAnsi="Courier New"/>
-                <w:color w:val="E2E8F0"/>
-                <w:sz w:val="17"/>
-              </w:rPr>
-              <w:t>init</w:t>
-            </w:r>
-            <w:proofErr w:type="spellEnd"/>
-            <w:r>
-              <w:rPr>
-                <w:rFonts w:ascii="Courier New" w:hAnsi="Courier New"/>
-                <w:color w:val="E2E8F0"/>
-                <w:sz w:val="17"/>
-              </w:rPr>
-              <w:t xml:space="preserve">): baseline repository with modern </w:t>
-            </w:r>
-            <w:proofErr w:type="spellStart"/>
-            <w:r>
-              <w:rPr>
-                <w:rFonts w:ascii="Courier New" w:hAnsi="Courier New"/>
-                <w:color w:val="E2E8F0"/>
-                <w:sz w:val="17"/>
-              </w:rPr>
-              <w:t>flet</w:t>
-            </w:r>
-            <w:proofErr w:type="spellEnd"/>
-            <w:r>
-              <w:rPr>
-                <w:rFonts w:ascii="Courier New" w:hAnsi="Courier New"/>
-                <w:color w:val="E2E8F0"/>
-                <w:sz w:val="17"/>
-              </w:rPr>
-              <w:t xml:space="preserve"> app and verification tool</w:t>
-            </w:r>
-            <w:r>
-              <w:rPr>
-                <w:rFonts w:ascii="Courier New" w:hAnsi="Courier New"/>
-                <w:color w:val="E2E8F0"/>
-                <w:sz w:val="17"/>
-              </w:rPr>
-              <w:br/>
-            </w:r>
-            <w:r>
-              <w:rPr>
-                <w:rFonts w:ascii="Courier New" w:hAnsi="Courier New"/>
-                <w:color w:val="E2E8F0"/>
-                <w:sz w:val="17"/>
-              </w:rPr>
-              <w:br/>
-              <w:t>[ REPLACE THE SAMPLE COMMIT LOG ABOVE WITH YOUR GROUP'S ACTUAL git_log_proof.txt OUTPUT ]</w:t>
+              <w:t>* f08c58a Initial commit</w:t>
             </w:r>
           </w:p>
         </w:tc>

</xml_diff>

<commit_message>
chore: add .code-workspace to .gitignore
</commit_message>
<xml_diff>
--- a/CCCS106_Lab01_Report_Barandon_Borja_Musa.docx
+++ b/CCCS106_Lab01_Report_Barandon_Borja_Musa.docx
@@ -153,23 +153,7 @@
                 <w:color w:val="0F172A"/>
                 <w:sz w:val="19"/>
               </w:rPr>
-              <w:t xml:space="preserve">Group No. [ </w:t>
-            </w:r>
-            <w:proofErr w:type="gramStart"/>
-            <w:r>
-              <w:rPr>
-                <w:color w:val="0F172A"/>
-                <w:sz w:val="19"/>
-              </w:rPr>
-              <w:t>2 ]</w:t>
-            </w:r>
-            <w:proofErr w:type="gramEnd"/>
-            <w:r>
-              <w:rPr>
-                <w:color w:val="0F172A"/>
-                <w:sz w:val="19"/>
-              </w:rPr>
-              <w:t xml:space="preserve">  (Ni-Git)</w:t>
+              <w:t>Group No. [ 2 ]  (Ni-Git)</w:t>
             </w:r>
           </w:p>
         </w:tc>
@@ -217,7 +201,6 @@
             <w:pPr>
               <w:spacing w:after="0"/>
             </w:pPr>
-            <w:proofErr w:type="gramStart"/>
             <w:r>
               <w:rPr>
                 <w:color w:val="0F172A"/>
@@ -230,32 +213,15 @@
                 <w:color w:val="0F172A"/>
                 <w:sz w:val="19"/>
               </w:rPr>
-              <w:t>September</w:t>
-            </w:r>
-            <w:proofErr w:type="gramEnd"/>
-            <w:r>
-              <w:rPr>
-                <w:color w:val="0F172A"/>
-                <w:sz w:val="19"/>
-              </w:rPr>
-              <w:t xml:space="preserve"> 09</w:t>
+              <w:t>September 09</w:t>
             </w:r>
             <w:r>
               <w:rPr>
                 <w:color w:val="0F172A"/>
                 <w:sz w:val="19"/>
               </w:rPr>
-              <w:t xml:space="preserve">, </w:t>
+              <w:t>, 2026 ]</w:t>
             </w:r>
-            <w:proofErr w:type="gramStart"/>
-            <w:r>
-              <w:rPr>
-                <w:color w:val="0F172A"/>
-                <w:sz w:val="19"/>
-              </w:rPr>
-              <w:t>2026 ]</w:t>
-            </w:r>
-            <w:proofErr w:type="gramEnd"/>
           </w:p>
         </w:tc>
       </w:tr>
@@ -472,31 +438,13 @@
             <w:pPr>
               <w:spacing w:after="0"/>
             </w:pPr>
-            <w:proofErr w:type="gramStart"/>
             <w:r>
               <w:rPr>
                 <w:b/>
                 <w:sz w:val="18"/>
               </w:rPr>
-              <w:t>[ Borja</w:t>
+              <w:t>[ Borja, Edmar B. ]</w:t>
             </w:r>
-            <w:proofErr w:type="gramEnd"/>
-            <w:r>
-              <w:rPr>
-                <w:b/>
-                <w:sz w:val="18"/>
-              </w:rPr>
-              <w:t xml:space="preserve">, Edmar </w:t>
-            </w:r>
-            <w:proofErr w:type="gramStart"/>
-            <w:r>
-              <w:rPr>
-                <w:b/>
-                <w:sz w:val="18"/>
-              </w:rPr>
-              <w:t>B. ]</w:t>
-            </w:r>
-            <w:proofErr w:type="gramEnd"/>
           </w:p>
         </w:tc>
         <w:tc>
@@ -595,21 +543,12 @@
             <w:pPr>
               <w:spacing w:after="0"/>
             </w:pPr>
-            <w:proofErr w:type="gramStart"/>
             <w:r>
               <w:rPr>
                 <w:b/>
                 <w:sz w:val="18"/>
               </w:rPr>
-              <w:t>[ Barandon</w:t>
-            </w:r>
-            <w:proofErr w:type="gramEnd"/>
-            <w:r>
-              <w:rPr>
-                <w:b/>
-                <w:sz w:val="18"/>
-              </w:rPr>
-              <w:t xml:space="preserve">, </w:t>
+              <w:t xml:space="preserve">[ Barandon, </w:t>
             </w:r>
             <w:proofErr w:type="spellStart"/>
             <w:r>
@@ -725,31 +664,13 @@
             <w:pPr>
               <w:spacing w:after="0"/>
             </w:pPr>
-            <w:proofErr w:type="gramStart"/>
             <w:r>
               <w:rPr>
                 <w:b/>
                 <w:sz w:val="18"/>
               </w:rPr>
-              <w:t>[ Musa</w:t>
+              <w:t>[ Musa, Eduardo Gabriel S. ]</w:t>
             </w:r>
-            <w:proofErr w:type="gramEnd"/>
-            <w:r>
-              <w:rPr>
-                <w:b/>
-                <w:sz w:val="18"/>
-              </w:rPr>
-              <w:t xml:space="preserve">, Eduardo Gabriel </w:t>
-            </w:r>
-            <w:proofErr w:type="gramStart"/>
-            <w:r>
-              <w:rPr>
-                <w:b/>
-                <w:sz w:val="18"/>
-              </w:rPr>
-              <w:t>S. ]</w:t>
-            </w:r>
-            <w:proofErr w:type="gramEnd"/>
           </w:p>
         </w:tc>
         <w:tc>
@@ -1045,18 +966,13 @@
       </w:r>
       <w:proofErr w:type="spellEnd"/>
       <w:r>
-        <w:t xml:space="preserve"> isolation, Flet SDK v0.86.5+, Git binary detection, configured institutional user identity, </w:t>
-      </w:r>
-      <w:proofErr w:type="gramStart"/>
-      <w:r>
-        <w:t>and .</w:t>
+        <w:t xml:space="preserve"> isolation, Flet SDK v0.86.5+, Git binary detection, configured institutional user identity, and .</w:t>
       </w:r>
       <w:proofErr w:type="spellStart"/>
       <w:r>
         <w:t>gitignore</w:t>
       </w:r>
       <w:proofErr w:type="spellEnd"/>
-      <w:proofErr w:type="gramEnd"/>
       <w:r>
         <w:t xml:space="preserve"> hygiene.</w:t>
       </w:r>
@@ -1163,18 +1079,13 @@
         <w:jc w:val="both"/>
       </w:pPr>
       <w:r>
-        <w:t xml:space="preserve">Section 3: Git Working Tree Cleanliness </w:t>
-      </w:r>
-      <w:proofErr w:type="gramStart"/>
-      <w:r>
-        <w:t>&amp; .</w:t>
+        <w:t>Section 3: Git Working Tree Cleanliness &amp; .</w:t>
       </w:r>
       <w:proofErr w:type="spellStart"/>
       <w:r>
         <w:t>gitignore</w:t>
       </w:r>
       <w:proofErr w:type="spellEnd"/>
-      <w:proofErr w:type="gramEnd"/>
       <w:r>
         <w:t xml:space="preserve"> Audit</w:t>
       </w:r>
@@ -1185,18 +1096,13 @@
         <w:jc w:val="both"/>
       </w:pPr>
       <w:r>
-        <w:t xml:space="preserve">Demonstration of repository hygiene. The screenshot proves that the working tree is clean with zero uncommitted changes, and </w:t>
-      </w:r>
-      <w:proofErr w:type="gramStart"/>
-      <w:r>
-        <w:t>that .</w:t>
+        <w:t>Demonstration of repository hygiene. The screenshot proves that the working tree is clean with zero uncommitted changes, and that .</w:t>
       </w:r>
       <w:proofErr w:type="spellStart"/>
       <w:r>
         <w:t>venv</w:t>
       </w:r>
       <w:proofErr w:type="spellEnd"/>
-      <w:proofErr w:type="gramEnd"/>
       <w:r>
         <w:t>/ is completely untracked (verified by running 'git ls-files .</w:t>
       </w:r>
@@ -1301,15 +1207,7 @@
           <w:b/>
           <w:sz w:val="19"/>
         </w:rPr>
-        <w:t xml:space="preserve">Figure 3: Git Working Tree Cleanliness </w:t>
-      </w:r>
-      <w:proofErr w:type="gramStart"/>
-      <w:r>
-        <w:rPr>
-          <w:b/>
-          <w:sz w:val="19"/>
-        </w:rPr>
-        <w:t>&amp; .</w:t>
+        <w:t>Figure 3: Git Working Tree Cleanliness &amp; .</w:t>
       </w:r>
       <w:proofErr w:type="spellStart"/>
       <w:r>
@@ -1320,7 +1218,6 @@
         <w:t>gitignore</w:t>
       </w:r>
       <w:proofErr w:type="spellEnd"/>
-      <w:proofErr w:type="gramEnd"/>
       <w:r>
         <w:rPr>
           <w:b/>
@@ -1667,15 +1564,7 @@
     </w:p>
     <w:p>
       <w:r>
-        <w:t xml:space="preserve">Summary of individual contributions and </w:t>
-      </w:r>
-      <w:proofErr w:type="gramStart"/>
-      <w:r>
-        <w:t>commit</w:t>
-      </w:r>
-      <w:proofErr w:type="gramEnd"/>
-      <w:r>
-        <w:t xml:space="preserve"> accountability across all three triad developers.</w:t>
+        <w:t>Summary of individual contributions and commit accountability across all three triad developers.</w:t>
       </w:r>
     </w:p>
     <w:tbl>
@@ -1846,31 +1735,13 @@
             <w:pPr>
               <w:spacing w:after="0"/>
             </w:pPr>
-            <w:proofErr w:type="gramStart"/>
             <w:r>
               <w:rPr>
                 <w:b/>
                 <w:sz w:val="17"/>
               </w:rPr>
-              <w:t>[ Borja</w:t>
+              <w:t>[ Borja, Edmar B. ]</w:t>
             </w:r>
-            <w:proofErr w:type="gramEnd"/>
-            <w:r>
-              <w:rPr>
-                <w:b/>
-                <w:sz w:val="17"/>
-              </w:rPr>
-              <w:t xml:space="preserve">, Edmar </w:t>
-            </w:r>
-            <w:proofErr w:type="gramStart"/>
-            <w:r>
-              <w:rPr>
-                <w:b/>
-                <w:sz w:val="17"/>
-              </w:rPr>
-              <w:t>B. ]</w:t>
-            </w:r>
-            <w:proofErr w:type="gramEnd"/>
           </w:p>
         </w:tc>
         <w:tc>
@@ -2014,14 +1885,7 @@
               <w:rPr>
                 <w:sz w:val="17"/>
               </w:rPr>
-              <w:t xml:space="preserve">Initialized repo, </w:t>
-            </w:r>
-            <w:proofErr w:type="gramStart"/>
-            <w:r>
-              <w:rPr>
-                <w:sz w:val="17"/>
-              </w:rPr>
-              <w:t>setup .</w:t>
+              <w:t>Initialized repo, setup .</w:t>
             </w:r>
             <w:proofErr w:type="spellStart"/>
             <w:r>
@@ -2031,7 +1895,6 @@
               <w:t>gitignore</w:t>
             </w:r>
             <w:proofErr w:type="spellEnd"/>
-            <w:proofErr w:type="gramEnd"/>
             <w:r>
               <w:rPr>
                 <w:sz w:val="17"/>
@@ -2060,21 +1923,12 @@
             <w:pPr>
               <w:spacing w:after="0"/>
             </w:pPr>
-            <w:proofErr w:type="gramStart"/>
             <w:r>
               <w:rPr>
                 <w:b/>
                 <w:sz w:val="17"/>
               </w:rPr>
-              <w:t>[ Barandon</w:t>
-            </w:r>
-            <w:proofErr w:type="gramEnd"/>
-            <w:r>
-              <w:rPr>
-                <w:b/>
-                <w:sz w:val="17"/>
-              </w:rPr>
-              <w:t xml:space="preserve">, </w:t>
+              <w:t xml:space="preserve">[ Barandon, </w:t>
             </w:r>
             <w:proofErr w:type="spellStart"/>
             <w:r>
@@ -2214,31 +2068,13 @@
             <w:pPr>
               <w:spacing w:after="0"/>
             </w:pPr>
-            <w:proofErr w:type="gramStart"/>
             <w:r>
               <w:rPr>
                 <w:b/>
                 <w:sz w:val="17"/>
               </w:rPr>
-              <w:t>[ Musa</w:t>
+              <w:t>[ Musa, Eduardo Gabriel S. ]</w:t>
             </w:r>
-            <w:proofErr w:type="gramEnd"/>
-            <w:r>
-              <w:rPr>
-                <w:b/>
-                <w:sz w:val="17"/>
-              </w:rPr>
-              <w:t xml:space="preserve">, Eduardo Gabriel </w:t>
-            </w:r>
-            <w:proofErr w:type="gramStart"/>
-            <w:r>
-              <w:rPr>
-                <w:b/>
-                <w:sz w:val="17"/>
-              </w:rPr>
-              <w:t>S. ]</w:t>
-            </w:r>
-            <w:proofErr w:type="gramEnd"/>
           </w:p>
         </w:tc>
         <w:tc>
@@ -2471,34 +2307,82 @@
         <w:ind w:firstLine="720"/>
         <w:jc w:val="both"/>
       </w:pPr>
-      <w:proofErr w:type="gramStart"/>
       <w:r>
         <w:rPr>
           <w:i/>
           <w:color w:val="64748B"/>
           <w:sz w:val="19"/>
         </w:rPr>
-        <w:t>[ Write</w:t>
+        <w:t xml:space="preserve">I learned </w:t>
       </w:r>
-      <w:proofErr w:type="gramEnd"/>
       <w:r>
         <w:rPr>
           <w:i/>
           <w:color w:val="64748B"/>
           <w:sz w:val="19"/>
         </w:rPr>
-        <w:t xml:space="preserve"> 3-4 sentences describing what you learned about feature branching safety, enforcing state boundary constraints, and testing Material 3 controls in Flet</w:t>
+        <w:t xml:space="preserve">how to properly merge </w:t>
       </w:r>
-      <w:proofErr w:type="gramStart"/>
       <w:r>
         <w:rPr>
           <w:i/>
           <w:color w:val="64748B"/>
           <w:sz w:val="19"/>
         </w:rPr>
-        <w:t>... ]</w:t>
+        <w:t>two branches properly, how to always pull to avoid conflict when merging</w:t>
       </w:r>
-      <w:proofErr w:type="gramEnd"/>
+      <w:r>
+        <w:rPr>
+          <w:i/>
+          <w:color w:val="64748B"/>
+          <w:sz w:val="19"/>
+        </w:rPr>
+        <w:t>. How to update .</w:t>
+      </w:r>
+      <w:proofErr w:type="spellStart"/>
+      <w:r>
+        <w:rPr>
+          <w:i/>
+          <w:color w:val="64748B"/>
+          <w:sz w:val="19"/>
+        </w:rPr>
+        <w:t>gitignore</w:t>
+      </w:r>
+      <w:proofErr w:type="spellEnd"/>
+      <w:r>
+        <w:rPr>
+          <w:i/>
+          <w:color w:val="64748B"/>
+          <w:sz w:val="19"/>
+        </w:rPr>
+        <w:t>, commit properly</w:t>
+      </w:r>
+      <w:r>
+        <w:rPr>
+          <w:i/>
+          <w:color w:val="64748B"/>
+          <w:sz w:val="19"/>
+        </w:rPr>
+        <w:t xml:space="preserve">, and push to the </w:t>
+      </w:r>
+      <w:proofErr w:type="spellStart"/>
+      <w:r>
+        <w:rPr>
+          <w:i/>
+          <w:color w:val="64748B"/>
+          <w:sz w:val="19"/>
+        </w:rPr>
+        <w:t>Github</w:t>
+      </w:r>
+      <w:proofErr w:type="spellEnd"/>
+      <w:r>
+        <w:rPr>
+          <w:i/>
+          <w:color w:val="64748B"/>
+          <w:sz w:val="19"/>
+        </w:rPr>
+        <w:t xml:space="preserve"> repository. </w:t>
+      </w:r>
     </w:p>
     <w:p>
       <w:pPr>
@@ -2520,28 +2404,15 @@
     </w:p>
     <w:p>
       <w:r>
-        <w:t xml:space="preserve">Verbatim ASCII commit history exported using 'git </w:t>
-      </w:r>
-      <w:proofErr w:type="gramStart"/>
-      <w:r>
-        <w:t>log --</w:t>
+        <w:t>Verbatim ASCII commit history exported using 'git log --</w:t>
       </w:r>
       <w:proofErr w:type="spellStart"/>
       <w:r>
         <w:t>oneline</w:t>
       </w:r>
       <w:proofErr w:type="spellEnd"/>
-      <w:proofErr w:type="gramEnd"/>
       <w:r>
-        <w:t xml:space="preserve"> --graph --all &gt; git_log_proof.txt'. This demonstrates the complete sequential feature branching and </w:t>
-      </w:r>
-      <w:proofErr w:type="gramStart"/>
-      <w:r>
-        <w:t>merge</w:t>
-      </w:r>
-      <w:proofErr w:type="gramEnd"/>
-      <w:r>
-        <w:t xml:space="preserve"> timeline across all three developers.</w:t>
+        <w:t xml:space="preserve"> --graph --all &gt; git_log_proof.txt'. This demonstrates the complete sequential feature branching and merge timeline across all three developers.</w:t>
       </w:r>
     </w:p>
     <w:tbl>
@@ -2954,25 +2825,7 @@
                 <w:color w:val="E2E8F0"/>
                 <w:sz w:val="17"/>
               </w:rPr>
-              <w:t xml:space="preserve">* c0cf354 </w:t>
-            </w:r>
-            <w:proofErr w:type="gramStart"/>
-            <w:r>
-              <w:rPr>
-                <w:rFonts w:ascii="Courier New" w:hAnsi="Courier New"/>
-                <w:color w:val="E2E8F0"/>
-                <w:sz w:val="17"/>
-              </w:rPr>
-              <w:t>Small</w:t>
-            </w:r>
-            <w:proofErr w:type="gramEnd"/>
-            <w:r>
-              <w:rPr>
-                <w:rFonts w:ascii="Courier New" w:hAnsi="Courier New"/>
-                <w:color w:val="E2E8F0"/>
-                <w:sz w:val="17"/>
-              </w:rPr>
-              <w:t xml:space="preserve"> change and update of my profile, no major changes yet</w:t>
+              <w:t>* c0cf354 Small change and update of my profile, no major changes yet</w:t>
             </w:r>
           </w:p>
           <w:p>
@@ -3855,6 +3708,7 @@
   <w:style w:type="character" w:default="1" w:styleId="DefaultParagraphFont">
     <w:name w:val="Default Paragraph Font"/>
     <w:uiPriority w:val="1"/>
+    <w:semiHidden/>
     <w:unhideWhenUsed/>
   </w:style>
   <w:style w:type="table" w:default="1" w:styleId="TableNormal">

</xml_diff>

<commit_message>
docs(PDF): dev-3 reflection update
</commit_message>
<xml_diff>
--- a/CCCS106_Lab01_Report_Barandon_Borja_Musa.docx
+++ b/CCCS106_Lab01_Report_Barandon_Borja_Musa.docx
@@ -153,7 +153,23 @@
                 <w:color w:val="0F172A"/>
                 <w:sz w:val="19"/>
               </w:rPr>
-              <w:t>Group No. [ 2 ]  (Ni-Git)</w:t>
+              <w:t xml:space="preserve">Group No. [ </w:t>
+            </w:r>
+            <w:proofErr w:type="gramStart"/>
+            <w:r>
+              <w:rPr>
+                <w:color w:val="0F172A"/>
+                <w:sz w:val="19"/>
+              </w:rPr>
+              <w:t>2 ]</w:t>
+            </w:r>
+            <w:proofErr w:type="gramEnd"/>
+            <w:r>
+              <w:rPr>
+                <w:color w:val="0F172A"/>
+                <w:sz w:val="19"/>
+              </w:rPr>
+              <w:t xml:space="preserve">  (Ni-Git)</w:t>
             </w:r>
           </w:p>
         </w:tc>
@@ -220,8 +236,17 @@
                 <w:color w:val="0F172A"/>
                 <w:sz w:val="19"/>
               </w:rPr>
-              <w:t>, 2026 ]</w:t>
+              <w:t xml:space="preserve">, </w:t>
             </w:r>
+            <w:proofErr w:type="gramStart"/>
+            <w:r>
+              <w:rPr>
+                <w:color w:val="0F172A"/>
+                <w:sz w:val="19"/>
+              </w:rPr>
+              <w:t>2026 ]</w:t>
+            </w:r>
+            <w:proofErr w:type="gramEnd"/>
           </w:p>
         </w:tc>
       </w:tr>
@@ -443,8 +468,17 @@
                 <w:b/>
                 <w:sz w:val="18"/>
               </w:rPr>
-              <w:t>[ Borja, Edmar B. ]</w:t>
+              <w:t xml:space="preserve">[ Borja, Edmar </w:t>
             </w:r>
+            <w:proofErr w:type="gramStart"/>
+            <w:r>
+              <w:rPr>
+                <w:b/>
+                <w:sz w:val="18"/>
+              </w:rPr>
+              <w:t>B. ]</w:t>
+            </w:r>
+            <w:proofErr w:type="gramEnd"/>
           </w:p>
         </w:tc>
         <w:tc>
@@ -669,8 +703,17 @@
                 <w:b/>
                 <w:sz w:val="18"/>
               </w:rPr>
-              <w:t>[ Musa, Eduardo Gabriel S. ]</w:t>
+              <w:t xml:space="preserve">[ Musa, Eduardo Gabriel </w:t>
             </w:r>
+            <w:proofErr w:type="gramStart"/>
+            <w:r>
+              <w:rPr>
+                <w:b/>
+                <w:sz w:val="18"/>
+              </w:rPr>
+              <w:t>S. ]</w:t>
+            </w:r>
+            <w:proofErr w:type="gramEnd"/>
           </w:p>
         </w:tc>
         <w:tc>
@@ -966,13 +1009,18 @@
       </w:r>
       <w:proofErr w:type="spellEnd"/>
       <w:r>
-        <w:t xml:space="preserve"> isolation, Flet SDK v0.86.5+, Git binary detection, configured institutional user identity, and .</w:t>
+        <w:t xml:space="preserve"> isolation, Flet SDK v0.86.5+, Git binary detection, configured institutional user identity, </w:t>
+      </w:r>
+      <w:proofErr w:type="gramStart"/>
+      <w:r>
+        <w:t>and .</w:t>
       </w:r>
       <w:proofErr w:type="spellStart"/>
       <w:r>
         <w:t>gitignore</w:t>
       </w:r>
       <w:proofErr w:type="spellEnd"/>
+      <w:proofErr w:type="gramEnd"/>
       <w:r>
         <w:t xml:space="preserve"> hygiene.</w:t>
       </w:r>
@@ -1079,13 +1127,18 @@
         <w:jc w:val="both"/>
       </w:pPr>
       <w:r>
-        <w:t>Section 3: Git Working Tree Cleanliness &amp; .</w:t>
+        <w:t xml:space="preserve">Section 3: Git Working Tree Cleanliness </w:t>
+      </w:r>
+      <w:proofErr w:type="gramStart"/>
+      <w:r>
+        <w:t>&amp; .</w:t>
       </w:r>
       <w:proofErr w:type="spellStart"/>
       <w:r>
         <w:t>gitignore</w:t>
       </w:r>
       <w:proofErr w:type="spellEnd"/>
+      <w:proofErr w:type="gramEnd"/>
       <w:r>
         <w:t xml:space="preserve"> Audit</w:t>
       </w:r>
@@ -1096,13 +1149,18 @@
         <w:jc w:val="both"/>
       </w:pPr>
       <w:r>
-        <w:t>Demonstration of repository hygiene. The screenshot proves that the working tree is clean with zero uncommitted changes, and that .</w:t>
+        <w:t xml:space="preserve">Demonstration of repository hygiene. The screenshot proves that the working tree is clean with zero uncommitted changes, and </w:t>
+      </w:r>
+      <w:proofErr w:type="gramStart"/>
+      <w:r>
+        <w:t>that .</w:t>
       </w:r>
       <w:proofErr w:type="spellStart"/>
       <w:r>
         <w:t>venv</w:t>
       </w:r>
       <w:proofErr w:type="spellEnd"/>
+      <w:proofErr w:type="gramEnd"/>
       <w:r>
         <w:t>/ is completely untracked (verified by running 'git ls-files .</w:t>
       </w:r>
@@ -1207,7 +1265,15 @@
           <w:b/>
           <w:sz w:val="19"/>
         </w:rPr>
-        <w:t>Figure 3: Git Working Tree Cleanliness &amp; .</w:t>
+        <w:t xml:space="preserve">Figure 3: Git Working Tree Cleanliness </w:t>
+      </w:r>
+      <w:proofErr w:type="gramStart"/>
+      <w:r>
+        <w:rPr>
+          <w:b/>
+          <w:sz w:val="19"/>
+        </w:rPr>
+        <w:t>&amp; .</w:t>
       </w:r>
       <w:proofErr w:type="spellStart"/>
       <w:r>
@@ -1218,6 +1284,7 @@
         <w:t>gitignore</w:t>
       </w:r>
       <w:proofErr w:type="spellEnd"/>
+      <w:proofErr w:type="gramEnd"/>
       <w:r>
         <w:rPr>
           <w:b/>
@@ -1740,8 +1807,17 @@
                 <w:b/>
                 <w:sz w:val="17"/>
               </w:rPr>
-              <w:t>[ Borja, Edmar B. ]</w:t>
+              <w:t xml:space="preserve">[ Borja, Edmar </w:t>
             </w:r>
+            <w:proofErr w:type="gramStart"/>
+            <w:r>
+              <w:rPr>
+                <w:b/>
+                <w:sz w:val="17"/>
+              </w:rPr>
+              <w:t>B. ]</w:t>
+            </w:r>
+            <w:proofErr w:type="gramEnd"/>
           </w:p>
         </w:tc>
         <w:tc>
@@ -1885,7 +1961,14 @@
               <w:rPr>
                 <w:sz w:val="17"/>
               </w:rPr>
-              <w:t>Initialized repo, setup .</w:t>
+              <w:t xml:space="preserve">Initialized repo, </w:t>
+            </w:r>
+            <w:proofErr w:type="gramStart"/>
+            <w:r>
+              <w:rPr>
+                <w:sz w:val="17"/>
+              </w:rPr>
+              <w:t>setup .</w:t>
             </w:r>
             <w:proofErr w:type="spellStart"/>
             <w:r>
@@ -1895,6 +1978,7 @@
               <w:t>gitignore</w:t>
             </w:r>
             <w:proofErr w:type="spellEnd"/>
+            <w:proofErr w:type="gramEnd"/>
             <w:r>
               <w:rPr>
                 <w:sz w:val="17"/>
@@ -2073,8 +2157,17 @@
                 <w:b/>
                 <w:sz w:val="17"/>
               </w:rPr>
-              <w:t>[ Musa, Eduardo Gabriel S. ]</w:t>
+              <w:t xml:space="preserve">[ Musa, Eduardo Gabriel </w:t>
             </w:r>
+            <w:proofErr w:type="gramStart"/>
+            <w:r>
+              <w:rPr>
+                <w:b/>
+                <w:sz w:val="17"/>
+              </w:rPr>
+              <w:t>S. ]</w:t>
+            </w:r>
+            <w:proofErr w:type="gramEnd"/>
           </w:p>
         </w:tc>
         <w:tc>
@@ -2337,7 +2430,16 @@
           <w:color w:val="64748B"/>
           <w:sz w:val="19"/>
         </w:rPr>
-        <w:t>. How to update .</w:t>
+        <w:t xml:space="preserve">. How to </w:t>
+      </w:r>
+      <w:proofErr w:type="gramStart"/>
+      <w:r>
+        <w:rPr>
+          <w:i/>
+          <w:color w:val="64748B"/>
+          <w:sz w:val="19"/>
+        </w:rPr>
+        <w:t>update .</w:t>
       </w:r>
       <w:proofErr w:type="spellStart"/>
       <w:r>
@@ -2349,6 +2451,7 @@
         <w:t>gitignore</w:t>
       </w:r>
       <w:proofErr w:type="spellEnd"/>
+      <w:proofErr w:type="gramEnd"/>
       <w:r>
         <w:rPr>
           <w:i/>
@@ -2382,6 +2485,74 @@
           <w:sz w:val="19"/>
         </w:rPr>
         <w:t xml:space="preserve"> repository. </w:t>
+      </w:r>
+      <w:r>
+        <w:rPr>
+          <w:i/>
+          <w:color w:val="64748B"/>
+          <w:sz w:val="19"/>
+        </w:rPr>
+        <w:t xml:space="preserve">I also learn about the naming conventions for committing to </w:t>
+      </w:r>
+      <w:proofErr w:type="spellStart"/>
+      <w:r>
+        <w:rPr>
+          <w:i/>
+          <w:color w:val="64748B"/>
+          <w:sz w:val="19"/>
+        </w:rPr>
+        <w:t>Github</w:t>
+      </w:r>
+      <w:proofErr w:type="spellEnd"/>
+      <w:r>
+        <w:rPr>
+          <w:i/>
+          <w:color w:val="64748B"/>
+          <w:sz w:val="19"/>
+        </w:rPr>
+        <w:t xml:space="preserve">, I also learn about the workflow in a dev team. I have gained knowledge on what it is mean to become a QA, and how to ensure </w:t>
+      </w:r>
+      <w:r>
+        <w:rPr>
+          <w:i/>
+          <w:color w:val="64748B"/>
+          <w:sz w:val="19"/>
+        </w:rPr>
+        <w:t xml:space="preserve">of the project’s quality have met the standard or even exceeded it. I am still learning on various things </w:t>
+      </w:r>
+      <w:r>
+        <w:rPr>
+          <w:i/>
+          <w:color w:val="64748B"/>
+          <w:sz w:val="19"/>
+        </w:rPr>
+        <w:t xml:space="preserve">that is related to </w:t>
+      </w:r>
+      <w:proofErr w:type="spellStart"/>
+      <w:r>
+        <w:rPr>
+          <w:i/>
+          <w:color w:val="64748B"/>
+          <w:sz w:val="19"/>
+        </w:rPr>
+        <w:t>Github</w:t>
+      </w:r>
+      <w:proofErr w:type="spellEnd"/>
+      <w:r>
+        <w:rPr>
+          <w:i/>
+          <w:color w:val="64748B"/>
+          <w:sz w:val="19"/>
+        </w:rPr>
+        <w:t xml:space="preserve"> and the workflow procedure of </w:t>
+      </w:r>
+      <w:r>
+        <w:rPr>
+          <w:i/>
+          <w:color w:val="64748B"/>
+          <w:sz w:val="19"/>
+        </w:rPr>
+        <w:t>creating a project.</w:t>
       </w:r>
     </w:p>
     <w:p>
@@ -2825,7 +2996,25 @@
                 <w:color w:val="E2E8F0"/>
                 <w:sz w:val="17"/>
               </w:rPr>
-              <w:t>* c0cf354 Small change and update of my profile, no major changes yet</w:t>
+              <w:t xml:space="preserve">* c0cf354 </w:t>
+            </w:r>
+            <w:proofErr w:type="gramStart"/>
+            <w:r>
+              <w:rPr>
+                <w:rFonts w:ascii="Courier New" w:hAnsi="Courier New"/>
+                <w:color w:val="E2E8F0"/>
+                <w:sz w:val="17"/>
+              </w:rPr>
+              <w:t>Small</w:t>
+            </w:r>
+            <w:proofErr w:type="gramEnd"/>
+            <w:r>
+              <w:rPr>
+                <w:rFonts w:ascii="Courier New" w:hAnsi="Courier New"/>
+                <w:color w:val="E2E8F0"/>
+                <w:sz w:val="17"/>
+              </w:rPr>
+              <w:t xml:space="preserve"> change and update of my profile, no major changes yet</w:t>
             </w:r>
           </w:p>
           <w:p>

</xml_diff>

<commit_message>
docs(PDF): dev-3 reflectios updated)
</commit_message>
<xml_diff>
--- a/CCCS106_Lab01_Report_Barandon_Borja_Musa.docx
+++ b/CCCS106_Lab01_Report_Barandon_Borja_Musa.docx
@@ -217,7 +217,6 @@
             <w:pPr>
               <w:spacing w:after="0"/>
             </w:pPr>
-            <w:proofErr w:type="gramStart"/>
             <w:r>
               <w:rPr>
                 <w:color w:val="0F172A"/>
@@ -230,15 +229,7 @@
                 <w:color w:val="0F172A"/>
                 <w:sz w:val="19"/>
               </w:rPr>
-              <w:t>September</w:t>
-            </w:r>
-            <w:proofErr w:type="gramEnd"/>
-            <w:r>
-              <w:rPr>
-                <w:color w:val="0F172A"/>
-                <w:sz w:val="19"/>
-              </w:rPr>
-              <w:t xml:space="preserve"> 09</w:t>
+              <w:t>September 09</w:t>
             </w:r>
             <w:r>
               <w:rPr>
@@ -472,21 +463,12 @@
             <w:pPr>
               <w:spacing w:after="0"/>
             </w:pPr>
-            <w:proofErr w:type="gramStart"/>
             <w:r>
               <w:rPr>
                 <w:b/>
                 <w:sz w:val="18"/>
               </w:rPr>
-              <w:t>[ Borja</w:t>
-            </w:r>
-            <w:proofErr w:type="gramEnd"/>
-            <w:r>
-              <w:rPr>
-                <w:b/>
-                <w:sz w:val="18"/>
-              </w:rPr>
-              <w:t xml:space="preserve">, Edmar </w:t>
+              <w:t xml:space="preserve">[ Borja, Edmar </w:t>
             </w:r>
             <w:proofErr w:type="gramStart"/>
             <w:r>
@@ -595,21 +577,12 @@
             <w:pPr>
               <w:spacing w:after="0"/>
             </w:pPr>
-            <w:proofErr w:type="gramStart"/>
             <w:r>
               <w:rPr>
                 <w:b/>
                 <w:sz w:val="18"/>
               </w:rPr>
-              <w:t>[ Barandon</w:t>
-            </w:r>
-            <w:proofErr w:type="gramEnd"/>
-            <w:r>
-              <w:rPr>
-                <w:b/>
-                <w:sz w:val="18"/>
-              </w:rPr>
-              <w:t xml:space="preserve">, </w:t>
+              <w:t xml:space="preserve">[ Barandon, </w:t>
             </w:r>
             <w:proofErr w:type="spellStart"/>
             <w:r>
@@ -725,21 +698,12 @@
             <w:pPr>
               <w:spacing w:after="0"/>
             </w:pPr>
-            <w:proofErr w:type="gramStart"/>
             <w:r>
               <w:rPr>
                 <w:b/>
                 <w:sz w:val="18"/>
               </w:rPr>
-              <w:t>[ Musa</w:t>
-            </w:r>
-            <w:proofErr w:type="gramEnd"/>
-            <w:r>
-              <w:rPr>
-                <w:b/>
-                <w:sz w:val="18"/>
-              </w:rPr>
-              <w:t xml:space="preserve">, Eduardo Gabriel </w:t>
+              <w:t xml:space="preserve">[ Musa, Eduardo Gabriel </w:t>
             </w:r>
             <w:proofErr w:type="gramStart"/>
             <w:r>
@@ -1667,15 +1631,7 @@
     </w:p>
     <w:p>
       <w:r>
-        <w:t xml:space="preserve">Summary of individual contributions and </w:t>
-      </w:r>
-      <w:proofErr w:type="gramStart"/>
-      <w:r>
-        <w:t>commit</w:t>
-      </w:r>
-      <w:proofErr w:type="gramEnd"/>
-      <w:r>
-        <w:t xml:space="preserve"> accountability across all three triad developers.</w:t>
+        <w:t>Summary of individual contributions and commit accountability across all three triad developers.</w:t>
       </w:r>
     </w:p>
     <w:tbl>
@@ -1846,21 +1802,12 @@
             <w:pPr>
               <w:spacing w:after="0"/>
             </w:pPr>
-            <w:proofErr w:type="gramStart"/>
             <w:r>
               <w:rPr>
                 <w:b/>
                 <w:sz w:val="17"/>
               </w:rPr>
-              <w:t>[ Borja</w:t>
-            </w:r>
-            <w:proofErr w:type="gramEnd"/>
-            <w:r>
-              <w:rPr>
-                <w:b/>
-                <w:sz w:val="17"/>
-              </w:rPr>
-              <w:t xml:space="preserve">, Edmar </w:t>
+              <w:t xml:space="preserve">[ Borja, Edmar </w:t>
             </w:r>
             <w:proofErr w:type="gramStart"/>
             <w:r>
@@ -2060,21 +2007,12 @@
             <w:pPr>
               <w:spacing w:after="0"/>
             </w:pPr>
-            <w:proofErr w:type="gramStart"/>
             <w:r>
               <w:rPr>
                 <w:b/>
                 <w:sz w:val="17"/>
               </w:rPr>
-              <w:t>[ Barandon</w:t>
-            </w:r>
-            <w:proofErr w:type="gramEnd"/>
-            <w:r>
-              <w:rPr>
-                <w:b/>
-                <w:sz w:val="17"/>
-              </w:rPr>
-              <w:t xml:space="preserve">, </w:t>
+              <w:t xml:space="preserve">[ Barandon, </w:t>
             </w:r>
             <w:proofErr w:type="spellStart"/>
             <w:r>
@@ -2214,21 +2152,12 @@
             <w:pPr>
               <w:spacing w:after="0"/>
             </w:pPr>
-            <w:proofErr w:type="gramStart"/>
             <w:r>
               <w:rPr>
                 <w:b/>
                 <w:sz w:val="17"/>
               </w:rPr>
-              <w:t>[ Musa</w:t>
-            </w:r>
-            <w:proofErr w:type="gramEnd"/>
-            <w:r>
-              <w:rPr>
-                <w:b/>
-                <w:sz w:val="17"/>
-              </w:rPr>
-              <w:t xml:space="preserve">, Eduardo Gabriel </w:t>
+              <w:t xml:space="preserve">[ Musa, Eduardo Gabriel </w:t>
             </w:r>
             <w:proofErr w:type="gramStart"/>
             <w:r>
@@ -2471,23 +2400,37 @@
         <w:ind w:firstLine="720"/>
         <w:jc w:val="both"/>
       </w:pPr>
-      <w:proofErr w:type="gramStart"/>
       <w:r>
         <w:rPr>
           <w:i/>
           <w:color w:val="64748B"/>
           <w:sz w:val="19"/>
         </w:rPr>
-        <w:t>[ Write</w:t>
+        <w:t xml:space="preserve">I learned </w:t>
       </w:r>
-      <w:proofErr w:type="gramEnd"/>
       <w:r>
         <w:rPr>
           <w:i/>
           <w:color w:val="64748B"/>
           <w:sz w:val="19"/>
         </w:rPr>
-        <w:t xml:space="preserve"> 3-4 sentences describing what you learned about feature branching safety, enforcing state boundary constraints, and testing Material 3 controls in Flet</w:t>
+        <w:t xml:space="preserve">how to properly merge </w:t>
+      </w:r>
+      <w:r>
+        <w:rPr>
+          <w:i/>
+          <w:color w:val="64748B"/>
+          <w:sz w:val="19"/>
+        </w:rPr>
+        <w:t>two branches properly, how to always pull to avoid conflict when merging</w:t>
+      </w:r>
+      <w:r>
+        <w:rPr>
+          <w:i/>
+          <w:color w:val="64748B"/>
+          <w:sz w:val="19"/>
+        </w:rPr>
+        <w:t xml:space="preserve">. How to </w:t>
       </w:r>
       <w:proofErr w:type="gramStart"/>
       <w:r>
@@ -2496,9 +2439,121 @@
           <w:color w:val="64748B"/>
           <w:sz w:val="19"/>
         </w:rPr>
-        <w:t>... ]</w:t>
+        <w:t>update .</w:t>
       </w:r>
+      <w:proofErr w:type="spellStart"/>
+      <w:r>
+        <w:rPr>
+          <w:i/>
+          <w:color w:val="64748B"/>
+          <w:sz w:val="19"/>
+        </w:rPr>
+        <w:t>gitignore</w:t>
+      </w:r>
+      <w:proofErr w:type="spellEnd"/>
       <w:proofErr w:type="gramEnd"/>
+      <w:r>
+        <w:rPr>
+          <w:i/>
+          <w:color w:val="64748B"/>
+          <w:sz w:val="19"/>
+        </w:rPr>
+        <w:t>, commit properly</w:t>
+      </w:r>
+      <w:r>
+        <w:rPr>
+          <w:i/>
+          <w:color w:val="64748B"/>
+          <w:sz w:val="19"/>
+        </w:rPr>
+        <w:t xml:space="preserve">, and push to the </w:t>
+      </w:r>
+      <w:proofErr w:type="spellStart"/>
+      <w:r>
+        <w:rPr>
+          <w:i/>
+          <w:color w:val="64748B"/>
+          <w:sz w:val="19"/>
+        </w:rPr>
+        <w:t>Github</w:t>
+      </w:r>
+      <w:proofErr w:type="spellEnd"/>
+      <w:r>
+        <w:rPr>
+          <w:i/>
+          <w:color w:val="64748B"/>
+          <w:sz w:val="19"/>
+        </w:rPr>
+        <w:t xml:space="preserve"> repository. </w:t>
+      </w:r>
+      <w:r>
+        <w:rPr>
+          <w:i/>
+          <w:color w:val="64748B"/>
+          <w:sz w:val="19"/>
+        </w:rPr>
+        <w:t xml:space="preserve">I also learn about the naming conventions for committing to </w:t>
+      </w:r>
+      <w:proofErr w:type="spellStart"/>
+      <w:r>
+        <w:rPr>
+          <w:i/>
+          <w:color w:val="64748B"/>
+          <w:sz w:val="19"/>
+        </w:rPr>
+        <w:t>Github</w:t>
+      </w:r>
+      <w:proofErr w:type="spellEnd"/>
+      <w:r>
+        <w:rPr>
+          <w:i/>
+          <w:color w:val="64748B"/>
+          <w:sz w:val="19"/>
+        </w:rPr>
+        <w:t xml:space="preserve">, I also learn about the workflow in a dev team. I have gained knowledge on what it is mean to become a QA, and how to ensure </w:t>
+      </w:r>
+      <w:r>
+        <w:rPr>
+          <w:i/>
+          <w:color w:val="64748B"/>
+          <w:sz w:val="19"/>
+        </w:rPr>
+        <w:t xml:space="preserve">of the project’s quality have met the standard or even exceeded it. I am still learning on various things </w:t>
+      </w:r>
+      <w:r>
+        <w:rPr>
+          <w:i/>
+          <w:color w:val="64748B"/>
+          <w:sz w:val="19"/>
+        </w:rPr>
+        <w:t xml:space="preserve">that is related to </w:t>
+      </w:r>
+      <w:proofErr w:type="spellStart"/>
+      <w:r>
+        <w:rPr>
+          <w:i/>
+          <w:color w:val="64748B"/>
+          <w:sz w:val="19"/>
+        </w:rPr>
+        <w:t>Github</w:t>
+      </w:r>
+      <w:proofErr w:type="spellEnd"/>
+      <w:r>
+        <w:rPr>
+          <w:i/>
+          <w:color w:val="64748B"/>
+          <w:sz w:val="19"/>
+        </w:rPr>
+        <w:t xml:space="preserve"> and the workflow procedure of </w:t>
+      </w:r>
+      <w:r>
+        <w:rPr>
+          <w:i/>
+          <w:color w:val="64748B"/>
+          <w:sz w:val="19"/>
+        </w:rPr>
+        <w:t>creating a project.</w:t>
+      </w:r>
     </w:p>
     <w:p>
       <w:pPr>
@@ -2520,28 +2575,15 @@
     </w:p>
     <w:p>
       <w:r>
-        <w:t xml:space="preserve">Verbatim ASCII commit history exported using 'git </w:t>
-      </w:r>
-      <w:proofErr w:type="gramStart"/>
-      <w:r>
-        <w:t>log --</w:t>
+        <w:t>Verbatim ASCII commit history exported using 'git log --</w:t>
       </w:r>
       <w:proofErr w:type="spellStart"/>
       <w:r>
         <w:t>oneline</w:t>
       </w:r>
       <w:proofErr w:type="spellEnd"/>
-      <w:proofErr w:type="gramEnd"/>
       <w:r>
-        <w:t xml:space="preserve"> --graph --all &gt; git_log_proof.txt'. This demonstrates the complete sequential feature branching and </w:t>
-      </w:r>
-      <w:proofErr w:type="gramStart"/>
-      <w:r>
-        <w:t>merge</w:t>
-      </w:r>
-      <w:proofErr w:type="gramEnd"/>
-      <w:r>
-        <w:t xml:space="preserve"> timeline across all three developers.</w:t>
+        <w:t xml:space="preserve"> --graph --all &gt; git_log_proof.txt'. This demonstrates the complete sequential feature branching and merge timeline across all three developers.</w:t>
       </w:r>
     </w:p>
     <w:tbl>
@@ -3855,6 +3897,7 @@
   <w:style w:type="character" w:default="1" w:styleId="DefaultParagraphFont">
     <w:name w:val="Default Paragraph Font"/>
     <w:uiPriority w:val="1"/>
+    <w:semiHidden/>
     <w:unhideWhenUsed/>
   </w:style>
   <w:style w:type="table" w:default="1" w:styleId="TableNormal">

</xml_diff>

<commit_message>
docs(PDF): Initial update on commit SHA in section 5
</commit_message>
<xml_diff>
--- a/CCCS106_Lab01_Report_Barandon_Borja_Musa.docx
+++ b/CCCS106_Lab01_Report_Barandon_Borja_Musa.docx
@@ -153,23 +153,7 @@
                 <w:color w:val="0F172A"/>
                 <w:sz w:val="19"/>
               </w:rPr>
-              <w:t xml:space="preserve">Group No. [ </w:t>
-            </w:r>
-            <w:proofErr w:type="gramStart"/>
-            <w:r>
-              <w:rPr>
-                <w:color w:val="0F172A"/>
-                <w:sz w:val="19"/>
-              </w:rPr>
-              <w:t>2 ]</w:t>
-            </w:r>
-            <w:proofErr w:type="gramEnd"/>
-            <w:r>
-              <w:rPr>
-                <w:color w:val="0F172A"/>
-                <w:sz w:val="19"/>
-              </w:rPr>
-              <w:t xml:space="preserve">  (Ni-Git)</w:t>
+              <w:t>Group No. [ 2 ]  (Ni-Git)</w:t>
             </w:r>
           </w:p>
         </w:tc>
@@ -236,17 +220,8 @@
                 <w:color w:val="0F172A"/>
                 <w:sz w:val="19"/>
               </w:rPr>
-              <w:t xml:space="preserve">, </w:t>
+              <w:t>, 2026 ]</w:t>
             </w:r>
-            <w:proofErr w:type="gramStart"/>
-            <w:r>
-              <w:rPr>
-                <w:color w:val="0F172A"/>
-                <w:sz w:val="19"/>
-              </w:rPr>
-              <w:t>2026 ]</w:t>
-            </w:r>
-            <w:proofErr w:type="gramEnd"/>
           </w:p>
         </w:tc>
       </w:tr>
@@ -468,17 +443,8 @@
                 <w:b/>
                 <w:sz w:val="18"/>
               </w:rPr>
-              <w:t xml:space="preserve">[ Borja, Edmar </w:t>
+              <w:t>[ Borja, Edmar B. ]</w:t>
             </w:r>
-            <w:proofErr w:type="gramStart"/>
-            <w:r>
-              <w:rPr>
-                <w:b/>
-                <w:sz w:val="18"/>
-              </w:rPr>
-              <w:t>B. ]</w:t>
-            </w:r>
-            <w:proofErr w:type="gramEnd"/>
           </w:p>
         </w:tc>
         <w:tc>
@@ -582,23 +548,7 @@
                 <w:b/>
                 <w:sz w:val="18"/>
               </w:rPr>
-              <w:t xml:space="preserve">[ Barandon, </w:t>
-            </w:r>
-            <w:proofErr w:type="spellStart"/>
-            <w:r>
-              <w:rPr>
-                <w:b/>
-                <w:sz w:val="18"/>
-              </w:rPr>
-              <w:t>Noelee</w:t>
-            </w:r>
-            <w:proofErr w:type="spellEnd"/>
-            <w:r>
-              <w:rPr>
-                <w:b/>
-                <w:sz w:val="18"/>
-              </w:rPr>
-              <w:t xml:space="preserve"> Anthony S.]</w:t>
+              <w:t>[ Barandon, Noelee Anthony S.]</w:t>
             </w:r>
           </w:p>
         </w:tc>
@@ -703,17 +653,8 @@
                 <w:b/>
                 <w:sz w:val="18"/>
               </w:rPr>
-              <w:t xml:space="preserve">[ Musa, Eduardo Gabriel </w:t>
+              <w:t>[ Musa, Eduardo Gabriel S. ]</w:t>
             </w:r>
-            <w:proofErr w:type="gramStart"/>
-            <w:r>
-              <w:rPr>
-                <w:b/>
-                <w:sz w:val="18"/>
-              </w:rPr>
-              <w:t>S. ]</w:t>
-            </w:r>
-            <w:proofErr w:type="gramEnd"/>
           </w:p>
         </w:tc>
         <w:tc>
@@ -993,36 +934,7 @@
         <w:jc w:val="both"/>
       </w:pPr>
       <w:r>
-        <w:t>Pre-flight workstation audit executed via 'python verify_setup.py' inside the active virtual environment (.</w:t>
-      </w:r>
-      <w:proofErr w:type="spellStart"/>
-      <w:r>
-        <w:t>venv</w:t>
-      </w:r>
-      <w:proofErr w:type="spellEnd"/>
-      <w:r>
-        <w:t xml:space="preserve">). All six (6) audit checks must report [PASS] verifying Python 3.10+, </w:t>
-      </w:r>
-      <w:proofErr w:type="spellStart"/>
-      <w:r>
-        <w:t>virtualenv</w:t>
-      </w:r>
-      <w:proofErr w:type="spellEnd"/>
-      <w:r>
-        <w:t xml:space="preserve"> isolation, Flet SDK v0.86.5+, Git binary detection, configured institutional user identity, </w:t>
-      </w:r>
-      <w:proofErr w:type="gramStart"/>
-      <w:r>
-        <w:t>and .</w:t>
-      </w:r>
-      <w:proofErr w:type="spellStart"/>
-      <w:r>
-        <w:t>gitignore</w:t>
-      </w:r>
-      <w:proofErr w:type="spellEnd"/>
-      <w:proofErr w:type="gramEnd"/>
-      <w:r>
-        <w:t xml:space="preserve"> hygiene.</w:t>
+        <w:t>Pre-flight workstation audit executed via 'python verify_setup.py' inside the active virtual environment (.venv). All six (6) audit checks must report [PASS] verifying Python 3.10+, virtualenv isolation, Flet SDK v0.86.5+, Git binary detection, configured institutional user identity, and .gitignore hygiene.</w:t>
       </w:r>
     </w:p>
     <w:tbl>
@@ -1127,20 +1039,7 @@
         <w:jc w:val="both"/>
       </w:pPr>
       <w:r>
-        <w:t xml:space="preserve">Section 3: Git Working Tree Cleanliness </w:t>
-      </w:r>
-      <w:proofErr w:type="gramStart"/>
-      <w:r>
-        <w:t>&amp; .</w:t>
-      </w:r>
-      <w:proofErr w:type="spellStart"/>
-      <w:r>
-        <w:t>gitignore</w:t>
-      </w:r>
-      <w:proofErr w:type="spellEnd"/>
-      <w:proofErr w:type="gramEnd"/>
-      <w:r>
-        <w:t xml:space="preserve"> Audit</w:t>
+        <w:t>Section 3: Git Working Tree Cleanliness &amp; .gitignore Audit</w:t>
       </w:r>
     </w:p>
     <w:p>
@@ -1149,28 +1048,7 @@
         <w:jc w:val="both"/>
       </w:pPr>
       <w:r>
-        <w:t xml:space="preserve">Demonstration of repository hygiene. The screenshot proves that the working tree is clean with zero uncommitted changes, and </w:t>
-      </w:r>
-      <w:proofErr w:type="gramStart"/>
-      <w:r>
-        <w:t>that .</w:t>
-      </w:r>
-      <w:proofErr w:type="spellStart"/>
-      <w:r>
-        <w:t>venv</w:t>
-      </w:r>
-      <w:proofErr w:type="spellEnd"/>
-      <w:proofErr w:type="gramEnd"/>
-      <w:r>
-        <w:t>/ is completely untracked (verified by running 'git ls-files .</w:t>
-      </w:r>
-      <w:proofErr w:type="spellStart"/>
-      <w:r>
-        <w:t>venv</w:t>
-      </w:r>
-      <w:proofErr w:type="spellEnd"/>
-      <w:r>
-        <w:t>', returning empty output).</w:t>
+        <w:t>Demonstration of repository hygiene. The screenshot proves that the working tree is clean with zero uncommitted changes, and that .venv/ is completely untracked (verified by running 'git ls-files .venv', returning empty output).</w:t>
       </w:r>
     </w:p>
     <w:tbl>
@@ -1265,32 +1143,7 @@
           <w:b/>
           <w:sz w:val="19"/>
         </w:rPr>
-        <w:t xml:space="preserve">Figure 3: Git Working Tree Cleanliness </w:t>
-      </w:r>
-      <w:proofErr w:type="gramStart"/>
-      <w:r>
-        <w:rPr>
-          <w:b/>
-          <w:sz w:val="19"/>
-        </w:rPr>
-        <w:t>&amp; .</w:t>
-      </w:r>
-      <w:proofErr w:type="spellStart"/>
-      <w:r>
-        <w:rPr>
-          <w:b/>
-          <w:sz w:val="19"/>
-        </w:rPr>
-        <w:t>gitignore</w:t>
-      </w:r>
-      <w:proofErr w:type="spellEnd"/>
-      <w:proofErr w:type="gramEnd"/>
-      <w:r>
-        <w:rPr>
-          <w:b/>
-          <w:sz w:val="19"/>
-        </w:rPr>
-        <w:t xml:space="preserve"> Hygiene Proof</w:t>
+        <w:t>Figure 3: Git Working Tree Cleanliness &amp; .gitignore Hygiene Proof</w:t>
       </w:r>
     </w:p>
     <w:p>
@@ -1807,17 +1660,8 @@
                 <w:b/>
                 <w:sz w:val="17"/>
               </w:rPr>
-              <w:t xml:space="preserve">[ Borja, Edmar </w:t>
+              <w:t>[ Borja, Edmar B. ]</w:t>
             </w:r>
-            <w:proofErr w:type="gramStart"/>
-            <w:r>
-              <w:rPr>
-                <w:b/>
-                <w:sz w:val="17"/>
-              </w:rPr>
-              <w:t>B. ]</w:t>
-            </w:r>
-            <w:proofErr w:type="gramEnd"/>
           </w:p>
         </w:tc>
         <w:tc>
@@ -1937,7 +1781,113 @@
               <w:rPr>
                 <w:sz w:val="17"/>
               </w:rPr>
-              <w:t>ed90fe8]</w:t>
+              <w:t>ed90fe8</w:t>
+            </w:r>
+            <w:r>
+              <w:rPr>
+                <w:sz w:val="17"/>
+              </w:rPr>
+              <w:t>,</w:t>
+            </w:r>
+          </w:p>
+          <w:p>
+            <w:pPr>
+              <w:spacing w:after="0"/>
+              <w:rPr>
+                <w:sz w:val="17"/>
+              </w:rPr>
+            </w:pPr>
+            <w:r>
+              <w:rPr>
+                <w:sz w:val="17"/>
+              </w:rPr>
+              <w:t>22160dc</w:t>
+            </w:r>
+            <w:r>
+              <w:rPr>
+                <w:sz w:val="17"/>
+              </w:rPr>
+              <w:t>,</w:t>
+            </w:r>
+          </w:p>
+          <w:p>
+            <w:pPr>
+              <w:spacing w:after="0"/>
+              <w:rPr>
+                <w:sz w:val="17"/>
+              </w:rPr>
+            </w:pPr>
+            <w:r>
+              <w:rPr>
+                <w:sz w:val="17"/>
+              </w:rPr>
+              <w:t>8fd02b</w:t>
+            </w:r>
+            <w:r>
+              <w:rPr>
+                <w:sz w:val="17"/>
+              </w:rPr>
+              <w:t>c,</w:t>
+            </w:r>
+          </w:p>
+          <w:p>
+            <w:pPr>
+              <w:spacing w:after="0"/>
+              <w:rPr>
+                <w:sz w:val="17"/>
+              </w:rPr>
+            </w:pPr>
+            <w:r>
+              <w:rPr>
+                <w:sz w:val="17"/>
+              </w:rPr>
+              <w:t>1b7062a</w:t>
+            </w:r>
+            <w:r>
+              <w:rPr>
+                <w:sz w:val="17"/>
+              </w:rPr>
+              <w:t>,</w:t>
+            </w:r>
+          </w:p>
+          <w:p>
+            <w:pPr>
+              <w:spacing w:after="0"/>
+              <w:rPr>
+                <w:sz w:val="17"/>
+              </w:rPr>
+            </w:pPr>
+            <w:r>
+              <w:rPr>
+                <w:sz w:val="17"/>
+              </w:rPr>
+              <w:t>61d7554</w:t>
+            </w:r>
+            <w:r>
+              <w:rPr>
+                <w:sz w:val="17"/>
+              </w:rPr>
+              <w:t>,</w:t>
+            </w:r>
+          </w:p>
+          <w:p>
+            <w:pPr>
+              <w:spacing w:after="0"/>
+              <w:rPr>
+                <w:sz w:val="17"/>
+              </w:rPr>
+            </w:pPr>
+            <w:r>
+              <w:rPr>
+                <w:sz w:val="17"/>
+              </w:rPr>
+              <w:t>e8d6880</w:t>
+            </w:r>
+            <w:r>
+              <w:rPr>
+                <w:sz w:val="17"/>
+              </w:rPr>
+              <w:t>]</w:t>
             </w:r>
           </w:p>
         </w:tc>
@@ -1961,29 +1911,7 @@
               <w:rPr>
                 <w:sz w:val="17"/>
               </w:rPr>
-              <w:t xml:space="preserve">Initialized repo, </w:t>
-            </w:r>
-            <w:proofErr w:type="gramStart"/>
-            <w:r>
-              <w:rPr>
-                <w:sz w:val="17"/>
-              </w:rPr>
-              <w:t>setup .</w:t>
-            </w:r>
-            <w:proofErr w:type="spellStart"/>
-            <w:r>
-              <w:rPr>
-                <w:sz w:val="17"/>
-              </w:rPr>
-              <w:t>gitignore</w:t>
-            </w:r>
-            <w:proofErr w:type="spellEnd"/>
-            <w:proofErr w:type="gramEnd"/>
-            <w:r>
-              <w:rPr>
-                <w:sz w:val="17"/>
-              </w:rPr>
-              <w:t>, integrated card 1, configured remote repo &amp; pushed main, dev-1 profile update.</w:t>
+              <w:t>Initialized repo, setup .gitignore, integrated card 1, configured remote repo &amp; pushed main, dev-1 profile update.</w:t>
             </w:r>
           </w:p>
         </w:tc>
@@ -2012,23 +1940,7 @@
                 <w:b/>
                 <w:sz w:val="17"/>
               </w:rPr>
-              <w:t xml:space="preserve">[ Barandon, </w:t>
-            </w:r>
-            <w:proofErr w:type="spellStart"/>
-            <w:r>
-              <w:rPr>
-                <w:b/>
-                <w:sz w:val="17"/>
-              </w:rPr>
-              <w:t>Noelee</w:t>
-            </w:r>
-            <w:proofErr w:type="spellEnd"/>
-            <w:r>
-              <w:rPr>
-                <w:b/>
-                <w:sz w:val="17"/>
-              </w:rPr>
-              <w:t xml:space="preserve"> Anthony S.]</w:t>
+              <w:t>[ Barandon, Noelee Anthony S.]</w:t>
             </w:r>
           </w:p>
         </w:tc>
@@ -2099,12 +2011,198 @@
           <w:p>
             <w:pPr>
               <w:spacing w:after="0"/>
+              <w:rPr>
+                <w:sz w:val="17"/>
+              </w:rPr>
             </w:pPr>
             <w:r>
               <w:rPr>
                 <w:sz w:val="17"/>
               </w:rPr>
-              <w:t>[8a11075]</w:t>
+              <w:t>[8a11075</w:t>
+            </w:r>
+            <w:r>
+              <w:rPr>
+                <w:sz w:val="17"/>
+              </w:rPr>
+              <w:t>,</w:t>
+            </w:r>
+          </w:p>
+          <w:p>
+            <w:pPr>
+              <w:spacing w:after="0"/>
+              <w:rPr>
+                <w:sz w:val="17"/>
+              </w:rPr>
+            </w:pPr>
+            <w:r>
+              <w:rPr>
+                <w:sz w:val="17"/>
+              </w:rPr>
+              <w:t>12d6e12</w:t>
+            </w:r>
+            <w:r>
+              <w:rPr>
+                <w:sz w:val="17"/>
+              </w:rPr>
+              <w:t>,</w:t>
+            </w:r>
+          </w:p>
+          <w:p>
+            <w:pPr>
+              <w:spacing w:after="0"/>
+              <w:rPr>
+                <w:sz w:val="17"/>
+              </w:rPr>
+            </w:pPr>
+            <w:r>
+              <w:rPr>
+                <w:sz w:val="17"/>
+              </w:rPr>
+              <w:t>6436231</w:t>
+            </w:r>
+            <w:r>
+              <w:rPr>
+                <w:sz w:val="17"/>
+              </w:rPr>
+              <w:t>,</w:t>
+            </w:r>
+          </w:p>
+          <w:p>
+            <w:pPr>
+              <w:spacing w:after="0"/>
+              <w:rPr>
+                <w:sz w:val="17"/>
+              </w:rPr>
+            </w:pPr>
+            <w:r>
+              <w:rPr>
+                <w:sz w:val="17"/>
+              </w:rPr>
+              <w:t>873a2b1</w:t>
+            </w:r>
+            <w:r>
+              <w:rPr>
+                <w:sz w:val="17"/>
+              </w:rPr>
+              <w:t>,</w:t>
+            </w:r>
+          </w:p>
+          <w:p>
+            <w:pPr>
+              <w:spacing w:after="0"/>
+              <w:rPr>
+                <w:sz w:val="17"/>
+              </w:rPr>
+            </w:pPr>
+            <w:r>
+              <w:rPr>
+                <w:sz w:val="17"/>
+              </w:rPr>
+              <w:t>53a5377</w:t>
+            </w:r>
+            <w:r>
+              <w:rPr>
+                <w:sz w:val="17"/>
+              </w:rPr>
+              <w:t>,</w:t>
+            </w:r>
+          </w:p>
+          <w:p>
+            <w:pPr>
+              <w:spacing w:after="0"/>
+              <w:rPr>
+                <w:sz w:val="17"/>
+              </w:rPr>
+            </w:pPr>
+            <w:r>
+              <w:rPr>
+                <w:sz w:val="17"/>
+              </w:rPr>
+              <w:t>bfea81c</w:t>
+            </w:r>
+            <w:r>
+              <w:rPr>
+                <w:sz w:val="17"/>
+              </w:rPr>
+              <w:t>,</w:t>
+            </w:r>
+          </w:p>
+          <w:p>
+            <w:pPr>
+              <w:spacing w:after="0"/>
+              <w:rPr>
+                <w:sz w:val="17"/>
+              </w:rPr>
+            </w:pPr>
+            <w:r>
+              <w:rPr>
+                <w:sz w:val="17"/>
+              </w:rPr>
+              <w:t>2366542</w:t>
+            </w:r>
+            <w:r>
+              <w:rPr>
+                <w:sz w:val="17"/>
+              </w:rPr>
+              <w:t>,</w:t>
+            </w:r>
+          </w:p>
+          <w:p>
+            <w:pPr>
+              <w:spacing w:after="0"/>
+              <w:rPr>
+                <w:sz w:val="17"/>
+              </w:rPr>
+            </w:pPr>
+            <w:r>
+              <w:rPr>
+                <w:sz w:val="17"/>
+              </w:rPr>
+              <w:t>edaa510</w:t>
+            </w:r>
+            <w:r>
+              <w:rPr>
+                <w:sz w:val="17"/>
+              </w:rPr>
+              <w:t>,</w:t>
+            </w:r>
+          </w:p>
+          <w:p>
+            <w:pPr>
+              <w:spacing w:after="0"/>
+              <w:rPr>
+                <w:sz w:val="17"/>
+              </w:rPr>
+            </w:pPr>
+            <w:r>
+              <w:rPr>
+                <w:sz w:val="17"/>
+              </w:rPr>
+              <w:t>3f378e8</w:t>
+            </w:r>
+            <w:r>
+              <w:rPr>
+                <w:sz w:val="17"/>
+              </w:rPr>
+              <w:t>,</w:t>
+            </w:r>
+          </w:p>
+          <w:p>
+            <w:pPr>
+              <w:spacing w:after="0"/>
+            </w:pPr>
+            <w:r>
+              <w:rPr>
+                <w:sz w:val="17"/>
+              </w:rPr>
+              <w:t>3981b93</w:t>
+            </w:r>
+            <w:r>
+              <w:rPr>
+                <w:sz w:val="17"/>
+              </w:rPr>
+              <w:t>]</w:t>
             </w:r>
           </w:p>
         </w:tc>
@@ -2157,17 +2255,8 @@
                 <w:b/>
                 <w:sz w:val="17"/>
               </w:rPr>
-              <w:t xml:space="preserve">[ Musa, Eduardo Gabriel </w:t>
+              <w:t>[ Musa, Eduardo Gabriel S. ]</w:t>
             </w:r>
-            <w:proofErr w:type="gramStart"/>
-            <w:r>
-              <w:rPr>
-                <w:b/>
-                <w:sz w:val="17"/>
-              </w:rPr>
-              <w:t>S. ]</w:t>
-            </w:r>
-            <w:proofErr w:type="gramEnd"/>
           </w:p>
         </w:tc>
         <w:tc>
@@ -2215,14 +2304,12 @@
             <w:pPr>
               <w:spacing w:after="0"/>
             </w:pPr>
-            <w:proofErr w:type="spellStart"/>
             <w:r>
               <w:rPr>
                 <w:sz w:val="17"/>
               </w:rPr>
               <w:t>mymitz</w:t>
             </w:r>
-            <w:proofErr w:type="spellEnd"/>
           </w:p>
         </w:tc>
         <w:tc>
@@ -2267,12 +2354,232 @@
           <w:p>
             <w:pPr>
               <w:spacing w:after="0"/>
+              <w:rPr>
+                <w:sz w:val="17"/>
+              </w:rPr>
             </w:pPr>
             <w:r>
               <w:rPr>
                 <w:sz w:val="17"/>
               </w:rPr>
-              <w:t>5f1dcee]</w:t>
+              <w:t>5f1dcee</w:t>
+            </w:r>
+            <w:r>
+              <w:rPr>
+                <w:sz w:val="17"/>
+              </w:rPr>
+              <w:t>,</w:t>
+            </w:r>
+          </w:p>
+          <w:p>
+            <w:pPr>
+              <w:spacing w:after="0"/>
+              <w:rPr>
+                <w:sz w:val="17"/>
+              </w:rPr>
+            </w:pPr>
+            <w:r>
+              <w:rPr>
+                <w:sz w:val="17"/>
+              </w:rPr>
+              <w:t>1e38b80</w:t>
+            </w:r>
+            <w:r>
+              <w:rPr>
+                <w:sz w:val="17"/>
+              </w:rPr>
+              <w:t>,</w:t>
+            </w:r>
+          </w:p>
+          <w:p>
+            <w:pPr>
+              <w:spacing w:after="0"/>
+              <w:rPr>
+                <w:sz w:val="17"/>
+              </w:rPr>
+            </w:pPr>
+            <w:r>
+              <w:rPr>
+                <w:sz w:val="17"/>
+              </w:rPr>
+              <w:t>6ce1b08</w:t>
+            </w:r>
+            <w:r>
+              <w:rPr>
+                <w:sz w:val="17"/>
+              </w:rPr>
+              <w:t>,</w:t>
+            </w:r>
+          </w:p>
+          <w:p>
+            <w:pPr>
+              <w:spacing w:after="0"/>
+              <w:rPr>
+                <w:sz w:val="17"/>
+              </w:rPr>
+            </w:pPr>
+            <w:r>
+              <w:rPr>
+                <w:sz w:val="17"/>
+              </w:rPr>
+              <w:t>132d036</w:t>
+            </w:r>
+            <w:r>
+              <w:rPr>
+                <w:sz w:val="17"/>
+              </w:rPr>
+              <w:t>,</w:t>
+            </w:r>
+          </w:p>
+          <w:p>
+            <w:pPr>
+              <w:spacing w:after="0"/>
+              <w:rPr>
+                <w:sz w:val="17"/>
+              </w:rPr>
+            </w:pPr>
+            <w:r>
+              <w:rPr>
+                <w:sz w:val="17"/>
+              </w:rPr>
+              <w:t>d242a8f</w:t>
+            </w:r>
+            <w:r>
+              <w:rPr>
+                <w:sz w:val="17"/>
+              </w:rPr>
+              <w:t>,</w:t>
+            </w:r>
+          </w:p>
+          <w:p>
+            <w:pPr>
+              <w:spacing w:after="0"/>
+              <w:rPr>
+                <w:sz w:val="17"/>
+              </w:rPr>
+            </w:pPr>
+            <w:r>
+              <w:rPr>
+                <w:sz w:val="17"/>
+              </w:rPr>
+              <w:t>f6b9514</w:t>
+            </w:r>
+            <w:r>
+              <w:rPr>
+                <w:sz w:val="17"/>
+              </w:rPr>
+              <w:t>,</w:t>
+            </w:r>
+          </w:p>
+          <w:p>
+            <w:pPr>
+              <w:spacing w:after="0"/>
+              <w:rPr>
+                <w:sz w:val="17"/>
+              </w:rPr>
+            </w:pPr>
+            <w:r>
+              <w:rPr>
+                <w:sz w:val="17"/>
+              </w:rPr>
+              <w:t>69514ff</w:t>
+            </w:r>
+            <w:r>
+              <w:rPr>
+                <w:sz w:val="17"/>
+              </w:rPr>
+              <w:t>,</w:t>
+            </w:r>
+          </w:p>
+          <w:p>
+            <w:pPr>
+              <w:spacing w:after="0"/>
+              <w:rPr>
+                <w:sz w:val="17"/>
+              </w:rPr>
+            </w:pPr>
+            <w:r>
+              <w:rPr>
+                <w:sz w:val="17"/>
+              </w:rPr>
+              <w:t>b1f74fe</w:t>
+            </w:r>
+            <w:r>
+              <w:rPr>
+                <w:sz w:val="17"/>
+              </w:rPr>
+              <w:t>,</w:t>
+            </w:r>
+          </w:p>
+          <w:p>
+            <w:pPr>
+              <w:spacing w:after="0"/>
+              <w:rPr>
+                <w:sz w:val="17"/>
+              </w:rPr>
+            </w:pPr>
+            <w:r>
+              <w:rPr>
+                <w:sz w:val="17"/>
+              </w:rPr>
+              <w:t>496ecb8</w:t>
+            </w:r>
+            <w:r>
+              <w:rPr>
+                <w:sz w:val="17"/>
+              </w:rPr>
+              <w:t>,</w:t>
+            </w:r>
+          </w:p>
+          <w:p>
+            <w:pPr>
+              <w:spacing w:after="0"/>
+              <w:rPr>
+                <w:sz w:val="17"/>
+              </w:rPr>
+            </w:pPr>
+            <w:r>
+              <w:rPr>
+                <w:sz w:val="17"/>
+              </w:rPr>
+              <w:t>12111ff</w:t>
+            </w:r>
+            <w:r>
+              <w:rPr>
+                <w:sz w:val="17"/>
+              </w:rPr>
+              <w:t>,</w:t>
+            </w:r>
+          </w:p>
+          <w:p>
+            <w:pPr>
+              <w:spacing w:after="0"/>
+              <w:rPr>
+                <w:sz w:val="17"/>
+              </w:rPr>
+            </w:pPr>
+            <w:r>
+              <w:rPr>
+                <w:sz w:val="17"/>
+              </w:rPr>
+              <w:t>9989885</w:t>
+            </w:r>
+            <w:r>
+              <w:rPr>
+                <w:sz w:val="17"/>
+              </w:rPr>
+              <w:t>,</w:t>
+            </w:r>
+          </w:p>
+          <w:p>
+            <w:pPr>
+              <w:spacing w:after="0"/>
+            </w:pPr>
+            <w:r>
+              <w:rPr>
+                <w:sz w:val="17"/>
+              </w:rPr>
+              <w:t>]</w:t>
             </w:r>
           </w:p>
         </w:tc>
@@ -2343,7 +2650,16 @@
           <w:color w:val="64748B"/>
           <w:sz w:val="19"/>
         </w:rPr>
-        <w:t>I learned that virtual environments help keep projects isolated and prevent conflicts between dependencies. I also learned that configuration rules keep the project organized and make sure everyone follows the same setup. For GitHub, I learned how to properly coordinate repository invitations and give the right access to team members. Overall, clear setup and communication make teamwork easier and more efficient.</w:t>
+        <w:t xml:space="preserve">I learned that virtual environments help keep projects isolated and prevent conflicts between dependencies. I also learned that configuration rules keep the project organized and make sure everyone follows </w:t>
+      </w:r>
+      <w:r>
+        <w:rPr>
+          <w:i/>
+          <w:color w:val="64748B"/>
+          <w:sz w:val="19"/>
+        </w:rPr>
+        <w:lastRenderedPageBreak/>
+        <w:t>the same setup. For GitHub, I learned how to properly coordinate repository invitations and give the right access to team members. Overall, clear setup and communication make teamwork easier and more efficient.</w:t>
       </w:r>
     </w:p>
     <w:p>
@@ -2430,35 +2746,7 @@
           <w:color w:val="64748B"/>
           <w:sz w:val="19"/>
         </w:rPr>
-        <w:t xml:space="preserve">. How to </w:t>
-      </w:r>
-      <w:proofErr w:type="gramStart"/>
-      <w:r>
-        <w:rPr>
-          <w:i/>
-          <w:color w:val="64748B"/>
-          <w:sz w:val="19"/>
-        </w:rPr>
-        <w:t>update .</w:t>
-      </w:r>
-      <w:proofErr w:type="spellStart"/>
-      <w:r>
-        <w:rPr>
-          <w:i/>
-          <w:color w:val="64748B"/>
-          <w:sz w:val="19"/>
-        </w:rPr>
-        <w:t>gitignore</w:t>
-      </w:r>
-      <w:proofErr w:type="spellEnd"/>
-      <w:proofErr w:type="gramEnd"/>
-      <w:r>
-        <w:rPr>
-          <w:i/>
-          <w:color w:val="64748B"/>
-          <w:sz w:val="19"/>
-        </w:rPr>
-        <w:t>, commit properly</w:t>
+        <w:t>. How to update .gitignore, commit properly</w:t>
       </w:r>
       <w:r>
         <w:rPr>
@@ -2466,25 +2754,7 @@
           <w:color w:val="64748B"/>
           <w:sz w:val="19"/>
         </w:rPr>
-        <w:t xml:space="preserve">, and push to the </w:t>
-      </w:r>
-      <w:proofErr w:type="spellStart"/>
-      <w:r>
-        <w:rPr>
-          <w:i/>
-          <w:color w:val="64748B"/>
-          <w:sz w:val="19"/>
-        </w:rPr>
-        <w:t>Github</w:t>
-      </w:r>
-      <w:proofErr w:type="spellEnd"/>
-      <w:r>
-        <w:rPr>
-          <w:i/>
-          <w:color w:val="64748B"/>
-          <w:sz w:val="19"/>
-        </w:rPr>
-        <w:t xml:space="preserve"> repository. </w:t>
+        <w:t xml:space="preserve">, and push to the Github repository. </w:t>
       </w:r>
       <w:r>
         <w:rPr>
@@ -2492,25 +2762,7 @@
           <w:color w:val="64748B"/>
           <w:sz w:val="19"/>
         </w:rPr>
-        <w:t xml:space="preserve">I also learn about the naming conventions for committing to </w:t>
-      </w:r>
-      <w:proofErr w:type="spellStart"/>
-      <w:r>
-        <w:rPr>
-          <w:i/>
-          <w:color w:val="64748B"/>
-          <w:sz w:val="19"/>
-        </w:rPr>
-        <w:t>Github</w:t>
-      </w:r>
-      <w:proofErr w:type="spellEnd"/>
-      <w:r>
-        <w:rPr>
-          <w:i/>
-          <w:color w:val="64748B"/>
-          <w:sz w:val="19"/>
-        </w:rPr>
-        <w:t xml:space="preserve">, I also learn about the workflow in a dev team. I have gained knowledge on what it is mean to become a QA, and how to ensure </w:t>
+        <w:t xml:space="preserve">I also learn about the naming conventions for committing to Github, I also learn about the workflow in a dev team. I have gained knowledge on what it is mean to become a QA, and how to ensure </w:t>
       </w:r>
       <w:r>
         <w:rPr>
@@ -2526,25 +2778,7 @@
           <w:color w:val="64748B"/>
           <w:sz w:val="19"/>
         </w:rPr>
-        <w:t xml:space="preserve">that is related to </w:t>
-      </w:r>
-      <w:proofErr w:type="spellStart"/>
-      <w:r>
-        <w:rPr>
-          <w:i/>
-          <w:color w:val="64748B"/>
-          <w:sz w:val="19"/>
-        </w:rPr>
-        <w:t>Github</w:t>
-      </w:r>
-      <w:proofErr w:type="spellEnd"/>
-      <w:r>
-        <w:rPr>
-          <w:i/>
-          <w:color w:val="64748B"/>
-          <w:sz w:val="19"/>
-        </w:rPr>
-        <w:t xml:space="preserve"> and the workflow procedure of </w:t>
+        <w:t xml:space="preserve">that is related to Github and the workflow procedure of </w:t>
       </w:r>
       <w:r>
         <w:rPr>
@@ -2575,15 +2809,7 @@
     </w:p>
     <w:p>
       <w:r>
-        <w:t>Verbatim ASCII commit history exported using 'git log --</w:t>
-      </w:r>
-      <w:proofErr w:type="spellStart"/>
-      <w:r>
-        <w:t>oneline</w:t>
-      </w:r>
-      <w:proofErr w:type="spellEnd"/>
-      <w:r>
-        <w:t xml:space="preserve"> --graph --all &gt; git_log_proof.txt'. This demonstrates the complete sequential feature branching and merge timeline across all three developers.</w:t>
+        <w:t>Verbatim ASCII commit history exported using 'git log --oneline --graph --all &gt; git_log_proof.txt'. This demonstrates the complete sequential feature branching and merge timeline across all three developers.</w:t>
       </w:r>
     </w:p>
     <w:tbl>
@@ -2626,25 +2852,7 @@
                 <w:color w:val="E2E8F0"/>
                 <w:sz w:val="17"/>
               </w:rPr>
-              <w:t>*   d242a8f Merge branch '</w:t>
-            </w:r>
-            <w:proofErr w:type="spellStart"/>
-            <w:r>
-              <w:rPr>
-                <w:rFonts w:ascii="Courier New" w:hAnsi="Courier New"/>
-                <w:color w:val="E2E8F0"/>
-                <w:sz w:val="17"/>
-              </w:rPr>
-              <w:t>mymitz</w:t>
-            </w:r>
-            <w:proofErr w:type="spellEnd"/>
-            <w:r>
-              <w:rPr>
-                <w:rFonts w:ascii="Courier New" w:hAnsi="Courier New"/>
-                <w:color w:val="E2E8F0"/>
-                <w:sz w:val="17"/>
-              </w:rPr>
-              <w:t>' Update documents</w:t>
+              <w:t>*   d242a8f Merge branch 'mymitz' Update documents</w:t>
             </w:r>
           </w:p>
           <w:p>
@@ -2914,18 +3122,8 @@
                 <w:color w:val="E2E8F0"/>
                 <w:sz w:val="17"/>
               </w:rPr>
-              <w:t xml:space="preserve">* 8a11075 </w:t>
+              <w:t>* 8a11075 pfp</w:t>
             </w:r>
-            <w:proofErr w:type="spellStart"/>
-            <w:r>
-              <w:rPr>
-                <w:rFonts w:ascii="Courier New" w:hAnsi="Courier New"/>
-                <w:color w:val="E2E8F0"/>
-                <w:sz w:val="17"/>
-              </w:rPr>
-              <w:t>pfp</w:t>
-            </w:r>
-            <w:proofErr w:type="spellEnd"/>
           </w:p>
           <w:p>
             <w:pPr>
@@ -2960,25 +3158,7 @@
                 <w:color w:val="E2E8F0"/>
                 <w:sz w:val="17"/>
               </w:rPr>
-              <w:t>* 65b1dc5 Create Ni-</w:t>
-            </w:r>
-            <w:proofErr w:type="spellStart"/>
-            <w:r>
-              <w:rPr>
-                <w:rFonts w:ascii="Courier New" w:hAnsi="Courier New"/>
-                <w:color w:val="E2E8F0"/>
-                <w:sz w:val="17"/>
-              </w:rPr>
-              <w:t>Git.code</w:t>
-            </w:r>
-            <w:proofErr w:type="spellEnd"/>
-            <w:r>
-              <w:rPr>
-                <w:rFonts w:ascii="Courier New" w:hAnsi="Courier New"/>
-                <w:color w:val="E2E8F0"/>
-                <w:sz w:val="17"/>
-              </w:rPr>
-              <w:t>-workspace</w:t>
+              <w:t>* 65b1dc5 Create Ni-Git.code-workspace</w:t>
             </w:r>
           </w:p>
           <w:p>
@@ -2996,25 +3176,7 @@
                 <w:color w:val="E2E8F0"/>
                 <w:sz w:val="17"/>
               </w:rPr>
-              <w:t xml:space="preserve">* c0cf354 </w:t>
-            </w:r>
-            <w:proofErr w:type="gramStart"/>
-            <w:r>
-              <w:rPr>
-                <w:rFonts w:ascii="Courier New" w:hAnsi="Courier New"/>
-                <w:color w:val="E2E8F0"/>
-                <w:sz w:val="17"/>
-              </w:rPr>
-              <w:t>Small</w:t>
-            </w:r>
-            <w:proofErr w:type="gramEnd"/>
-            <w:r>
-              <w:rPr>
-                <w:rFonts w:ascii="Courier New" w:hAnsi="Courier New"/>
-                <w:color w:val="E2E8F0"/>
-                <w:sz w:val="17"/>
-              </w:rPr>
-              <w:t xml:space="preserve"> change and update of my profile, no major changes yet</w:t>
+              <w:t>* c0cf354 Small change and update of my profile, no major changes yet</w:t>
             </w:r>
           </w:p>
           <w:p>

</xml_diff>

<commit_message>
docs(PDF): Initial update for commit SHA in section 5
</commit_message>
<xml_diff>
--- a/CCCS106_Lab01_Report_Barandon_Borja_Musa.docx
+++ b/CCCS106_Lab01_Report_Barandon_Borja_Musa.docx
@@ -153,23 +153,7 @@
                 <w:color w:val="0F172A"/>
                 <w:sz w:val="19"/>
               </w:rPr>
-              <w:t xml:space="preserve">Group No. [ </w:t>
-            </w:r>
-            <w:proofErr w:type="gramStart"/>
-            <w:r>
-              <w:rPr>
-                <w:color w:val="0F172A"/>
-                <w:sz w:val="19"/>
-              </w:rPr>
-              <w:t>2 ]</w:t>
-            </w:r>
-            <w:proofErr w:type="gramEnd"/>
-            <w:r>
-              <w:rPr>
-                <w:color w:val="0F172A"/>
-                <w:sz w:val="19"/>
-              </w:rPr>
-              <w:t xml:space="preserve">  (Ni-Git)</w:t>
+              <w:t>Group No. [ 2 ]  (Ni-Git)</w:t>
             </w:r>
           </w:p>
         </w:tc>
@@ -236,17 +220,8 @@
                 <w:color w:val="0F172A"/>
                 <w:sz w:val="19"/>
               </w:rPr>
-              <w:t xml:space="preserve">, </w:t>
+              <w:t>, 2026 ]</w:t>
             </w:r>
-            <w:proofErr w:type="gramStart"/>
-            <w:r>
-              <w:rPr>
-                <w:color w:val="0F172A"/>
-                <w:sz w:val="19"/>
-              </w:rPr>
-              <w:t>2026 ]</w:t>
-            </w:r>
-            <w:proofErr w:type="gramEnd"/>
           </w:p>
         </w:tc>
       </w:tr>
@@ -468,17 +443,8 @@
                 <w:b/>
                 <w:sz w:val="18"/>
               </w:rPr>
-              <w:t xml:space="preserve">[ Borja, Edmar </w:t>
+              <w:t>[ Borja, Edmar B. ]</w:t>
             </w:r>
-            <w:proofErr w:type="gramStart"/>
-            <w:r>
-              <w:rPr>
-                <w:b/>
-                <w:sz w:val="18"/>
-              </w:rPr>
-              <w:t>B. ]</w:t>
-            </w:r>
-            <w:proofErr w:type="gramEnd"/>
           </w:p>
         </w:tc>
         <w:tc>
@@ -582,23 +548,7 @@
                 <w:b/>
                 <w:sz w:val="18"/>
               </w:rPr>
-              <w:t xml:space="preserve">[ Barandon, </w:t>
-            </w:r>
-            <w:proofErr w:type="spellStart"/>
-            <w:r>
-              <w:rPr>
-                <w:b/>
-                <w:sz w:val="18"/>
-              </w:rPr>
-              <w:t>Noelee</w:t>
-            </w:r>
-            <w:proofErr w:type="spellEnd"/>
-            <w:r>
-              <w:rPr>
-                <w:b/>
-                <w:sz w:val="18"/>
-              </w:rPr>
-              <w:t xml:space="preserve"> Anthony S.]</w:t>
+              <w:t>[ Barandon, Noelee Anthony S.]</w:t>
             </w:r>
           </w:p>
         </w:tc>
@@ -703,17 +653,8 @@
                 <w:b/>
                 <w:sz w:val="18"/>
               </w:rPr>
-              <w:t xml:space="preserve">[ Musa, Eduardo Gabriel </w:t>
+              <w:t>[ Musa, Eduardo Gabriel S. ]</w:t>
             </w:r>
-            <w:proofErr w:type="gramStart"/>
-            <w:r>
-              <w:rPr>
-                <w:b/>
-                <w:sz w:val="18"/>
-              </w:rPr>
-              <w:t>S. ]</w:t>
-            </w:r>
-            <w:proofErr w:type="gramEnd"/>
           </w:p>
         </w:tc>
         <w:tc>
@@ -993,36 +934,7 @@
         <w:jc w:val="both"/>
       </w:pPr>
       <w:r>
-        <w:t>Pre-flight workstation audit executed via 'python verify_setup.py' inside the active virtual environment (.</w:t>
-      </w:r>
-      <w:proofErr w:type="spellStart"/>
-      <w:r>
-        <w:t>venv</w:t>
-      </w:r>
-      <w:proofErr w:type="spellEnd"/>
-      <w:r>
-        <w:t xml:space="preserve">). All six (6) audit checks must report [PASS] verifying Python 3.10+, </w:t>
-      </w:r>
-      <w:proofErr w:type="spellStart"/>
-      <w:r>
-        <w:t>virtualenv</w:t>
-      </w:r>
-      <w:proofErr w:type="spellEnd"/>
-      <w:r>
-        <w:t xml:space="preserve"> isolation, Flet SDK v0.86.5+, Git binary detection, configured institutional user identity, </w:t>
-      </w:r>
-      <w:proofErr w:type="gramStart"/>
-      <w:r>
-        <w:t>and .</w:t>
-      </w:r>
-      <w:proofErr w:type="spellStart"/>
-      <w:r>
-        <w:t>gitignore</w:t>
-      </w:r>
-      <w:proofErr w:type="spellEnd"/>
-      <w:proofErr w:type="gramEnd"/>
-      <w:r>
-        <w:t xml:space="preserve"> hygiene.</w:t>
+        <w:t>Pre-flight workstation audit executed via 'python verify_setup.py' inside the active virtual environment (.venv). All six (6) audit checks must report [PASS] verifying Python 3.10+, virtualenv isolation, Flet SDK v0.86.5+, Git binary detection, configured institutional user identity, and .gitignore hygiene.</w:t>
       </w:r>
     </w:p>
     <w:tbl>
@@ -1127,20 +1039,7 @@
         <w:jc w:val="both"/>
       </w:pPr>
       <w:r>
-        <w:t xml:space="preserve">Section 3: Git Working Tree Cleanliness </w:t>
-      </w:r>
-      <w:proofErr w:type="gramStart"/>
-      <w:r>
-        <w:t>&amp; .</w:t>
-      </w:r>
-      <w:proofErr w:type="spellStart"/>
-      <w:r>
-        <w:t>gitignore</w:t>
-      </w:r>
-      <w:proofErr w:type="spellEnd"/>
-      <w:proofErr w:type="gramEnd"/>
-      <w:r>
-        <w:t xml:space="preserve"> Audit</w:t>
+        <w:t>Section 3: Git Working Tree Cleanliness &amp; .gitignore Audit</w:t>
       </w:r>
     </w:p>
     <w:p>
@@ -1149,28 +1048,7 @@
         <w:jc w:val="both"/>
       </w:pPr>
       <w:r>
-        <w:t xml:space="preserve">Demonstration of repository hygiene. The screenshot proves that the working tree is clean with zero uncommitted changes, and </w:t>
-      </w:r>
-      <w:proofErr w:type="gramStart"/>
-      <w:r>
-        <w:t>that .</w:t>
-      </w:r>
-      <w:proofErr w:type="spellStart"/>
-      <w:r>
-        <w:t>venv</w:t>
-      </w:r>
-      <w:proofErr w:type="spellEnd"/>
-      <w:proofErr w:type="gramEnd"/>
-      <w:r>
-        <w:t>/ is completely untracked (verified by running 'git ls-files .</w:t>
-      </w:r>
-      <w:proofErr w:type="spellStart"/>
-      <w:r>
-        <w:t>venv</w:t>
-      </w:r>
-      <w:proofErr w:type="spellEnd"/>
-      <w:r>
-        <w:t>', returning empty output).</w:t>
+        <w:t>Demonstration of repository hygiene. The screenshot proves that the working tree is clean with zero uncommitted changes, and that .venv/ is completely untracked (verified by running 'git ls-files .venv', returning empty output).</w:t>
       </w:r>
     </w:p>
     <w:tbl>
@@ -1265,32 +1143,7 @@
           <w:b/>
           <w:sz w:val="19"/>
         </w:rPr>
-        <w:t xml:space="preserve">Figure 3: Git Working Tree Cleanliness </w:t>
-      </w:r>
-      <w:proofErr w:type="gramStart"/>
-      <w:r>
-        <w:rPr>
-          <w:b/>
-          <w:sz w:val="19"/>
-        </w:rPr>
-        <w:t>&amp; .</w:t>
-      </w:r>
-      <w:proofErr w:type="spellStart"/>
-      <w:r>
-        <w:rPr>
-          <w:b/>
-          <w:sz w:val="19"/>
-        </w:rPr>
-        <w:t>gitignore</w:t>
-      </w:r>
-      <w:proofErr w:type="spellEnd"/>
-      <w:proofErr w:type="gramEnd"/>
-      <w:r>
-        <w:rPr>
-          <w:b/>
-          <w:sz w:val="19"/>
-        </w:rPr>
-        <w:t xml:space="preserve"> Hygiene Proof</w:t>
+        <w:t>Figure 3: Git Working Tree Cleanliness &amp; .gitignore Hygiene Proof</w:t>
       </w:r>
     </w:p>
     <w:p>
@@ -1807,17 +1660,8 @@
                 <w:b/>
                 <w:sz w:val="17"/>
               </w:rPr>
-              <w:t xml:space="preserve">[ Borja, Edmar </w:t>
+              <w:t>[ Borja, Edmar B. ]</w:t>
             </w:r>
-            <w:proofErr w:type="gramStart"/>
-            <w:r>
-              <w:rPr>
-                <w:b/>
-                <w:sz w:val="17"/>
-              </w:rPr>
-              <w:t>B. ]</w:t>
-            </w:r>
-            <w:proofErr w:type="gramEnd"/>
           </w:p>
         </w:tc>
         <w:tc>
@@ -1937,7 +1781,113 @@
               <w:rPr>
                 <w:sz w:val="17"/>
               </w:rPr>
-              <w:t>ed90fe8]</w:t>
+              <w:t>ed90fe8</w:t>
+            </w:r>
+            <w:r>
+              <w:rPr>
+                <w:sz w:val="17"/>
+              </w:rPr>
+              <w:t>,</w:t>
+            </w:r>
+          </w:p>
+          <w:p>
+            <w:pPr>
+              <w:spacing w:after="0"/>
+              <w:rPr>
+                <w:sz w:val="17"/>
+              </w:rPr>
+            </w:pPr>
+            <w:r>
+              <w:rPr>
+                <w:sz w:val="17"/>
+              </w:rPr>
+              <w:t>22160dc</w:t>
+            </w:r>
+            <w:r>
+              <w:rPr>
+                <w:sz w:val="17"/>
+              </w:rPr>
+              <w:t>,</w:t>
+            </w:r>
+          </w:p>
+          <w:p>
+            <w:pPr>
+              <w:spacing w:after="0"/>
+              <w:rPr>
+                <w:sz w:val="17"/>
+              </w:rPr>
+            </w:pPr>
+            <w:r>
+              <w:rPr>
+                <w:sz w:val="17"/>
+              </w:rPr>
+              <w:t>8fd02b</w:t>
+            </w:r>
+            <w:r>
+              <w:rPr>
+                <w:sz w:val="17"/>
+              </w:rPr>
+              <w:t>c,</w:t>
+            </w:r>
+          </w:p>
+          <w:p>
+            <w:pPr>
+              <w:spacing w:after="0"/>
+              <w:rPr>
+                <w:sz w:val="17"/>
+              </w:rPr>
+            </w:pPr>
+            <w:r>
+              <w:rPr>
+                <w:sz w:val="17"/>
+              </w:rPr>
+              <w:t>1b7062a</w:t>
+            </w:r>
+            <w:r>
+              <w:rPr>
+                <w:sz w:val="17"/>
+              </w:rPr>
+              <w:t>,</w:t>
+            </w:r>
+          </w:p>
+          <w:p>
+            <w:pPr>
+              <w:spacing w:after="0"/>
+              <w:rPr>
+                <w:sz w:val="17"/>
+              </w:rPr>
+            </w:pPr>
+            <w:r>
+              <w:rPr>
+                <w:sz w:val="17"/>
+              </w:rPr>
+              <w:t>61d7554</w:t>
+            </w:r>
+            <w:r>
+              <w:rPr>
+                <w:sz w:val="17"/>
+              </w:rPr>
+              <w:t>,</w:t>
+            </w:r>
+          </w:p>
+          <w:p>
+            <w:pPr>
+              <w:spacing w:after="0"/>
+              <w:rPr>
+                <w:sz w:val="17"/>
+              </w:rPr>
+            </w:pPr>
+            <w:r>
+              <w:rPr>
+                <w:sz w:val="17"/>
+              </w:rPr>
+              <w:t>e8d6880</w:t>
+            </w:r>
+            <w:r>
+              <w:rPr>
+                <w:sz w:val="17"/>
+              </w:rPr>
+              <w:t>]</w:t>
             </w:r>
           </w:p>
         </w:tc>
@@ -1961,29 +1911,7 @@
               <w:rPr>
                 <w:sz w:val="17"/>
               </w:rPr>
-              <w:t xml:space="preserve">Initialized repo, </w:t>
-            </w:r>
-            <w:proofErr w:type="gramStart"/>
-            <w:r>
-              <w:rPr>
-                <w:sz w:val="17"/>
-              </w:rPr>
-              <w:t>setup .</w:t>
-            </w:r>
-            <w:proofErr w:type="spellStart"/>
-            <w:r>
-              <w:rPr>
-                <w:sz w:val="17"/>
-              </w:rPr>
-              <w:t>gitignore</w:t>
-            </w:r>
-            <w:proofErr w:type="spellEnd"/>
-            <w:proofErr w:type="gramEnd"/>
-            <w:r>
-              <w:rPr>
-                <w:sz w:val="17"/>
-              </w:rPr>
-              <w:t>, integrated card 1, configured remote repo &amp; pushed main, dev-1 profile update.</w:t>
+              <w:t>Initialized repo, setup .gitignore, integrated card 1, configured remote repo &amp; pushed main, dev-1 profile update.</w:t>
             </w:r>
           </w:p>
         </w:tc>
@@ -2012,23 +1940,7 @@
                 <w:b/>
                 <w:sz w:val="17"/>
               </w:rPr>
-              <w:t xml:space="preserve">[ Barandon, </w:t>
-            </w:r>
-            <w:proofErr w:type="spellStart"/>
-            <w:r>
-              <w:rPr>
-                <w:b/>
-                <w:sz w:val="17"/>
-              </w:rPr>
-              <w:t>Noelee</w:t>
-            </w:r>
-            <w:proofErr w:type="spellEnd"/>
-            <w:r>
-              <w:rPr>
-                <w:b/>
-                <w:sz w:val="17"/>
-              </w:rPr>
-              <w:t xml:space="preserve"> Anthony S.]</w:t>
+              <w:t>[ Barandon, Noelee Anthony S.]</w:t>
             </w:r>
           </w:p>
         </w:tc>
@@ -2099,12 +2011,198 @@
           <w:p>
             <w:pPr>
               <w:spacing w:after="0"/>
+              <w:rPr>
+                <w:sz w:val="17"/>
+              </w:rPr>
             </w:pPr>
             <w:r>
               <w:rPr>
                 <w:sz w:val="17"/>
               </w:rPr>
-              <w:t>[8a11075]</w:t>
+              <w:t>[8a11075</w:t>
+            </w:r>
+            <w:r>
+              <w:rPr>
+                <w:sz w:val="17"/>
+              </w:rPr>
+              <w:t>,</w:t>
+            </w:r>
+          </w:p>
+          <w:p>
+            <w:pPr>
+              <w:spacing w:after="0"/>
+              <w:rPr>
+                <w:sz w:val="17"/>
+              </w:rPr>
+            </w:pPr>
+            <w:r>
+              <w:rPr>
+                <w:sz w:val="17"/>
+              </w:rPr>
+              <w:t>12d6e12</w:t>
+            </w:r>
+            <w:r>
+              <w:rPr>
+                <w:sz w:val="17"/>
+              </w:rPr>
+              <w:t>,</w:t>
+            </w:r>
+          </w:p>
+          <w:p>
+            <w:pPr>
+              <w:spacing w:after="0"/>
+              <w:rPr>
+                <w:sz w:val="17"/>
+              </w:rPr>
+            </w:pPr>
+            <w:r>
+              <w:rPr>
+                <w:sz w:val="17"/>
+              </w:rPr>
+              <w:t>6436231</w:t>
+            </w:r>
+            <w:r>
+              <w:rPr>
+                <w:sz w:val="17"/>
+              </w:rPr>
+              <w:t>,</w:t>
+            </w:r>
+          </w:p>
+          <w:p>
+            <w:pPr>
+              <w:spacing w:after="0"/>
+              <w:rPr>
+                <w:sz w:val="17"/>
+              </w:rPr>
+            </w:pPr>
+            <w:r>
+              <w:rPr>
+                <w:sz w:val="17"/>
+              </w:rPr>
+              <w:t>873a2b1</w:t>
+            </w:r>
+            <w:r>
+              <w:rPr>
+                <w:sz w:val="17"/>
+              </w:rPr>
+              <w:t>,</w:t>
+            </w:r>
+          </w:p>
+          <w:p>
+            <w:pPr>
+              <w:spacing w:after="0"/>
+              <w:rPr>
+                <w:sz w:val="17"/>
+              </w:rPr>
+            </w:pPr>
+            <w:r>
+              <w:rPr>
+                <w:sz w:val="17"/>
+              </w:rPr>
+              <w:t>53a5377</w:t>
+            </w:r>
+            <w:r>
+              <w:rPr>
+                <w:sz w:val="17"/>
+              </w:rPr>
+              <w:t>,</w:t>
+            </w:r>
+          </w:p>
+          <w:p>
+            <w:pPr>
+              <w:spacing w:after="0"/>
+              <w:rPr>
+                <w:sz w:val="17"/>
+              </w:rPr>
+            </w:pPr>
+            <w:r>
+              <w:rPr>
+                <w:sz w:val="17"/>
+              </w:rPr>
+              <w:t>bfea81c</w:t>
+            </w:r>
+            <w:r>
+              <w:rPr>
+                <w:sz w:val="17"/>
+              </w:rPr>
+              <w:t>,</w:t>
+            </w:r>
+          </w:p>
+          <w:p>
+            <w:pPr>
+              <w:spacing w:after="0"/>
+              <w:rPr>
+                <w:sz w:val="17"/>
+              </w:rPr>
+            </w:pPr>
+            <w:r>
+              <w:rPr>
+                <w:sz w:val="17"/>
+              </w:rPr>
+              <w:t>2366542</w:t>
+            </w:r>
+            <w:r>
+              <w:rPr>
+                <w:sz w:val="17"/>
+              </w:rPr>
+              <w:t>,</w:t>
+            </w:r>
+          </w:p>
+          <w:p>
+            <w:pPr>
+              <w:spacing w:after="0"/>
+              <w:rPr>
+                <w:sz w:val="17"/>
+              </w:rPr>
+            </w:pPr>
+            <w:r>
+              <w:rPr>
+                <w:sz w:val="17"/>
+              </w:rPr>
+              <w:t>edaa510</w:t>
+            </w:r>
+            <w:r>
+              <w:rPr>
+                <w:sz w:val="17"/>
+              </w:rPr>
+              <w:t>,</w:t>
+            </w:r>
+          </w:p>
+          <w:p>
+            <w:pPr>
+              <w:spacing w:after="0"/>
+              <w:rPr>
+                <w:sz w:val="17"/>
+              </w:rPr>
+            </w:pPr>
+            <w:r>
+              <w:rPr>
+                <w:sz w:val="17"/>
+              </w:rPr>
+              <w:t>3f378e8</w:t>
+            </w:r>
+            <w:r>
+              <w:rPr>
+                <w:sz w:val="17"/>
+              </w:rPr>
+              <w:t>,</w:t>
+            </w:r>
+          </w:p>
+          <w:p>
+            <w:pPr>
+              <w:spacing w:after="0"/>
+            </w:pPr>
+            <w:r>
+              <w:rPr>
+                <w:sz w:val="17"/>
+              </w:rPr>
+              <w:t>3981b93</w:t>
+            </w:r>
+            <w:r>
+              <w:rPr>
+                <w:sz w:val="17"/>
+              </w:rPr>
+              <w:t>]</w:t>
             </w:r>
           </w:p>
         </w:tc>
@@ -2157,17 +2255,8 @@
                 <w:b/>
                 <w:sz w:val="17"/>
               </w:rPr>
-              <w:t xml:space="preserve">[ Musa, Eduardo Gabriel </w:t>
+              <w:t>[ Musa, Eduardo Gabriel S. ]</w:t>
             </w:r>
-            <w:proofErr w:type="gramStart"/>
-            <w:r>
-              <w:rPr>
-                <w:b/>
-                <w:sz w:val="17"/>
-              </w:rPr>
-              <w:t>S. ]</w:t>
-            </w:r>
-            <w:proofErr w:type="gramEnd"/>
           </w:p>
         </w:tc>
         <w:tc>
@@ -2215,14 +2304,12 @@
             <w:pPr>
               <w:spacing w:after="0"/>
             </w:pPr>
-            <w:proofErr w:type="spellStart"/>
             <w:r>
               <w:rPr>
                 <w:sz w:val="17"/>
               </w:rPr>
               <w:t>mymitz</w:t>
             </w:r>
-            <w:proofErr w:type="spellEnd"/>
           </w:p>
         </w:tc>
         <w:tc>
@@ -2267,12 +2354,232 @@
           <w:p>
             <w:pPr>
               <w:spacing w:after="0"/>
+              <w:rPr>
+                <w:sz w:val="17"/>
+              </w:rPr>
             </w:pPr>
             <w:r>
               <w:rPr>
                 <w:sz w:val="17"/>
               </w:rPr>
-              <w:t>5f1dcee]</w:t>
+              <w:t>5f1dcee</w:t>
+            </w:r>
+            <w:r>
+              <w:rPr>
+                <w:sz w:val="17"/>
+              </w:rPr>
+              <w:t>,</w:t>
+            </w:r>
+          </w:p>
+          <w:p>
+            <w:pPr>
+              <w:spacing w:after="0"/>
+              <w:rPr>
+                <w:sz w:val="17"/>
+              </w:rPr>
+            </w:pPr>
+            <w:r>
+              <w:rPr>
+                <w:sz w:val="17"/>
+              </w:rPr>
+              <w:t>1e38b80</w:t>
+            </w:r>
+            <w:r>
+              <w:rPr>
+                <w:sz w:val="17"/>
+              </w:rPr>
+              <w:t>,</w:t>
+            </w:r>
+          </w:p>
+          <w:p>
+            <w:pPr>
+              <w:spacing w:after="0"/>
+              <w:rPr>
+                <w:sz w:val="17"/>
+              </w:rPr>
+            </w:pPr>
+            <w:r>
+              <w:rPr>
+                <w:sz w:val="17"/>
+              </w:rPr>
+              <w:t>6ce1b08</w:t>
+            </w:r>
+            <w:r>
+              <w:rPr>
+                <w:sz w:val="17"/>
+              </w:rPr>
+              <w:t>,</w:t>
+            </w:r>
+          </w:p>
+          <w:p>
+            <w:pPr>
+              <w:spacing w:after="0"/>
+              <w:rPr>
+                <w:sz w:val="17"/>
+              </w:rPr>
+            </w:pPr>
+            <w:r>
+              <w:rPr>
+                <w:sz w:val="17"/>
+              </w:rPr>
+              <w:t>132d036</w:t>
+            </w:r>
+            <w:r>
+              <w:rPr>
+                <w:sz w:val="17"/>
+              </w:rPr>
+              <w:t>,</w:t>
+            </w:r>
+          </w:p>
+          <w:p>
+            <w:pPr>
+              <w:spacing w:after="0"/>
+              <w:rPr>
+                <w:sz w:val="17"/>
+              </w:rPr>
+            </w:pPr>
+            <w:r>
+              <w:rPr>
+                <w:sz w:val="17"/>
+              </w:rPr>
+              <w:t>d242a8f</w:t>
+            </w:r>
+            <w:r>
+              <w:rPr>
+                <w:sz w:val="17"/>
+              </w:rPr>
+              <w:t>,</w:t>
+            </w:r>
+          </w:p>
+          <w:p>
+            <w:pPr>
+              <w:spacing w:after="0"/>
+              <w:rPr>
+                <w:sz w:val="17"/>
+              </w:rPr>
+            </w:pPr>
+            <w:r>
+              <w:rPr>
+                <w:sz w:val="17"/>
+              </w:rPr>
+              <w:t>f6b9514</w:t>
+            </w:r>
+            <w:r>
+              <w:rPr>
+                <w:sz w:val="17"/>
+              </w:rPr>
+              <w:t>,</w:t>
+            </w:r>
+          </w:p>
+          <w:p>
+            <w:pPr>
+              <w:spacing w:after="0"/>
+              <w:rPr>
+                <w:sz w:val="17"/>
+              </w:rPr>
+            </w:pPr>
+            <w:r>
+              <w:rPr>
+                <w:sz w:val="17"/>
+              </w:rPr>
+              <w:t>69514ff</w:t>
+            </w:r>
+            <w:r>
+              <w:rPr>
+                <w:sz w:val="17"/>
+              </w:rPr>
+              <w:t>,</w:t>
+            </w:r>
+          </w:p>
+          <w:p>
+            <w:pPr>
+              <w:spacing w:after="0"/>
+              <w:rPr>
+                <w:sz w:val="17"/>
+              </w:rPr>
+            </w:pPr>
+            <w:r>
+              <w:rPr>
+                <w:sz w:val="17"/>
+              </w:rPr>
+              <w:t>b1f74fe</w:t>
+            </w:r>
+            <w:r>
+              <w:rPr>
+                <w:sz w:val="17"/>
+              </w:rPr>
+              <w:t>,</w:t>
+            </w:r>
+          </w:p>
+          <w:p>
+            <w:pPr>
+              <w:spacing w:after="0"/>
+              <w:rPr>
+                <w:sz w:val="17"/>
+              </w:rPr>
+            </w:pPr>
+            <w:r>
+              <w:rPr>
+                <w:sz w:val="17"/>
+              </w:rPr>
+              <w:t>496ecb8</w:t>
+            </w:r>
+            <w:r>
+              <w:rPr>
+                <w:sz w:val="17"/>
+              </w:rPr>
+              <w:t>,</w:t>
+            </w:r>
+          </w:p>
+          <w:p>
+            <w:pPr>
+              <w:spacing w:after="0"/>
+              <w:rPr>
+                <w:sz w:val="17"/>
+              </w:rPr>
+            </w:pPr>
+            <w:r>
+              <w:rPr>
+                <w:sz w:val="17"/>
+              </w:rPr>
+              <w:t>12111ff</w:t>
+            </w:r>
+            <w:r>
+              <w:rPr>
+                <w:sz w:val="17"/>
+              </w:rPr>
+              <w:t>,</w:t>
+            </w:r>
+          </w:p>
+          <w:p>
+            <w:pPr>
+              <w:spacing w:after="0"/>
+              <w:rPr>
+                <w:sz w:val="17"/>
+              </w:rPr>
+            </w:pPr>
+            <w:r>
+              <w:rPr>
+                <w:sz w:val="17"/>
+              </w:rPr>
+              <w:t>9989885</w:t>
+            </w:r>
+            <w:r>
+              <w:rPr>
+                <w:sz w:val="17"/>
+              </w:rPr>
+              <w:t>,</w:t>
+            </w:r>
+          </w:p>
+          <w:p>
+            <w:pPr>
+              <w:spacing w:after="0"/>
+            </w:pPr>
+            <w:r>
+              <w:rPr>
+                <w:sz w:val="17"/>
+              </w:rPr>
+              <w:t>]</w:t>
             </w:r>
           </w:p>
         </w:tc>
@@ -2343,7 +2650,16 @@
           <w:color w:val="64748B"/>
           <w:sz w:val="19"/>
         </w:rPr>
-        <w:t>I learned that virtual environments help keep projects isolated and prevent conflicts between dependencies. I also learned that configuration rules keep the project organized and make sure everyone follows the same setup. For GitHub, I learned how to properly coordinate repository invitations and give the right access to team members. Overall, clear setup and communication make teamwork easier and more efficient.</w:t>
+        <w:t xml:space="preserve">I learned that virtual environments help keep projects isolated and prevent conflicts between dependencies. I also learned that configuration rules keep the project organized and make sure everyone follows </w:t>
+      </w:r>
+      <w:r>
+        <w:rPr>
+          <w:i/>
+          <w:color w:val="64748B"/>
+          <w:sz w:val="19"/>
+        </w:rPr>
+        <w:lastRenderedPageBreak/>
+        <w:t>the same setup. For GitHub, I learned how to properly coordinate repository invitations and give the right access to team members. Overall, clear setup and communication make teamwork easier and more efficient.</w:t>
       </w:r>
     </w:p>
     <w:p>
@@ -2430,35 +2746,7 @@
           <w:color w:val="64748B"/>
           <w:sz w:val="19"/>
         </w:rPr>
-        <w:t xml:space="preserve">. How to </w:t>
-      </w:r>
-      <w:proofErr w:type="gramStart"/>
-      <w:r>
-        <w:rPr>
-          <w:i/>
-          <w:color w:val="64748B"/>
-          <w:sz w:val="19"/>
-        </w:rPr>
-        <w:t>update .</w:t>
-      </w:r>
-      <w:proofErr w:type="spellStart"/>
-      <w:r>
-        <w:rPr>
-          <w:i/>
-          <w:color w:val="64748B"/>
-          <w:sz w:val="19"/>
-        </w:rPr>
-        <w:t>gitignore</w:t>
-      </w:r>
-      <w:proofErr w:type="spellEnd"/>
-      <w:proofErr w:type="gramEnd"/>
-      <w:r>
-        <w:rPr>
-          <w:i/>
-          <w:color w:val="64748B"/>
-          <w:sz w:val="19"/>
-        </w:rPr>
-        <w:t>, commit properly</w:t>
+        <w:t>. How to update .gitignore, commit properly</w:t>
       </w:r>
       <w:r>
         <w:rPr>
@@ -2466,25 +2754,7 @@
           <w:color w:val="64748B"/>
           <w:sz w:val="19"/>
         </w:rPr>
-        <w:t xml:space="preserve">, and push to the </w:t>
-      </w:r>
-      <w:proofErr w:type="spellStart"/>
-      <w:r>
-        <w:rPr>
-          <w:i/>
-          <w:color w:val="64748B"/>
-          <w:sz w:val="19"/>
-        </w:rPr>
-        <w:t>Github</w:t>
-      </w:r>
-      <w:proofErr w:type="spellEnd"/>
-      <w:r>
-        <w:rPr>
-          <w:i/>
-          <w:color w:val="64748B"/>
-          <w:sz w:val="19"/>
-        </w:rPr>
-        <w:t xml:space="preserve"> repository. </w:t>
+        <w:t xml:space="preserve">, and push to the Github repository. </w:t>
       </w:r>
       <w:r>
         <w:rPr>
@@ -2492,25 +2762,7 @@
           <w:color w:val="64748B"/>
           <w:sz w:val="19"/>
         </w:rPr>
-        <w:t xml:space="preserve">I also learn about the naming conventions for committing to </w:t>
-      </w:r>
-      <w:proofErr w:type="spellStart"/>
-      <w:r>
-        <w:rPr>
-          <w:i/>
-          <w:color w:val="64748B"/>
-          <w:sz w:val="19"/>
-        </w:rPr>
-        <w:t>Github</w:t>
-      </w:r>
-      <w:proofErr w:type="spellEnd"/>
-      <w:r>
-        <w:rPr>
-          <w:i/>
-          <w:color w:val="64748B"/>
-          <w:sz w:val="19"/>
-        </w:rPr>
-        <w:t xml:space="preserve">, I also learn about the workflow in a dev team. I have gained knowledge on what it is mean to become a QA, and how to ensure </w:t>
+        <w:t xml:space="preserve">I also learn about the naming conventions for committing to Github, I also learn about the workflow in a dev team. I have gained knowledge on what it is mean to become a QA, and how to ensure </w:t>
       </w:r>
       <w:r>
         <w:rPr>
@@ -2526,25 +2778,7 @@
           <w:color w:val="64748B"/>
           <w:sz w:val="19"/>
         </w:rPr>
-        <w:t xml:space="preserve">that is related to </w:t>
-      </w:r>
-      <w:proofErr w:type="spellStart"/>
-      <w:r>
-        <w:rPr>
-          <w:i/>
-          <w:color w:val="64748B"/>
-          <w:sz w:val="19"/>
-        </w:rPr>
-        <w:t>Github</w:t>
-      </w:r>
-      <w:proofErr w:type="spellEnd"/>
-      <w:r>
-        <w:rPr>
-          <w:i/>
-          <w:color w:val="64748B"/>
-          <w:sz w:val="19"/>
-        </w:rPr>
-        <w:t xml:space="preserve"> and the workflow procedure of </w:t>
+        <w:t xml:space="preserve">that is related to Github and the workflow procedure of </w:t>
       </w:r>
       <w:r>
         <w:rPr>
@@ -2575,15 +2809,7 @@
     </w:p>
     <w:p>
       <w:r>
-        <w:t>Verbatim ASCII commit history exported using 'git log --</w:t>
-      </w:r>
-      <w:proofErr w:type="spellStart"/>
-      <w:r>
-        <w:t>oneline</w:t>
-      </w:r>
-      <w:proofErr w:type="spellEnd"/>
-      <w:r>
-        <w:t xml:space="preserve"> --graph --all &gt; git_log_proof.txt'. This demonstrates the complete sequential feature branching and merge timeline across all three developers.</w:t>
+        <w:t>Verbatim ASCII commit history exported using 'git log --oneline --graph --all &gt; git_log_proof.txt'. This demonstrates the complete sequential feature branching and merge timeline across all three developers.</w:t>
       </w:r>
     </w:p>
     <w:tbl>
@@ -2626,25 +2852,7 @@
                 <w:color w:val="E2E8F0"/>
                 <w:sz w:val="17"/>
               </w:rPr>
-              <w:t>*   d242a8f Merge branch '</w:t>
-            </w:r>
-            <w:proofErr w:type="spellStart"/>
-            <w:r>
-              <w:rPr>
-                <w:rFonts w:ascii="Courier New" w:hAnsi="Courier New"/>
-                <w:color w:val="E2E8F0"/>
-                <w:sz w:val="17"/>
-              </w:rPr>
-              <w:t>mymitz</w:t>
-            </w:r>
-            <w:proofErr w:type="spellEnd"/>
-            <w:r>
-              <w:rPr>
-                <w:rFonts w:ascii="Courier New" w:hAnsi="Courier New"/>
-                <w:color w:val="E2E8F0"/>
-                <w:sz w:val="17"/>
-              </w:rPr>
-              <w:t>' Update documents</w:t>
+              <w:t>*   d242a8f Merge branch 'mymitz' Update documents</w:t>
             </w:r>
           </w:p>
           <w:p>
@@ -2914,18 +3122,8 @@
                 <w:color w:val="E2E8F0"/>
                 <w:sz w:val="17"/>
               </w:rPr>
-              <w:t xml:space="preserve">* 8a11075 </w:t>
+              <w:t>* 8a11075 pfp</w:t>
             </w:r>
-            <w:proofErr w:type="spellStart"/>
-            <w:r>
-              <w:rPr>
-                <w:rFonts w:ascii="Courier New" w:hAnsi="Courier New"/>
-                <w:color w:val="E2E8F0"/>
-                <w:sz w:val="17"/>
-              </w:rPr>
-              <w:t>pfp</w:t>
-            </w:r>
-            <w:proofErr w:type="spellEnd"/>
           </w:p>
           <w:p>
             <w:pPr>
@@ -2960,25 +3158,7 @@
                 <w:color w:val="E2E8F0"/>
                 <w:sz w:val="17"/>
               </w:rPr>
-              <w:t>* 65b1dc5 Create Ni-</w:t>
-            </w:r>
-            <w:proofErr w:type="spellStart"/>
-            <w:r>
-              <w:rPr>
-                <w:rFonts w:ascii="Courier New" w:hAnsi="Courier New"/>
-                <w:color w:val="E2E8F0"/>
-                <w:sz w:val="17"/>
-              </w:rPr>
-              <w:t>Git.code</w:t>
-            </w:r>
-            <w:proofErr w:type="spellEnd"/>
-            <w:r>
-              <w:rPr>
-                <w:rFonts w:ascii="Courier New" w:hAnsi="Courier New"/>
-                <w:color w:val="E2E8F0"/>
-                <w:sz w:val="17"/>
-              </w:rPr>
-              <w:t>-workspace</w:t>
+              <w:t>* 65b1dc5 Create Ni-Git.code-workspace</w:t>
             </w:r>
           </w:p>
           <w:p>
@@ -2996,25 +3176,7 @@
                 <w:color w:val="E2E8F0"/>
                 <w:sz w:val="17"/>
               </w:rPr>
-              <w:t xml:space="preserve">* c0cf354 </w:t>
-            </w:r>
-            <w:proofErr w:type="gramStart"/>
-            <w:r>
-              <w:rPr>
-                <w:rFonts w:ascii="Courier New" w:hAnsi="Courier New"/>
-                <w:color w:val="E2E8F0"/>
-                <w:sz w:val="17"/>
-              </w:rPr>
-              <w:t>Small</w:t>
-            </w:r>
-            <w:proofErr w:type="gramEnd"/>
-            <w:r>
-              <w:rPr>
-                <w:rFonts w:ascii="Courier New" w:hAnsi="Courier New"/>
-                <w:color w:val="E2E8F0"/>
-                <w:sz w:val="17"/>
-              </w:rPr>
-              <w:t xml:space="preserve"> change and update of my profile, no major changes yet</w:t>
+              <w:t>* c0cf354 Small change and update of my profile, no major changes yet</w:t>
             </w:r>
           </w:p>
           <w:p>

</xml_diff>

<commit_message>
docs(PDF): Update on section screenshot
</commit_message>
<xml_diff>
--- a/CCCS106_Lab01_Report_Barandon_Borja_Musa.docx
+++ b/CCCS106_Lab01_Report_Barandon_Borja_Musa.docx
@@ -153,7 +153,23 @@
                 <w:color w:val="0F172A"/>
                 <w:sz w:val="19"/>
               </w:rPr>
-              <w:t>Group No. [ 2 ]  (Ni-Git)</w:t>
+              <w:t xml:space="preserve">Group No. [ </w:t>
+            </w:r>
+            <w:proofErr w:type="gramStart"/>
+            <w:r>
+              <w:rPr>
+                <w:color w:val="0F172A"/>
+                <w:sz w:val="19"/>
+              </w:rPr>
+              <w:t>2 ]</w:t>
+            </w:r>
+            <w:proofErr w:type="gramEnd"/>
+            <w:r>
+              <w:rPr>
+                <w:color w:val="0F172A"/>
+                <w:sz w:val="19"/>
+              </w:rPr>
+              <w:t xml:space="preserve">  (Ni-Git)</w:t>
             </w:r>
           </w:p>
         </w:tc>
@@ -220,8 +236,17 @@
                 <w:color w:val="0F172A"/>
                 <w:sz w:val="19"/>
               </w:rPr>
-              <w:t>, 2026 ]</w:t>
-            </w:r>
+              <w:t xml:space="preserve">, </w:t>
+            </w:r>
+            <w:proofErr w:type="gramStart"/>
+            <w:r>
+              <w:rPr>
+                <w:color w:val="0F172A"/>
+                <w:sz w:val="19"/>
+              </w:rPr>
+              <w:t>2026 ]</w:t>
+            </w:r>
+            <w:proofErr w:type="gramEnd"/>
           </w:p>
         </w:tc>
       </w:tr>
@@ -443,8 +468,17 @@
                 <w:b/>
                 <w:sz w:val="18"/>
               </w:rPr>
-              <w:t>[ Borja, Edmar B. ]</w:t>
-            </w:r>
+              <w:t xml:space="preserve">[ Borja, Edmar </w:t>
+            </w:r>
+            <w:proofErr w:type="gramStart"/>
+            <w:r>
+              <w:rPr>
+                <w:b/>
+                <w:sz w:val="18"/>
+              </w:rPr>
+              <w:t>B. ]</w:t>
+            </w:r>
+            <w:proofErr w:type="gramEnd"/>
           </w:p>
         </w:tc>
         <w:tc>
@@ -548,7 +582,23 @@
                 <w:b/>
                 <w:sz w:val="18"/>
               </w:rPr>
-              <w:t>[ Barandon, Noelee Anthony S.]</w:t>
+              <w:t xml:space="preserve">[ Barandon, </w:t>
+            </w:r>
+            <w:proofErr w:type="spellStart"/>
+            <w:r>
+              <w:rPr>
+                <w:b/>
+                <w:sz w:val="18"/>
+              </w:rPr>
+              <w:t>Noelee</w:t>
+            </w:r>
+            <w:proofErr w:type="spellEnd"/>
+            <w:r>
+              <w:rPr>
+                <w:b/>
+                <w:sz w:val="18"/>
+              </w:rPr>
+              <w:t xml:space="preserve"> Anthony S.]</w:t>
             </w:r>
           </w:p>
         </w:tc>
@@ -653,8 +703,17 @@
                 <w:b/>
                 <w:sz w:val="18"/>
               </w:rPr>
-              <w:t>[ Musa, Eduardo Gabriel S. ]</w:t>
-            </w:r>
+              <w:t xml:space="preserve">[ Musa, Eduardo Gabriel </w:t>
+            </w:r>
+            <w:proofErr w:type="gramStart"/>
+            <w:r>
+              <w:rPr>
+                <w:b/>
+                <w:sz w:val="18"/>
+              </w:rPr>
+              <w:t>S. ]</w:t>
+            </w:r>
+            <w:proofErr w:type="gramEnd"/>
           </w:p>
         </w:tc>
         <w:tc>
@@ -821,10 +880,10 @@
                 <w:noProof/>
               </w:rPr>
               <w:drawing>
-                <wp:inline distT="0" distB="0" distL="0" distR="0" wp14:anchorId="30A16315" wp14:editId="3A62ED8D">
-                  <wp:extent cx="5689600" cy="2905125"/>
-                  <wp:effectExtent l="0" t="0" r="6350" b="9525"/>
-                  <wp:docPr id="128030443" name="Picture 1"/>
+                <wp:inline distT="0" distB="0" distL="0" distR="0" wp14:anchorId="68C8A6BF" wp14:editId="02D30F2F">
+                  <wp:extent cx="5689600" cy="1631950"/>
+                  <wp:effectExtent l="0" t="0" r="6350" b="6350"/>
+                  <wp:docPr id="1806146610" name="Picture 1"/>
                   <wp:cNvGraphicFramePr>
                     <a:graphicFrameLocks xmlns:a="http://schemas.openxmlformats.org/drawingml/2006/main" noChangeAspect="1"/>
                   </wp:cNvGraphicFramePr>
@@ -832,10 +891,8 @@
                     <a:graphicData uri="http://schemas.openxmlformats.org/drawingml/2006/picture">
                       <pic:pic xmlns:pic="http://schemas.openxmlformats.org/drawingml/2006/picture">
                         <pic:nvPicPr>
-                          <pic:cNvPr id="128030443" name="Picture 1"/>
-                          <pic:cNvPicPr>
-                            <a:picLocks noChangeAspect="1"/>
-                          </pic:cNvPicPr>
+                          <pic:cNvPr id="1806146610" name="Picture 1806146610"/>
+                          <pic:cNvPicPr/>
                         </pic:nvPicPr>
                         <pic:blipFill>
                           <a:blip r:embed="rId9"/>
@@ -846,49 +903,7 @@
                         <pic:spPr>
                           <a:xfrm>
                             <a:off x="0" y="0"/>
-                            <a:ext cx="5689600" cy="2905125"/>
-                          </a:xfrm>
-                          <a:prstGeom prst="rect">
-                            <a:avLst/>
-                          </a:prstGeom>
-                        </pic:spPr>
-                      </pic:pic>
-                    </a:graphicData>
-                  </a:graphic>
-                </wp:inline>
-              </w:drawing>
-            </w:r>
-            <w:r>
-              <w:rPr>
-                <w:noProof/>
-              </w:rPr>
-              <w:drawing>
-                <wp:inline distT="0" distB="0" distL="0" distR="0" wp14:anchorId="00401AA9" wp14:editId="364B701B">
-                  <wp:extent cx="5689600" cy="2835275"/>
-                  <wp:effectExtent l="0" t="0" r="6350" b="3175"/>
-                  <wp:docPr id="877353589" name="Picture 2"/>
-                  <wp:cNvGraphicFramePr>
-                    <a:graphicFrameLocks xmlns:a="http://schemas.openxmlformats.org/drawingml/2006/main" noChangeAspect="1"/>
-                  </wp:cNvGraphicFramePr>
-                  <a:graphic xmlns:a="http://schemas.openxmlformats.org/drawingml/2006/main">
-                    <a:graphicData uri="http://schemas.openxmlformats.org/drawingml/2006/picture">
-                      <pic:pic xmlns:pic="http://schemas.openxmlformats.org/drawingml/2006/picture">
-                        <pic:nvPicPr>
-                          <pic:cNvPr id="877353589" name="Picture 2"/>
-                          <pic:cNvPicPr>
-                            <a:picLocks noChangeAspect="1"/>
-                          </pic:cNvPicPr>
-                        </pic:nvPicPr>
-                        <pic:blipFill>
-                          <a:blip r:embed="rId10"/>
-                          <a:stretch>
-                            <a:fillRect/>
-                          </a:stretch>
-                        </pic:blipFill>
-                        <pic:spPr>
-                          <a:xfrm>
-                            <a:off x="0" y="0"/>
-                            <a:ext cx="5689600" cy="2835275"/>
+                            <a:ext cx="5689600" cy="1631950"/>
                           </a:xfrm>
                           <a:prstGeom prst="rect">
                             <a:avLst/>
@@ -924,7 +939,6 @@
         <w:jc w:val="both"/>
       </w:pPr>
       <w:r>
-        <w:lastRenderedPageBreak/>
         <w:t>Section 2: Automated Pre-Flight Diagnostics Audit</w:t>
       </w:r>
     </w:p>
@@ -934,7 +948,36 @@
         <w:jc w:val="both"/>
       </w:pPr>
       <w:r>
-        <w:t>Pre-flight workstation audit executed via 'python verify_setup.py' inside the active virtual environment (.venv). All six (6) audit checks must report [PASS] verifying Python 3.10+, virtualenv isolation, Flet SDK v0.86.5+, Git binary detection, configured institutional user identity, and .gitignore hygiene.</w:t>
+        <w:t>Pre-flight workstation audit executed via 'python verify_setup.py' inside the active virtual environment (.</w:t>
+      </w:r>
+      <w:proofErr w:type="spellStart"/>
+      <w:r>
+        <w:t>venv</w:t>
+      </w:r>
+      <w:proofErr w:type="spellEnd"/>
+      <w:r>
+        <w:t xml:space="preserve">). All six (6) audit checks must report [PASS] verifying Python 3.10+, </w:t>
+      </w:r>
+      <w:proofErr w:type="spellStart"/>
+      <w:r>
+        <w:t>virtualenv</w:t>
+      </w:r>
+      <w:proofErr w:type="spellEnd"/>
+      <w:r>
+        <w:t xml:space="preserve"> isolation, Flet SDK v0.86.5+, Git binary detection, configured institutional user identity, </w:t>
+      </w:r>
+      <w:proofErr w:type="gramStart"/>
+      <w:r>
+        <w:t>and .</w:t>
+      </w:r>
+      <w:proofErr w:type="spellStart"/>
+      <w:r>
+        <w:t>gitignore</w:t>
+      </w:r>
+      <w:proofErr w:type="spellEnd"/>
+      <w:proofErr w:type="gramEnd"/>
+      <w:r>
+        <w:t xml:space="preserve"> hygiene.</w:t>
       </w:r>
     </w:p>
     <w:tbl>
@@ -995,7 +1038,7 @@
                           </pic:cNvPicPr>
                         </pic:nvPicPr>
                         <pic:blipFill>
-                          <a:blip r:embed="rId11"/>
+                          <a:blip r:embed="rId10"/>
                           <a:stretch>
                             <a:fillRect/>
                           </a:stretch>
@@ -1039,7 +1082,21 @@
         <w:jc w:val="both"/>
       </w:pPr>
       <w:r>
-        <w:t>Section 3: Git Working Tree Cleanliness &amp; .gitignore Audit</w:t>
+        <w:lastRenderedPageBreak/>
+        <w:t xml:space="preserve">Section 3: Git Working Tree Cleanliness </w:t>
+      </w:r>
+      <w:proofErr w:type="gramStart"/>
+      <w:r>
+        <w:t>&amp; .</w:t>
+      </w:r>
+      <w:proofErr w:type="spellStart"/>
+      <w:r>
+        <w:t>gitignore</w:t>
+      </w:r>
+      <w:proofErr w:type="spellEnd"/>
+      <w:proofErr w:type="gramEnd"/>
+      <w:r>
+        <w:t xml:space="preserve"> Audit</w:t>
       </w:r>
     </w:p>
     <w:p>
@@ -1048,7 +1105,28 @@
         <w:jc w:val="both"/>
       </w:pPr>
       <w:r>
-        <w:t>Demonstration of repository hygiene. The screenshot proves that the working tree is clean with zero uncommitted changes, and that .venv/ is completely untracked (verified by running 'git ls-files .venv', returning empty output).</w:t>
+        <w:t xml:space="preserve">Demonstration of repository hygiene. The screenshot proves that the working tree is clean with zero uncommitted changes, and </w:t>
+      </w:r>
+      <w:proofErr w:type="gramStart"/>
+      <w:r>
+        <w:t>that .</w:t>
+      </w:r>
+      <w:proofErr w:type="spellStart"/>
+      <w:r>
+        <w:t>venv</w:t>
+      </w:r>
+      <w:proofErr w:type="spellEnd"/>
+      <w:proofErr w:type="gramEnd"/>
+      <w:r>
+        <w:t>/ is completely untracked (verified by running 'git ls-files .</w:t>
+      </w:r>
+      <w:proofErr w:type="spellStart"/>
+      <w:r>
+        <w:t>venv</w:t>
+      </w:r>
+      <w:proofErr w:type="spellEnd"/>
+      <w:r>
+        <w:t>', returning empty output).</w:t>
       </w:r>
     </w:p>
     <w:tbl>
@@ -1109,7 +1187,7 @@
                           </pic:cNvPicPr>
                         </pic:nvPicPr>
                         <pic:blipFill>
-                          <a:blip r:embed="rId12"/>
+                          <a:blip r:embed="rId11"/>
                           <a:stretch>
                             <a:fillRect/>
                           </a:stretch>
@@ -1143,7 +1221,32 @@
           <w:b/>
           <w:sz w:val="19"/>
         </w:rPr>
-        <w:t>Figure 3: Git Working Tree Cleanliness &amp; .gitignore Hygiene Proof</w:t>
+        <w:t xml:space="preserve">Figure 3: Git Working Tree Cleanliness </w:t>
+      </w:r>
+      <w:proofErr w:type="gramStart"/>
+      <w:r>
+        <w:rPr>
+          <w:b/>
+          <w:sz w:val="19"/>
+        </w:rPr>
+        <w:t>&amp; .</w:t>
+      </w:r>
+      <w:proofErr w:type="spellStart"/>
+      <w:r>
+        <w:rPr>
+          <w:b/>
+          <w:sz w:val="19"/>
+        </w:rPr>
+        <w:t>gitignore</w:t>
+      </w:r>
+      <w:proofErr w:type="spellEnd"/>
+      <w:proofErr w:type="gramEnd"/>
+      <w:r>
+        <w:rPr>
+          <w:b/>
+          <w:sz w:val="19"/>
+        </w:rPr>
+        <w:t xml:space="preserve"> Hygiene Proof</w:t>
       </w:r>
     </w:p>
     <w:p>
@@ -1229,7 +1332,7 @@
                           </pic:cNvPicPr>
                         </pic:nvPicPr>
                         <pic:blipFill>
-                          <a:blip r:embed="rId13"/>
+                          <a:blip r:embed="rId12"/>
                           <a:stretch>
                             <a:fillRect/>
                           </a:stretch>
@@ -1329,7 +1432,7 @@
                           </pic:cNvPicPr>
                         </pic:nvPicPr>
                         <pic:blipFill>
-                          <a:blip r:embed="rId14"/>
+                          <a:blip r:embed="rId13"/>
                           <a:stretch>
                             <a:fillRect/>
                           </a:stretch>
@@ -1428,7 +1531,7 @@
                           </pic:cNvPicPr>
                         </pic:nvPicPr>
                         <pic:blipFill>
-                          <a:blip r:embed="rId15"/>
+                          <a:blip r:embed="rId14"/>
                           <a:stretch>
                             <a:fillRect/>
                           </a:stretch>
@@ -1660,8 +1763,17 @@
                 <w:b/>
                 <w:sz w:val="17"/>
               </w:rPr>
-              <w:t>[ Borja, Edmar B. ]</w:t>
-            </w:r>
+              <w:t xml:space="preserve">[ Borja, Edmar </w:t>
+            </w:r>
+            <w:proofErr w:type="gramStart"/>
+            <w:r>
+              <w:rPr>
+                <w:b/>
+                <w:sz w:val="17"/>
+              </w:rPr>
+              <w:t>B. ]</w:t>
+            </w:r>
+            <w:proofErr w:type="gramEnd"/>
           </w:p>
         </w:tc>
         <w:tc>
@@ -1911,7 +2023,29 @@
               <w:rPr>
                 <w:sz w:val="17"/>
               </w:rPr>
-              <w:t>Initialized repo, setup .gitignore, integrated card 1, configured remote repo &amp; pushed main, dev-1 profile update.</w:t>
+              <w:t xml:space="preserve">Initialized repo, </w:t>
+            </w:r>
+            <w:proofErr w:type="gramStart"/>
+            <w:r>
+              <w:rPr>
+                <w:sz w:val="17"/>
+              </w:rPr>
+              <w:t>setup .</w:t>
+            </w:r>
+            <w:proofErr w:type="spellStart"/>
+            <w:r>
+              <w:rPr>
+                <w:sz w:val="17"/>
+              </w:rPr>
+              <w:t>gitignore</w:t>
+            </w:r>
+            <w:proofErr w:type="spellEnd"/>
+            <w:proofErr w:type="gramEnd"/>
+            <w:r>
+              <w:rPr>
+                <w:sz w:val="17"/>
+              </w:rPr>
+              <w:t>, integrated card 1, configured remote repo &amp; pushed main, dev-1 profile update.</w:t>
             </w:r>
           </w:p>
         </w:tc>
@@ -1940,7 +2074,23 @@
                 <w:b/>
                 <w:sz w:val="17"/>
               </w:rPr>
-              <w:t>[ Barandon, Noelee Anthony S.]</w:t>
+              <w:t xml:space="preserve">[ Barandon, </w:t>
+            </w:r>
+            <w:proofErr w:type="spellStart"/>
+            <w:r>
+              <w:rPr>
+                <w:b/>
+                <w:sz w:val="17"/>
+              </w:rPr>
+              <w:t>Noelee</w:t>
+            </w:r>
+            <w:proofErr w:type="spellEnd"/>
+            <w:r>
+              <w:rPr>
+                <w:b/>
+                <w:sz w:val="17"/>
+              </w:rPr>
+              <w:t xml:space="preserve"> Anthony S.]</w:t>
             </w:r>
           </w:p>
         </w:tc>
@@ -2255,8 +2405,17 @@
                 <w:b/>
                 <w:sz w:val="17"/>
               </w:rPr>
-              <w:t>[ Musa, Eduardo Gabriel S. ]</w:t>
-            </w:r>
+              <w:t xml:space="preserve">[ Musa, Eduardo Gabriel </w:t>
+            </w:r>
+            <w:proofErr w:type="gramStart"/>
+            <w:r>
+              <w:rPr>
+                <w:b/>
+                <w:sz w:val="17"/>
+              </w:rPr>
+              <w:t>S. ]</w:t>
+            </w:r>
+            <w:proofErr w:type="gramEnd"/>
           </w:p>
         </w:tc>
         <w:tc>
@@ -2304,12 +2463,14 @@
             <w:pPr>
               <w:spacing w:after="0"/>
             </w:pPr>
+            <w:proofErr w:type="spellStart"/>
             <w:r>
               <w:rPr>
                 <w:sz w:val="17"/>
               </w:rPr>
               <w:t>mymitz</w:t>
             </w:r>
+            <w:proofErr w:type="spellEnd"/>
           </w:p>
         </w:tc>
         <w:tc>
@@ -2746,7 +2907,35 @@
           <w:color w:val="64748B"/>
           <w:sz w:val="19"/>
         </w:rPr>
-        <w:t>. How to update .gitignore, commit properly</w:t>
+        <w:t xml:space="preserve">. How to </w:t>
+      </w:r>
+      <w:proofErr w:type="gramStart"/>
+      <w:r>
+        <w:rPr>
+          <w:i/>
+          <w:color w:val="64748B"/>
+          <w:sz w:val="19"/>
+        </w:rPr>
+        <w:t>update .</w:t>
+      </w:r>
+      <w:proofErr w:type="spellStart"/>
+      <w:r>
+        <w:rPr>
+          <w:i/>
+          <w:color w:val="64748B"/>
+          <w:sz w:val="19"/>
+        </w:rPr>
+        <w:t>gitignore</w:t>
+      </w:r>
+      <w:proofErr w:type="spellEnd"/>
+      <w:proofErr w:type="gramEnd"/>
+      <w:r>
+        <w:rPr>
+          <w:i/>
+          <w:color w:val="64748B"/>
+          <w:sz w:val="19"/>
+        </w:rPr>
+        <w:t>, commit properly</w:t>
       </w:r>
       <w:r>
         <w:rPr>
@@ -2754,7 +2943,25 @@
           <w:color w:val="64748B"/>
           <w:sz w:val="19"/>
         </w:rPr>
-        <w:t xml:space="preserve">, and push to the Github repository. </w:t>
+        <w:t xml:space="preserve">, and push to the </w:t>
+      </w:r>
+      <w:proofErr w:type="spellStart"/>
+      <w:r>
+        <w:rPr>
+          <w:i/>
+          <w:color w:val="64748B"/>
+          <w:sz w:val="19"/>
+        </w:rPr>
+        <w:t>Github</w:t>
+      </w:r>
+      <w:proofErr w:type="spellEnd"/>
+      <w:r>
+        <w:rPr>
+          <w:i/>
+          <w:color w:val="64748B"/>
+          <w:sz w:val="19"/>
+        </w:rPr>
+        <w:t xml:space="preserve"> repository. </w:t>
       </w:r>
       <w:r>
         <w:rPr>
@@ -2762,7 +2969,25 @@
           <w:color w:val="64748B"/>
           <w:sz w:val="19"/>
         </w:rPr>
-        <w:t xml:space="preserve">I also learn about the naming conventions for committing to Github, I also learn about the workflow in a dev team. I have gained knowledge on what it is mean to become a QA, and how to ensure </w:t>
+        <w:t xml:space="preserve">I also learn about the naming conventions for committing to </w:t>
+      </w:r>
+      <w:proofErr w:type="spellStart"/>
+      <w:r>
+        <w:rPr>
+          <w:i/>
+          <w:color w:val="64748B"/>
+          <w:sz w:val="19"/>
+        </w:rPr>
+        <w:t>Github</w:t>
+      </w:r>
+      <w:proofErr w:type="spellEnd"/>
+      <w:r>
+        <w:rPr>
+          <w:i/>
+          <w:color w:val="64748B"/>
+          <w:sz w:val="19"/>
+        </w:rPr>
+        <w:t xml:space="preserve">, I also learn about the workflow in a dev team. I have gained knowledge on what it is mean to become a QA, and how to ensure </w:t>
       </w:r>
       <w:r>
         <w:rPr>
@@ -2778,7 +3003,25 @@
           <w:color w:val="64748B"/>
           <w:sz w:val="19"/>
         </w:rPr>
-        <w:t xml:space="preserve">that is related to Github and the workflow procedure of </w:t>
+        <w:t xml:space="preserve">that is related to </w:t>
+      </w:r>
+      <w:proofErr w:type="spellStart"/>
+      <w:r>
+        <w:rPr>
+          <w:i/>
+          <w:color w:val="64748B"/>
+          <w:sz w:val="19"/>
+        </w:rPr>
+        <w:t>Github</w:t>
+      </w:r>
+      <w:proofErr w:type="spellEnd"/>
+      <w:r>
+        <w:rPr>
+          <w:i/>
+          <w:color w:val="64748B"/>
+          <w:sz w:val="19"/>
+        </w:rPr>
+        <w:t xml:space="preserve"> and the workflow procedure of </w:t>
       </w:r>
       <w:r>
         <w:rPr>
@@ -2809,7 +3052,15 @@
     </w:p>
     <w:p>
       <w:r>
-        <w:t>Verbatim ASCII commit history exported using 'git log --oneline --graph --all &gt; git_log_proof.txt'. This demonstrates the complete sequential feature branching and merge timeline across all three developers.</w:t>
+        <w:t>Verbatim ASCII commit history exported using 'git log --</w:t>
+      </w:r>
+      <w:proofErr w:type="spellStart"/>
+      <w:r>
+        <w:t>oneline</w:t>
+      </w:r>
+      <w:proofErr w:type="spellEnd"/>
+      <w:r>
+        <w:t xml:space="preserve"> --graph --all &gt; git_log_proof.txt'. This demonstrates the complete sequential feature branching and merge timeline across all three developers.</w:t>
       </w:r>
     </w:p>
     <w:tbl>
@@ -2852,7 +3103,25 @@
                 <w:color w:val="E2E8F0"/>
                 <w:sz w:val="17"/>
               </w:rPr>
-              <w:t>*   d242a8f Merge branch 'mymitz' Update documents</w:t>
+              <w:t>*   d242a8f Merge branch '</w:t>
+            </w:r>
+            <w:proofErr w:type="spellStart"/>
+            <w:r>
+              <w:rPr>
+                <w:rFonts w:ascii="Courier New" w:hAnsi="Courier New"/>
+                <w:color w:val="E2E8F0"/>
+                <w:sz w:val="17"/>
+              </w:rPr>
+              <w:t>mymitz</w:t>
+            </w:r>
+            <w:proofErr w:type="spellEnd"/>
+            <w:r>
+              <w:rPr>
+                <w:rFonts w:ascii="Courier New" w:hAnsi="Courier New"/>
+                <w:color w:val="E2E8F0"/>
+                <w:sz w:val="17"/>
+              </w:rPr>
+              <w:t>' Update documents</w:t>
             </w:r>
           </w:p>
           <w:p>
@@ -3122,8 +3391,18 @@
                 <w:color w:val="E2E8F0"/>
                 <w:sz w:val="17"/>
               </w:rPr>
-              <w:t>* 8a11075 pfp</w:t>
-            </w:r>
+              <w:t xml:space="preserve">* 8a11075 </w:t>
+            </w:r>
+            <w:proofErr w:type="spellStart"/>
+            <w:r>
+              <w:rPr>
+                <w:rFonts w:ascii="Courier New" w:hAnsi="Courier New"/>
+                <w:color w:val="E2E8F0"/>
+                <w:sz w:val="17"/>
+              </w:rPr>
+              <w:t>pfp</w:t>
+            </w:r>
+            <w:proofErr w:type="spellEnd"/>
           </w:p>
           <w:p>
             <w:pPr>
@@ -3158,7 +3437,25 @@
                 <w:color w:val="E2E8F0"/>
                 <w:sz w:val="17"/>
               </w:rPr>
-              <w:t>* 65b1dc5 Create Ni-Git.code-workspace</w:t>
+              <w:t>* 65b1dc5 Create Ni-</w:t>
+            </w:r>
+            <w:proofErr w:type="spellStart"/>
+            <w:r>
+              <w:rPr>
+                <w:rFonts w:ascii="Courier New" w:hAnsi="Courier New"/>
+                <w:color w:val="E2E8F0"/>
+                <w:sz w:val="17"/>
+              </w:rPr>
+              <w:t>Git.code</w:t>
+            </w:r>
+            <w:proofErr w:type="spellEnd"/>
+            <w:r>
+              <w:rPr>
+                <w:rFonts w:ascii="Courier New" w:hAnsi="Courier New"/>
+                <w:color w:val="E2E8F0"/>
+                <w:sz w:val="17"/>
+              </w:rPr>
+              <w:t>-workspace</w:t>
             </w:r>
           </w:p>
           <w:p>
@@ -3176,7 +3473,25 @@
                 <w:color w:val="E2E8F0"/>
                 <w:sz w:val="17"/>
               </w:rPr>
-              <w:t>* c0cf354 Small change and update of my profile, no major changes yet</w:t>
+              <w:t xml:space="preserve">* c0cf354 </w:t>
+            </w:r>
+            <w:proofErr w:type="gramStart"/>
+            <w:r>
+              <w:rPr>
+                <w:rFonts w:ascii="Courier New" w:hAnsi="Courier New"/>
+                <w:color w:val="E2E8F0"/>
+                <w:sz w:val="17"/>
+              </w:rPr>
+              <w:t>Small</w:t>
+            </w:r>
+            <w:proofErr w:type="gramEnd"/>
+            <w:r>
+              <w:rPr>
+                <w:rFonts w:ascii="Courier New" w:hAnsi="Courier New"/>
+                <w:color w:val="E2E8F0"/>
+                <w:sz w:val="17"/>
+              </w:rPr>
+              <w:t xml:space="preserve"> change and update of my profile, no major changes yet</w:t>
             </w:r>
           </w:p>
           <w:p>
@@ -3215,8 +3530,8 @@
     </w:tbl>
     <w:p/>
     <w:sectPr>
-      <w:headerReference w:type="default" r:id="rId16"/>
-      <w:footerReference w:type="default" r:id="rId17"/>
+      <w:headerReference w:type="default" r:id="rId15"/>
+      <w:footerReference w:type="default" r:id="rId16"/>
       <w:pgSz w:w="12240" w:h="15840"/>
       <w:pgMar w:top="1440" w:right="1440" w:bottom="1440" w:left="1440" w:header="720" w:footer="720" w:gutter="0"/>
       <w:cols w:space="720"/>

</xml_diff>

<commit_message>
docs(PDF): final update on commit SHA in section 5 and appendix; change date of submission
</commit_message>
<xml_diff>
--- a/CCCS106_Lab01_Report_Barandon_Borja_Musa.docx
+++ b/CCCS106_Lab01_Report_Barandon_Borja_Musa.docx
@@ -153,23 +153,7 @@
                 <w:color w:val="0F172A"/>
                 <w:sz w:val="19"/>
               </w:rPr>
-              <w:t xml:space="preserve">Group No. [ </w:t>
-            </w:r>
-            <w:proofErr w:type="gramStart"/>
-            <w:r>
-              <w:rPr>
-                <w:color w:val="0F172A"/>
-                <w:sz w:val="19"/>
-              </w:rPr>
-              <w:t>2 ]</w:t>
-            </w:r>
-            <w:proofErr w:type="gramEnd"/>
-            <w:r>
-              <w:rPr>
-                <w:color w:val="0F172A"/>
-                <w:sz w:val="19"/>
-              </w:rPr>
-              <w:t xml:space="preserve">  (Ni-Git)</w:t>
+              <w:t>Group No. [ 2 ]  (Ni-Git)</w:t>
             </w:r>
           </w:p>
         </w:tc>
@@ -229,24 +213,22 @@
                 <w:color w:val="0F172A"/>
                 <w:sz w:val="19"/>
               </w:rPr>
-              <w:t>September 09</w:t>
+              <w:t xml:space="preserve">September </w:t>
             </w:r>
             <w:r>
               <w:rPr>
                 <w:color w:val="0F172A"/>
                 <w:sz w:val="19"/>
               </w:rPr>
-              <w:t xml:space="preserve">, </w:t>
-            </w:r>
-            <w:proofErr w:type="gramStart"/>
+              <w:t>10</w:t>
+            </w:r>
             <w:r>
               <w:rPr>
                 <w:color w:val="0F172A"/>
                 <w:sz w:val="19"/>
               </w:rPr>
-              <w:t>2026 ]</w:t>
-            </w:r>
-            <w:proofErr w:type="gramEnd"/>
+              <w:t>, 2026 ]</w:t>
+            </w:r>
           </w:p>
         </w:tc>
       </w:tr>
@@ -468,17 +450,8 @@
                 <w:b/>
                 <w:sz w:val="18"/>
               </w:rPr>
-              <w:t xml:space="preserve">[ Borja, Edmar </w:t>
-            </w:r>
-            <w:proofErr w:type="gramStart"/>
-            <w:r>
-              <w:rPr>
-                <w:b/>
-                <w:sz w:val="18"/>
-              </w:rPr>
-              <w:t>B. ]</w:t>
-            </w:r>
-            <w:proofErr w:type="gramEnd"/>
+              <w:t>[ Borja, Edmar B. ]</w:t>
+            </w:r>
           </w:p>
         </w:tc>
         <w:tc>
@@ -582,23 +555,7 @@
                 <w:b/>
                 <w:sz w:val="18"/>
               </w:rPr>
-              <w:t xml:space="preserve">[ Barandon, </w:t>
-            </w:r>
-            <w:proofErr w:type="spellStart"/>
-            <w:r>
-              <w:rPr>
-                <w:b/>
-                <w:sz w:val="18"/>
-              </w:rPr>
-              <w:t>Noelee</w:t>
-            </w:r>
-            <w:proofErr w:type="spellEnd"/>
-            <w:r>
-              <w:rPr>
-                <w:b/>
-                <w:sz w:val="18"/>
-              </w:rPr>
-              <w:t xml:space="preserve"> Anthony S.]</w:t>
+              <w:t>[ Barandon, Noelee Anthony S.]</w:t>
             </w:r>
           </w:p>
         </w:tc>
@@ -703,17 +660,8 @@
                 <w:b/>
                 <w:sz w:val="18"/>
               </w:rPr>
-              <w:t xml:space="preserve">[ Musa, Eduardo Gabriel </w:t>
-            </w:r>
-            <w:proofErr w:type="gramStart"/>
-            <w:r>
-              <w:rPr>
-                <w:b/>
-                <w:sz w:val="18"/>
-              </w:rPr>
-              <w:t>S. ]</w:t>
-            </w:r>
-            <w:proofErr w:type="gramEnd"/>
+              <w:t>[ Musa, Eduardo Gabriel S. ]</w:t>
+            </w:r>
           </w:p>
         </w:tc>
         <w:tc>
@@ -948,36 +896,7 @@
         <w:jc w:val="both"/>
       </w:pPr>
       <w:r>
-        <w:t>Pre-flight workstation audit executed via 'python verify_setup.py' inside the active virtual environment (.</w:t>
-      </w:r>
-      <w:proofErr w:type="spellStart"/>
-      <w:r>
-        <w:t>venv</w:t>
-      </w:r>
-      <w:proofErr w:type="spellEnd"/>
-      <w:r>
-        <w:t xml:space="preserve">). All six (6) audit checks must report [PASS] verifying Python 3.10+, </w:t>
-      </w:r>
-      <w:proofErr w:type="spellStart"/>
-      <w:r>
-        <w:t>virtualenv</w:t>
-      </w:r>
-      <w:proofErr w:type="spellEnd"/>
-      <w:r>
-        <w:t xml:space="preserve"> isolation, Flet SDK v0.86.5+, Git binary detection, configured institutional user identity, </w:t>
-      </w:r>
-      <w:proofErr w:type="gramStart"/>
-      <w:r>
-        <w:t>and .</w:t>
-      </w:r>
-      <w:proofErr w:type="spellStart"/>
-      <w:r>
-        <w:t>gitignore</w:t>
-      </w:r>
-      <w:proofErr w:type="spellEnd"/>
-      <w:proofErr w:type="gramEnd"/>
-      <w:r>
-        <w:t xml:space="preserve"> hygiene.</w:t>
+        <w:t>Pre-flight workstation audit executed via 'python verify_setup.py' inside the active virtual environment (.venv). All six (6) audit checks must report [PASS] verifying Python 3.10+, virtualenv isolation, Flet SDK v0.86.5+, Git binary detection, configured institutional user identity, and .gitignore hygiene.</w:t>
       </w:r>
     </w:p>
     <w:tbl>
@@ -1083,20 +1002,7 @@
       </w:pPr>
       <w:r>
         <w:lastRenderedPageBreak/>
-        <w:t xml:space="preserve">Section 3: Git Working Tree Cleanliness </w:t>
-      </w:r>
-      <w:proofErr w:type="gramStart"/>
-      <w:r>
-        <w:t>&amp; .</w:t>
-      </w:r>
-      <w:proofErr w:type="spellStart"/>
-      <w:r>
-        <w:t>gitignore</w:t>
-      </w:r>
-      <w:proofErr w:type="spellEnd"/>
-      <w:proofErr w:type="gramEnd"/>
-      <w:r>
-        <w:t xml:space="preserve"> Audit</w:t>
+        <w:t>Section 3: Git Working Tree Cleanliness &amp; .gitignore Audit</w:t>
       </w:r>
     </w:p>
     <w:p>
@@ -1105,28 +1011,7 @@
         <w:jc w:val="both"/>
       </w:pPr>
       <w:r>
-        <w:t xml:space="preserve">Demonstration of repository hygiene. The screenshot proves that the working tree is clean with zero uncommitted changes, and </w:t>
-      </w:r>
-      <w:proofErr w:type="gramStart"/>
-      <w:r>
-        <w:t>that .</w:t>
-      </w:r>
-      <w:proofErr w:type="spellStart"/>
-      <w:r>
-        <w:t>venv</w:t>
-      </w:r>
-      <w:proofErr w:type="spellEnd"/>
-      <w:proofErr w:type="gramEnd"/>
-      <w:r>
-        <w:t>/ is completely untracked (verified by running 'git ls-files .</w:t>
-      </w:r>
-      <w:proofErr w:type="spellStart"/>
-      <w:r>
-        <w:t>venv</w:t>
-      </w:r>
-      <w:proofErr w:type="spellEnd"/>
-      <w:r>
-        <w:t>', returning empty output).</w:t>
+        <w:t>Demonstration of repository hygiene. The screenshot proves that the working tree is clean with zero uncommitted changes, and that .venv/ is completely untracked (verified by running 'git ls-files .venv', returning empty output).</w:t>
       </w:r>
     </w:p>
     <w:tbl>
@@ -1221,32 +1106,7 @@
           <w:b/>
           <w:sz w:val="19"/>
         </w:rPr>
-        <w:t xml:space="preserve">Figure 3: Git Working Tree Cleanliness </w:t>
-      </w:r>
-      <w:proofErr w:type="gramStart"/>
-      <w:r>
-        <w:rPr>
-          <w:b/>
-          <w:sz w:val="19"/>
-        </w:rPr>
-        <w:t>&amp; .</w:t>
-      </w:r>
-      <w:proofErr w:type="spellStart"/>
-      <w:r>
-        <w:rPr>
-          <w:b/>
-          <w:sz w:val="19"/>
-        </w:rPr>
-        <w:t>gitignore</w:t>
-      </w:r>
-      <w:proofErr w:type="spellEnd"/>
-      <w:proofErr w:type="gramEnd"/>
-      <w:r>
-        <w:rPr>
-          <w:b/>
-          <w:sz w:val="19"/>
-        </w:rPr>
-        <w:t xml:space="preserve"> Hygiene Proof</w:t>
+        <w:t>Figure 3: Git Working Tree Cleanliness &amp; .gitignore Hygiene Proof</w:t>
       </w:r>
     </w:p>
     <w:p>
@@ -1763,17 +1623,8 @@
                 <w:b/>
                 <w:sz w:val="17"/>
               </w:rPr>
-              <w:t xml:space="preserve">[ Borja, Edmar </w:t>
-            </w:r>
-            <w:proofErr w:type="gramStart"/>
-            <w:r>
-              <w:rPr>
-                <w:b/>
-                <w:sz w:val="17"/>
-              </w:rPr>
-              <w:t>B. ]</w:t>
-            </w:r>
-            <w:proofErr w:type="gramEnd"/>
+              <w:t>[ Borja, Edmar B. ]</w:t>
+            </w:r>
           </w:p>
         </w:tc>
         <w:tc>
@@ -1999,6 +1850,66 @@
               <w:rPr>
                 <w:sz w:val="17"/>
               </w:rPr>
+              <w:t>,</w:t>
+            </w:r>
+          </w:p>
+          <w:p>
+            <w:pPr>
+              <w:spacing w:after="0"/>
+              <w:rPr>
+                <w:sz w:val="17"/>
+              </w:rPr>
+            </w:pPr>
+            <w:r>
+              <w:rPr>
+                <w:sz w:val="17"/>
+              </w:rPr>
+              <w:t>9286b34</w:t>
+            </w:r>
+            <w:r>
+              <w:rPr>
+                <w:sz w:val="17"/>
+              </w:rPr>
+              <w:t>,</w:t>
+            </w:r>
+          </w:p>
+          <w:p>
+            <w:pPr>
+              <w:spacing w:after="0"/>
+              <w:rPr>
+                <w:sz w:val="17"/>
+              </w:rPr>
+            </w:pPr>
+            <w:r>
+              <w:rPr>
+                <w:sz w:val="17"/>
+              </w:rPr>
+              <w:t>3b962da</w:t>
+            </w:r>
+            <w:r>
+              <w:rPr>
+                <w:sz w:val="17"/>
+              </w:rPr>
+              <w:t>,</w:t>
+            </w:r>
+          </w:p>
+          <w:p>
+            <w:pPr>
+              <w:spacing w:after="0"/>
+              <w:rPr>
+                <w:sz w:val="17"/>
+              </w:rPr>
+            </w:pPr>
+            <w:r>
+              <w:rPr>
+                <w:sz w:val="17"/>
+              </w:rPr>
+              <w:t>74bc14b</w:t>
+            </w:r>
+            <w:r>
+              <w:rPr>
+                <w:sz w:val="17"/>
+              </w:rPr>
               <w:t>]</w:t>
             </w:r>
           </w:p>
@@ -2023,29 +1934,7 @@
               <w:rPr>
                 <w:sz w:val="17"/>
               </w:rPr>
-              <w:t xml:space="preserve">Initialized repo, </w:t>
-            </w:r>
-            <w:proofErr w:type="gramStart"/>
-            <w:r>
-              <w:rPr>
-                <w:sz w:val="17"/>
-              </w:rPr>
-              <w:t>setup .</w:t>
-            </w:r>
-            <w:proofErr w:type="spellStart"/>
-            <w:r>
-              <w:rPr>
-                <w:sz w:val="17"/>
-              </w:rPr>
-              <w:t>gitignore</w:t>
-            </w:r>
-            <w:proofErr w:type="spellEnd"/>
-            <w:proofErr w:type="gramEnd"/>
-            <w:r>
-              <w:rPr>
-                <w:sz w:val="17"/>
-              </w:rPr>
-              <w:t>, integrated card 1, configured remote repo &amp; pushed main, dev-1 profile update.</w:t>
+              <w:t>Initialized repo, setup .gitignore, integrated card 1, configured remote repo &amp; pushed main, dev-1 profile update.</w:t>
             </w:r>
           </w:p>
         </w:tc>
@@ -2074,23 +1963,7 @@
                 <w:b/>
                 <w:sz w:val="17"/>
               </w:rPr>
-              <w:t xml:space="preserve">[ Barandon, </w:t>
-            </w:r>
-            <w:proofErr w:type="spellStart"/>
-            <w:r>
-              <w:rPr>
-                <w:b/>
-                <w:sz w:val="17"/>
-              </w:rPr>
-              <w:t>Noelee</w:t>
-            </w:r>
-            <w:proofErr w:type="spellEnd"/>
-            <w:r>
-              <w:rPr>
-                <w:b/>
-                <w:sz w:val="17"/>
-              </w:rPr>
-              <w:t xml:space="preserve"> Anthony S.]</w:t>
+              <w:t>[ Barandon, Noelee Anthony S.]</w:t>
             </w:r>
           </w:p>
         </w:tc>
@@ -2405,17 +2278,8 @@
                 <w:b/>
                 <w:sz w:val="17"/>
               </w:rPr>
-              <w:t xml:space="preserve">[ Musa, Eduardo Gabriel </w:t>
-            </w:r>
-            <w:proofErr w:type="gramStart"/>
-            <w:r>
-              <w:rPr>
-                <w:b/>
-                <w:sz w:val="17"/>
-              </w:rPr>
-              <w:t>S. ]</w:t>
-            </w:r>
-            <w:proofErr w:type="gramEnd"/>
+              <w:t>[ Musa, Eduardo Gabriel S. ]</w:t>
+            </w:r>
           </w:p>
         </w:tc>
         <w:tc>
@@ -2463,14 +2327,12 @@
             <w:pPr>
               <w:spacing w:after="0"/>
             </w:pPr>
-            <w:proofErr w:type="spellStart"/>
             <w:r>
               <w:rPr>
                 <w:sz w:val="17"/>
               </w:rPr>
               <w:t>mymitz</w:t>
             </w:r>
-            <w:proofErr w:type="spellEnd"/>
           </w:p>
         </w:tc>
         <w:tc>
@@ -2735,7 +2597,73 @@
           <w:p>
             <w:pPr>
               <w:spacing w:after="0"/>
-            </w:pPr>
+              <w:rPr>
+                <w:sz w:val="17"/>
+              </w:rPr>
+            </w:pPr>
+            <w:r>
+              <w:rPr>
+                <w:sz w:val="17"/>
+              </w:rPr>
+              <w:t>7e5508f</w:t>
+            </w:r>
+            <w:r>
+              <w:rPr>
+                <w:sz w:val="17"/>
+              </w:rPr>
+              <w:t>,</w:t>
+            </w:r>
+          </w:p>
+          <w:p>
+            <w:pPr>
+              <w:spacing w:after="0"/>
+              <w:rPr>
+                <w:sz w:val="17"/>
+              </w:rPr>
+            </w:pPr>
+            <w:r>
+              <w:rPr>
+                <w:sz w:val="17"/>
+              </w:rPr>
+              <w:t>66fc68d</w:t>
+            </w:r>
+            <w:r>
+              <w:rPr>
+                <w:sz w:val="17"/>
+              </w:rPr>
+              <w:t>,</w:t>
+            </w:r>
+          </w:p>
+          <w:p>
+            <w:pPr>
+              <w:spacing w:after="0"/>
+              <w:rPr>
+                <w:sz w:val="17"/>
+              </w:rPr>
+            </w:pPr>
+            <w:r>
+              <w:rPr>
+                <w:sz w:val="17"/>
+              </w:rPr>
+              <w:t>62fe7a5</w:t>
+            </w:r>
+            <w:r>
+              <w:rPr>
+                <w:sz w:val="17"/>
+              </w:rPr>
+              <w:t>,</w:t>
+            </w:r>
+          </w:p>
+          <w:p>
+            <w:pPr>
+              <w:spacing w:after="0"/>
+            </w:pPr>
+            <w:r>
+              <w:rPr>
+                <w:sz w:val="17"/>
+              </w:rPr>
+              <w:t>8e914b3</w:t>
+            </w:r>
             <w:r>
               <w:rPr>
                 <w:sz w:val="17"/>
@@ -2777,6 +2705,7 @@
         <w:jc w:val="both"/>
       </w:pPr>
       <w:r>
+        <w:lastRenderedPageBreak/>
         <w:t>Individual Technical Reflections</w:t>
       </w:r>
     </w:p>
@@ -2811,16 +2740,7 @@
           <w:color w:val="64748B"/>
           <w:sz w:val="19"/>
         </w:rPr>
-        <w:t xml:space="preserve">I learned that virtual environments help keep projects isolated and prevent conflicts between dependencies. I also learned that configuration rules keep the project organized and make sure everyone follows </w:t>
-      </w:r>
-      <w:r>
-        <w:rPr>
-          <w:i/>
-          <w:color w:val="64748B"/>
-          <w:sz w:val="19"/>
-        </w:rPr>
-        <w:lastRenderedPageBreak/>
-        <w:t>the same setup. For GitHub, I learned how to properly coordinate repository invitations and give the right access to team members. Overall, clear setup and communication make teamwork easier and more efficient.</w:t>
+        <w:t>I learned that virtual environments help keep projects isolated and prevent conflicts between dependencies. I also learned that configuration rules keep the project organized and make sure everyone follows the same setup. For GitHub, I learned how to properly coordinate repository invitations and give the right access to team members. Overall, clear setup and communication make teamwork easier and more efficient.</w:t>
       </w:r>
     </w:p>
     <w:p>
@@ -2907,35 +2827,7 @@
           <w:color w:val="64748B"/>
           <w:sz w:val="19"/>
         </w:rPr>
-        <w:t xml:space="preserve">. How to </w:t>
-      </w:r>
-      <w:proofErr w:type="gramStart"/>
-      <w:r>
-        <w:rPr>
-          <w:i/>
-          <w:color w:val="64748B"/>
-          <w:sz w:val="19"/>
-        </w:rPr>
-        <w:t>update .</w:t>
-      </w:r>
-      <w:proofErr w:type="spellStart"/>
-      <w:r>
-        <w:rPr>
-          <w:i/>
-          <w:color w:val="64748B"/>
-          <w:sz w:val="19"/>
-        </w:rPr>
-        <w:t>gitignore</w:t>
-      </w:r>
-      <w:proofErr w:type="spellEnd"/>
-      <w:proofErr w:type="gramEnd"/>
-      <w:r>
-        <w:rPr>
-          <w:i/>
-          <w:color w:val="64748B"/>
-          <w:sz w:val="19"/>
-        </w:rPr>
-        <w:t>, commit properly</w:t>
+        <w:t>. How to update .gitignore, commit properly</w:t>
       </w:r>
       <w:r>
         <w:rPr>
@@ -2943,25 +2835,7 @@
           <w:color w:val="64748B"/>
           <w:sz w:val="19"/>
         </w:rPr>
-        <w:t xml:space="preserve">, and push to the </w:t>
-      </w:r>
-      <w:proofErr w:type="spellStart"/>
-      <w:r>
-        <w:rPr>
-          <w:i/>
-          <w:color w:val="64748B"/>
-          <w:sz w:val="19"/>
-        </w:rPr>
-        <w:t>Github</w:t>
-      </w:r>
-      <w:proofErr w:type="spellEnd"/>
-      <w:r>
-        <w:rPr>
-          <w:i/>
-          <w:color w:val="64748B"/>
-          <w:sz w:val="19"/>
-        </w:rPr>
-        <w:t xml:space="preserve"> repository. </w:t>
+        <w:t xml:space="preserve">, and push to the Github repository. </w:t>
       </w:r>
       <w:r>
         <w:rPr>
@@ -2969,25 +2843,7 @@
           <w:color w:val="64748B"/>
           <w:sz w:val="19"/>
         </w:rPr>
-        <w:t xml:space="preserve">I also learn about the naming conventions for committing to </w:t>
-      </w:r>
-      <w:proofErr w:type="spellStart"/>
-      <w:r>
-        <w:rPr>
-          <w:i/>
-          <w:color w:val="64748B"/>
-          <w:sz w:val="19"/>
-        </w:rPr>
-        <w:t>Github</w:t>
-      </w:r>
-      <w:proofErr w:type="spellEnd"/>
-      <w:r>
-        <w:rPr>
-          <w:i/>
-          <w:color w:val="64748B"/>
-          <w:sz w:val="19"/>
-        </w:rPr>
-        <w:t xml:space="preserve">, I also learn about the workflow in a dev team. I have gained knowledge on what it is mean to become a QA, and how to ensure </w:t>
+        <w:t xml:space="preserve">I also learn about the naming conventions for committing to Github, I also learn about the workflow in a dev team. I have gained knowledge on what it is mean to become a QA, and how to ensure </w:t>
       </w:r>
       <w:r>
         <w:rPr>
@@ -3003,25 +2859,7 @@
           <w:color w:val="64748B"/>
           <w:sz w:val="19"/>
         </w:rPr>
-        <w:t xml:space="preserve">that is related to </w:t>
-      </w:r>
-      <w:proofErr w:type="spellStart"/>
-      <w:r>
-        <w:rPr>
-          <w:i/>
-          <w:color w:val="64748B"/>
-          <w:sz w:val="19"/>
-        </w:rPr>
-        <w:t>Github</w:t>
-      </w:r>
-      <w:proofErr w:type="spellEnd"/>
-      <w:r>
-        <w:rPr>
-          <w:i/>
-          <w:color w:val="64748B"/>
-          <w:sz w:val="19"/>
-        </w:rPr>
-        <w:t xml:space="preserve"> and the workflow procedure of </w:t>
+        <w:t xml:space="preserve">that is related to Github and the workflow procedure of </w:t>
       </w:r>
       <w:r>
         <w:rPr>
@@ -3052,15 +2890,7 @@
     </w:p>
     <w:p>
       <w:r>
-        <w:t>Verbatim ASCII commit history exported using 'git log --</w:t>
-      </w:r>
-      <w:proofErr w:type="spellStart"/>
-      <w:r>
-        <w:t>oneline</w:t>
-      </w:r>
-      <w:proofErr w:type="spellEnd"/>
-      <w:r>
-        <w:t xml:space="preserve"> --graph --all &gt; git_log_proof.txt'. This demonstrates the complete sequential feature branching and merge timeline across all three developers.</w:t>
+        <w:t>Verbatim ASCII commit history exported using 'git log --oneline --graph --all &gt; git_log_proof.txt'. This demonstrates the complete sequential feature branching and merge timeline across all three developers.</w:t>
       </w:r>
     </w:p>
     <w:tbl>
@@ -3103,25 +2933,7 @@
                 <w:color w:val="E2E8F0"/>
                 <w:sz w:val="17"/>
               </w:rPr>
-              <w:t>*   d242a8f Merge branch '</w:t>
-            </w:r>
-            <w:proofErr w:type="spellStart"/>
-            <w:r>
-              <w:rPr>
-                <w:rFonts w:ascii="Courier New" w:hAnsi="Courier New"/>
-                <w:color w:val="E2E8F0"/>
-                <w:sz w:val="17"/>
-              </w:rPr>
-              <w:t>mymitz</w:t>
-            </w:r>
-            <w:proofErr w:type="spellEnd"/>
-            <w:r>
-              <w:rPr>
-                <w:rFonts w:ascii="Courier New" w:hAnsi="Courier New"/>
-                <w:color w:val="E2E8F0"/>
-                <w:sz w:val="17"/>
-              </w:rPr>
-              <w:t>' Update documents</w:t>
+              <w:t>*   8e914b3 Merge pull request #2 from edborja/mymitz</w:t>
             </w:r>
           </w:p>
           <w:p>
@@ -3157,79 +2969,7 @@
                 <w:color w:val="E2E8F0"/>
                 <w:sz w:val="17"/>
               </w:rPr>
-              <w:t>| * 6ce1b08 docs(pdf): Initial update on contributions in section 5</w:t>
-            </w:r>
-          </w:p>
-          <w:p>
-            <w:pPr>
-              <w:spacing w:after="0"/>
-              <w:rPr>
-                <w:rFonts w:ascii="Courier New" w:hAnsi="Courier New"/>
-                <w:color w:val="E2E8F0"/>
-                <w:sz w:val="17"/>
-              </w:rPr>
-            </w:pPr>
-            <w:r>
-              <w:rPr>
-                <w:rFonts w:ascii="Courier New" w:hAnsi="Courier New"/>
-                <w:color w:val="E2E8F0"/>
-                <w:sz w:val="17"/>
-              </w:rPr>
-              <w:t>| * 1e38b80 docs(pdf): Initial update on Appendix</w:t>
-            </w:r>
-          </w:p>
-          <w:p>
-            <w:pPr>
-              <w:spacing w:after="0"/>
-              <w:rPr>
-                <w:rFonts w:ascii="Courier New" w:hAnsi="Courier New"/>
-                <w:color w:val="E2E8F0"/>
-                <w:sz w:val="17"/>
-              </w:rPr>
-            </w:pPr>
-            <w:r>
-              <w:rPr>
-                <w:rFonts w:ascii="Courier New" w:hAnsi="Courier New"/>
-                <w:color w:val="E2E8F0"/>
-                <w:sz w:val="17"/>
-              </w:rPr>
-              <w:t>| * 75e0006 docs(pdf): Update screenshots on Section 1-3</w:t>
-            </w:r>
-          </w:p>
-          <w:p>
-            <w:pPr>
-              <w:spacing w:after="0"/>
-              <w:rPr>
-                <w:rFonts w:ascii="Courier New" w:hAnsi="Courier New"/>
-                <w:color w:val="E2E8F0"/>
-                <w:sz w:val="17"/>
-              </w:rPr>
-            </w:pPr>
-            <w:r>
-              <w:rPr>
-                <w:rFonts w:ascii="Courier New" w:hAnsi="Courier New"/>
-                <w:color w:val="E2E8F0"/>
-                <w:sz w:val="17"/>
-              </w:rPr>
-              <w:t>* | 132d036 docs(pdf): Update on contribution in section 5</w:t>
-            </w:r>
-          </w:p>
-          <w:p>
-            <w:pPr>
-              <w:spacing w:after="0"/>
-              <w:rPr>
-                <w:rFonts w:ascii="Courier New" w:hAnsi="Courier New"/>
-                <w:color w:val="E2E8F0"/>
-                <w:sz w:val="17"/>
-              </w:rPr>
-            </w:pPr>
-            <w:r>
-              <w:rPr>
-                <w:rFonts w:ascii="Courier New" w:hAnsi="Courier New"/>
-                <w:color w:val="E2E8F0"/>
-                <w:sz w:val="17"/>
-              </w:rPr>
-              <w:t>| | *   6436231 Resolve Word doc conflict</w:t>
+              <w:t>| | *   470e36c Merge branch 'mymitz'</w:t>
             </w:r>
           </w:p>
           <w:p>
@@ -3265,6 +3005,222 @@
                 <w:color w:val="E2E8F0"/>
                 <w:sz w:val="17"/>
               </w:rPr>
+              <w:t xml:space="preserve">| | |/  </w:t>
+            </w:r>
+          </w:p>
+          <w:p>
+            <w:pPr>
+              <w:spacing w:after="0"/>
+              <w:rPr>
+                <w:rFonts w:ascii="Courier New" w:hAnsi="Courier New"/>
+                <w:color w:val="E2E8F0"/>
+                <w:sz w:val="17"/>
+              </w:rPr>
+            </w:pPr>
+            <w:r>
+              <w:rPr>
+                <w:rFonts w:ascii="Courier New" w:hAnsi="Courier New"/>
+                <w:color w:val="E2E8F0"/>
+                <w:sz w:val="17"/>
+              </w:rPr>
+              <w:t xml:space="preserve">| |/|   </w:t>
+            </w:r>
+          </w:p>
+          <w:p>
+            <w:pPr>
+              <w:spacing w:after="0"/>
+              <w:rPr>
+                <w:rFonts w:ascii="Courier New" w:hAnsi="Courier New"/>
+                <w:color w:val="E2E8F0"/>
+                <w:sz w:val="17"/>
+              </w:rPr>
+            </w:pPr>
+            <w:r>
+              <w:rPr>
+                <w:rFonts w:ascii="Courier New" w:hAnsi="Courier New"/>
+                <w:color w:val="E2E8F0"/>
+                <w:sz w:val="17"/>
+              </w:rPr>
+              <w:t>| * | 62fe7a5 docs(PDF): Update on section screenshot</w:t>
+            </w:r>
+          </w:p>
+          <w:p>
+            <w:pPr>
+              <w:spacing w:after="0"/>
+              <w:rPr>
+                <w:rFonts w:ascii="Courier New" w:hAnsi="Courier New"/>
+                <w:color w:val="E2E8F0"/>
+                <w:sz w:val="17"/>
+              </w:rPr>
+            </w:pPr>
+            <w:r>
+              <w:rPr>
+                <w:rFonts w:ascii="Courier New" w:hAnsi="Courier New"/>
+                <w:color w:val="E2E8F0"/>
+                <w:sz w:val="17"/>
+              </w:rPr>
+              <w:t>| * |   66fc68d Merge branch 'main' of https://github.com/edborja/Laboratory-Task-Professional-Development-Environment-Setup-Collaborative-Git-Workflow into mymitz</w:t>
+            </w:r>
+          </w:p>
+          <w:p>
+            <w:pPr>
+              <w:spacing w:after="0"/>
+              <w:rPr>
+                <w:rFonts w:ascii="Courier New" w:hAnsi="Courier New"/>
+                <w:color w:val="E2E8F0"/>
+                <w:sz w:val="17"/>
+              </w:rPr>
+            </w:pPr>
+            <w:r>
+              <w:rPr>
+                <w:rFonts w:ascii="Courier New" w:hAnsi="Courier New"/>
+                <w:color w:val="E2E8F0"/>
+                <w:sz w:val="17"/>
+              </w:rPr>
+              <w:t xml:space="preserve">| |\ \  </w:t>
+            </w:r>
+          </w:p>
+          <w:p>
+            <w:pPr>
+              <w:spacing w:after="0"/>
+              <w:rPr>
+                <w:rFonts w:ascii="Courier New" w:hAnsi="Courier New"/>
+                <w:color w:val="E2E8F0"/>
+                <w:sz w:val="17"/>
+              </w:rPr>
+            </w:pPr>
+            <w:r>
+              <w:rPr>
+                <w:rFonts w:ascii="Courier New" w:hAnsi="Courier New"/>
+                <w:color w:val="E2E8F0"/>
+                <w:sz w:val="17"/>
+              </w:rPr>
+              <w:t xml:space="preserve">| |/ /  </w:t>
+            </w:r>
+          </w:p>
+          <w:p>
+            <w:pPr>
+              <w:spacing w:after="0"/>
+              <w:rPr>
+                <w:rFonts w:ascii="Courier New" w:hAnsi="Courier New"/>
+                <w:color w:val="E2E8F0"/>
+                <w:sz w:val="17"/>
+              </w:rPr>
+            </w:pPr>
+            <w:r>
+              <w:rPr>
+                <w:rFonts w:ascii="Courier New" w:hAnsi="Courier New"/>
+                <w:color w:val="E2E8F0"/>
+                <w:sz w:val="17"/>
+              </w:rPr>
+              <w:t xml:space="preserve">|/| |   </w:t>
+            </w:r>
+          </w:p>
+          <w:p>
+            <w:pPr>
+              <w:spacing w:after="0"/>
+              <w:rPr>
+                <w:rFonts w:ascii="Courier New" w:hAnsi="Courier New"/>
+                <w:color w:val="E2E8F0"/>
+                <w:sz w:val="17"/>
+              </w:rPr>
+            </w:pPr>
+            <w:r>
+              <w:rPr>
+                <w:rFonts w:ascii="Courier New" w:hAnsi="Courier New"/>
+                <w:color w:val="E2E8F0"/>
+                <w:sz w:val="17"/>
+              </w:rPr>
+              <w:t>| * | 7e5508f docs(PDF): Initial update on commit SHA in section 5</w:t>
+            </w:r>
+          </w:p>
+          <w:p>
+            <w:pPr>
+              <w:spacing w:after="0"/>
+              <w:rPr>
+                <w:rFonts w:ascii="Courier New" w:hAnsi="Courier New"/>
+                <w:color w:val="E2E8F0"/>
+                <w:sz w:val="17"/>
+              </w:rPr>
+            </w:pPr>
+            <w:r>
+              <w:rPr>
+                <w:rFonts w:ascii="Courier New" w:hAnsi="Courier New"/>
+                <w:color w:val="E2E8F0"/>
+                <w:sz w:val="17"/>
+              </w:rPr>
+              <w:t>| | * 99dea23 docs(PDF): update documents</w:t>
+            </w:r>
+          </w:p>
+          <w:p>
+            <w:pPr>
+              <w:spacing w:after="0"/>
+              <w:rPr>
+                <w:rFonts w:ascii="Courier New" w:hAnsi="Courier New"/>
+                <w:color w:val="E2E8F0"/>
+                <w:sz w:val="17"/>
+              </w:rPr>
+            </w:pPr>
+            <w:r>
+              <w:rPr>
+                <w:rFonts w:ascii="Courier New" w:hAnsi="Courier New"/>
+                <w:color w:val="E2E8F0"/>
+                <w:sz w:val="17"/>
+              </w:rPr>
+              <w:t>| | * b601642 docs(PDF): Initial update for commit SHA in section 5</w:t>
+            </w:r>
+          </w:p>
+          <w:p>
+            <w:pPr>
+              <w:spacing w:after="0"/>
+              <w:rPr>
+                <w:rFonts w:ascii="Courier New" w:hAnsi="Courier New"/>
+                <w:color w:val="E2E8F0"/>
+                <w:sz w:val="17"/>
+              </w:rPr>
+            </w:pPr>
+            <w:r>
+              <w:rPr>
+                <w:rFonts w:ascii="Courier New" w:hAnsi="Courier New"/>
+                <w:color w:val="E2E8F0"/>
+                <w:sz w:val="17"/>
+              </w:rPr>
+              <w:t>| | *   196d370 Merge branch 'main' of https://github.com/edborja/Laboratory-Task-Professional-Development-Environment-Setup-Collaborative-Git-Workflow</w:t>
+            </w:r>
+          </w:p>
+          <w:p>
+            <w:pPr>
+              <w:spacing w:after="0"/>
+              <w:rPr>
+                <w:rFonts w:ascii="Courier New" w:hAnsi="Courier New"/>
+                <w:color w:val="E2E8F0"/>
+                <w:sz w:val="17"/>
+              </w:rPr>
+            </w:pPr>
+            <w:r>
+              <w:rPr>
+                <w:rFonts w:ascii="Courier New" w:hAnsi="Courier New"/>
+                <w:color w:val="E2E8F0"/>
+                <w:sz w:val="17"/>
+              </w:rPr>
+              <w:t xml:space="preserve">| | |\  </w:t>
+            </w:r>
+          </w:p>
+          <w:p>
+            <w:pPr>
+              <w:spacing w:after="0"/>
+              <w:rPr>
+                <w:rFonts w:ascii="Courier New" w:hAnsi="Courier New"/>
+                <w:color w:val="E2E8F0"/>
+                <w:sz w:val="17"/>
+              </w:rPr>
+            </w:pPr>
+            <w:r>
+              <w:rPr>
+                <w:rFonts w:ascii="Courier New" w:hAnsi="Courier New"/>
+                <w:color w:val="E2E8F0"/>
+                <w:sz w:val="17"/>
+              </w:rPr>
               <w:t xml:space="preserve">| |_|/  </w:t>
             </w:r>
           </w:p>
@@ -3301,43 +3257,746 @@
                 <w:color w:val="E2E8F0"/>
                 <w:sz w:val="17"/>
               </w:rPr>
-              <w:t>* | | 5f1dcee docs(pdf): Update screenshots on Section 1-3</w:t>
-            </w:r>
-          </w:p>
-          <w:p>
-            <w:pPr>
-              <w:spacing w:after="0"/>
-              <w:rPr>
-                <w:rFonts w:ascii="Courier New" w:hAnsi="Courier New"/>
-                <w:color w:val="E2E8F0"/>
-                <w:sz w:val="17"/>
-              </w:rPr>
-            </w:pPr>
-            <w:r>
-              <w:rPr>
-                <w:rFonts w:ascii="Courier New" w:hAnsi="Courier New"/>
-                <w:color w:val="E2E8F0"/>
-                <w:sz w:val="17"/>
-              </w:rPr>
-              <w:t xml:space="preserve">|/ /  </w:t>
-            </w:r>
-          </w:p>
-          <w:p>
-            <w:pPr>
-              <w:spacing w:after="0"/>
-              <w:rPr>
-                <w:rFonts w:ascii="Courier New" w:hAnsi="Courier New"/>
-                <w:color w:val="E2E8F0"/>
-                <w:sz w:val="17"/>
-              </w:rPr>
-            </w:pPr>
-            <w:r>
-              <w:rPr>
-                <w:rFonts w:ascii="Courier New" w:hAnsi="Courier New"/>
-                <w:color w:val="E2E8F0"/>
-                <w:sz w:val="17"/>
-              </w:rPr>
-              <w:t>| * 12d6e12 Initial commit</w:t>
+              <w:t>* | |   74bc14b merge the main branch</w:t>
+            </w:r>
+          </w:p>
+          <w:p>
+            <w:pPr>
+              <w:spacing w:after="0"/>
+              <w:rPr>
+                <w:rFonts w:ascii="Courier New" w:hAnsi="Courier New"/>
+                <w:color w:val="E2E8F0"/>
+                <w:sz w:val="17"/>
+              </w:rPr>
+            </w:pPr>
+            <w:r>
+              <w:rPr>
+                <w:rFonts w:ascii="Courier New" w:hAnsi="Courier New"/>
+                <w:color w:val="E2E8F0"/>
+                <w:sz w:val="17"/>
+              </w:rPr>
+              <w:t xml:space="preserve">|\ \ \  </w:t>
+            </w:r>
+          </w:p>
+          <w:p>
+            <w:pPr>
+              <w:spacing w:after="0"/>
+              <w:rPr>
+                <w:rFonts w:ascii="Courier New" w:hAnsi="Courier New"/>
+                <w:color w:val="E2E8F0"/>
+                <w:sz w:val="17"/>
+              </w:rPr>
+            </w:pPr>
+            <w:r>
+              <w:rPr>
+                <w:rFonts w:ascii="Courier New" w:hAnsi="Courier New"/>
+                <w:color w:val="E2E8F0"/>
+                <w:sz w:val="17"/>
+              </w:rPr>
+              <w:t>* | | | 3b962da commit the changes</w:t>
+            </w:r>
+          </w:p>
+          <w:p>
+            <w:pPr>
+              <w:spacing w:after="0"/>
+              <w:rPr>
+                <w:rFonts w:ascii="Courier New" w:hAnsi="Courier New"/>
+                <w:color w:val="E2E8F0"/>
+                <w:sz w:val="17"/>
+              </w:rPr>
+            </w:pPr>
+            <w:r>
+              <w:rPr>
+                <w:rFonts w:ascii="Courier New" w:hAnsi="Courier New"/>
+                <w:color w:val="E2E8F0"/>
+                <w:sz w:val="17"/>
+              </w:rPr>
+              <w:t>* | | | 9286b34 Upload Github collaborators access screenshot to screenshots folder</w:t>
+            </w:r>
+          </w:p>
+          <w:p>
+            <w:pPr>
+              <w:spacing w:after="0"/>
+              <w:rPr>
+                <w:rFonts w:ascii="Courier New" w:hAnsi="Courier New"/>
+                <w:color w:val="E2E8F0"/>
+                <w:sz w:val="17"/>
+              </w:rPr>
+            </w:pPr>
+            <w:r>
+              <w:rPr>
+                <w:rFonts w:ascii="Courier New" w:hAnsi="Courier New"/>
+                <w:color w:val="E2E8F0"/>
+                <w:sz w:val="17"/>
+              </w:rPr>
+              <w:t>| | | * e03b005 Merge branch 'main' of https://github.com/edborja/Laboratory-Task-Professional-Development-Environment-Setup-Collaborative-Git-Workflow</w:t>
+            </w:r>
+          </w:p>
+          <w:p>
+            <w:pPr>
+              <w:spacing w:after="0"/>
+              <w:rPr>
+                <w:rFonts w:ascii="Courier New" w:hAnsi="Courier New"/>
+                <w:color w:val="E2E8F0"/>
+                <w:sz w:val="17"/>
+              </w:rPr>
+            </w:pPr>
+            <w:r>
+              <w:rPr>
+                <w:rFonts w:ascii="Courier New" w:hAnsi="Courier New"/>
+                <w:color w:val="E2E8F0"/>
+                <w:sz w:val="17"/>
+              </w:rPr>
+              <w:t xml:space="preserve">| | |/| </w:t>
+            </w:r>
+          </w:p>
+          <w:p>
+            <w:pPr>
+              <w:spacing w:after="0"/>
+              <w:rPr>
+                <w:rFonts w:ascii="Courier New" w:hAnsi="Courier New"/>
+                <w:color w:val="E2E8F0"/>
+                <w:sz w:val="17"/>
+              </w:rPr>
+            </w:pPr>
+            <w:r>
+              <w:rPr>
+                <w:rFonts w:ascii="Courier New" w:hAnsi="Courier New"/>
+                <w:color w:val="E2E8F0"/>
+                <w:sz w:val="17"/>
+              </w:rPr>
+              <w:t xml:space="preserve">| | |/  </w:t>
+            </w:r>
+          </w:p>
+          <w:p>
+            <w:pPr>
+              <w:spacing w:after="0"/>
+              <w:rPr>
+                <w:rFonts w:ascii="Courier New" w:hAnsi="Courier New"/>
+                <w:color w:val="E2E8F0"/>
+                <w:sz w:val="17"/>
+              </w:rPr>
+            </w:pPr>
+            <w:r>
+              <w:rPr>
+                <w:rFonts w:ascii="Courier New" w:hAnsi="Courier New"/>
+                <w:color w:val="E2E8F0"/>
+                <w:sz w:val="17"/>
+              </w:rPr>
+              <w:t xml:space="preserve">| |/|   </w:t>
+            </w:r>
+          </w:p>
+          <w:p>
+            <w:pPr>
+              <w:spacing w:after="0"/>
+              <w:rPr>
+                <w:rFonts w:ascii="Courier New" w:hAnsi="Courier New"/>
+                <w:color w:val="E2E8F0"/>
+                <w:sz w:val="17"/>
+              </w:rPr>
+            </w:pPr>
+            <w:r>
+              <w:rPr>
+                <w:rFonts w:ascii="Courier New" w:hAnsi="Courier New"/>
+                <w:color w:val="E2E8F0"/>
+                <w:sz w:val="17"/>
+              </w:rPr>
+              <w:t>| * |   3981b93 Screenshots</w:t>
+            </w:r>
+          </w:p>
+          <w:p>
+            <w:pPr>
+              <w:spacing w:after="0"/>
+              <w:rPr>
+                <w:rFonts w:ascii="Courier New" w:hAnsi="Courier New"/>
+                <w:color w:val="E2E8F0"/>
+                <w:sz w:val="17"/>
+              </w:rPr>
+            </w:pPr>
+            <w:r>
+              <w:rPr>
+                <w:rFonts w:ascii="Courier New" w:hAnsi="Courier New"/>
+                <w:color w:val="E2E8F0"/>
+                <w:sz w:val="17"/>
+              </w:rPr>
+              <w:t xml:space="preserve">| |\ \  </w:t>
+            </w:r>
+          </w:p>
+          <w:p>
+            <w:pPr>
+              <w:spacing w:after="0"/>
+              <w:rPr>
+                <w:rFonts w:ascii="Courier New" w:hAnsi="Courier New"/>
+                <w:color w:val="E2E8F0"/>
+                <w:sz w:val="17"/>
+              </w:rPr>
+            </w:pPr>
+            <w:r>
+              <w:rPr>
+                <w:rFonts w:ascii="Courier New" w:hAnsi="Courier New"/>
+                <w:color w:val="E2E8F0"/>
+                <w:sz w:val="17"/>
+              </w:rPr>
+              <w:t>| | * \   9989885 Merge pull request #1 from edborja/mymitz</w:t>
+            </w:r>
+          </w:p>
+          <w:p>
+            <w:pPr>
+              <w:spacing w:after="0"/>
+              <w:rPr>
+                <w:rFonts w:ascii="Courier New" w:hAnsi="Courier New"/>
+                <w:color w:val="E2E8F0"/>
+                <w:sz w:val="17"/>
+              </w:rPr>
+            </w:pPr>
+            <w:r>
+              <w:rPr>
+                <w:rFonts w:ascii="Courier New" w:hAnsi="Courier New"/>
+                <w:color w:val="E2E8F0"/>
+                <w:sz w:val="17"/>
+              </w:rPr>
+              <w:t xml:space="preserve">| | |\ \  </w:t>
+            </w:r>
+          </w:p>
+          <w:p>
+            <w:pPr>
+              <w:spacing w:after="0"/>
+              <w:rPr>
+                <w:rFonts w:ascii="Courier New" w:hAnsi="Courier New"/>
+                <w:color w:val="E2E8F0"/>
+                <w:sz w:val="17"/>
+              </w:rPr>
+            </w:pPr>
+            <w:r>
+              <w:rPr>
+                <w:rFonts w:ascii="Courier New" w:hAnsi="Courier New"/>
+                <w:color w:val="E2E8F0"/>
+                <w:sz w:val="17"/>
+              </w:rPr>
+              <w:t>| * | | | 3f378e8 SS</w:t>
+            </w:r>
+          </w:p>
+          <w:p>
+            <w:pPr>
+              <w:spacing w:after="0"/>
+              <w:rPr>
+                <w:rFonts w:ascii="Courier New" w:hAnsi="Courier New"/>
+                <w:color w:val="E2E8F0"/>
+                <w:sz w:val="17"/>
+              </w:rPr>
+            </w:pPr>
+            <w:r>
+              <w:rPr>
+                <w:rFonts w:ascii="Courier New" w:hAnsi="Courier New"/>
+                <w:color w:val="E2E8F0"/>
+                <w:sz w:val="17"/>
+              </w:rPr>
+              <w:t>| | | | *   15fdd97 Merge branch 'mymitz'</w:t>
+            </w:r>
+          </w:p>
+          <w:p>
+            <w:pPr>
+              <w:spacing w:after="0"/>
+              <w:rPr>
+                <w:rFonts w:ascii="Courier New" w:hAnsi="Courier New"/>
+                <w:color w:val="E2E8F0"/>
+                <w:sz w:val="17"/>
+              </w:rPr>
+            </w:pPr>
+            <w:r>
+              <w:rPr>
+                <w:rFonts w:ascii="Courier New" w:hAnsi="Courier New"/>
+                <w:color w:val="E2E8F0"/>
+                <w:sz w:val="17"/>
+              </w:rPr>
+              <w:t xml:space="preserve">| | | | |\  </w:t>
+            </w:r>
+          </w:p>
+          <w:p>
+            <w:pPr>
+              <w:spacing w:after="0"/>
+              <w:rPr>
+                <w:rFonts w:ascii="Courier New" w:hAnsi="Courier New"/>
+                <w:color w:val="E2E8F0"/>
+                <w:sz w:val="17"/>
+              </w:rPr>
+            </w:pPr>
+            <w:r>
+              <w:rPr>
+                <w:rFonts w:ascii="Courier New" w:hAnsi="Courier New"/>
+                <w:color w:val="E2E8F0"/>
+                <w:sz w:val="17"/>
+              </w:rPr>
+              <w:t xml:space="preserve">| | | | |/  </w:t>
+            </w:r>
+          </w:p>
+          <w:p>
+            <w:pPr>
+              <w:spacing w:after="0"/>
+              <w:rPr>
+                <w:rFonts w:ascii="Courier New" w:hAnsi="Courier New"/>
+                <w:color w:val="E2E8F0"/>
+                <w:sz w:val="17"/>
+              </w:rPr>
+            </w:pPr>
+            <w:r>
+              <w:rPr>
+                <w:rFonts w:ascii="Courier New" w:hAnsi="Courier New"/>
+                <w:color w:val="E2E8F0"/>
+                <w:sz w:val="17"/>
+              </w:rPr>
+              <w:t xml:space="preserve">| | | |/|   </w:t>
+            </w:r>
+          </w:p>
+          <w:p>
+            <w:pPr>
+              <w:spacing w:after="0"/>
+              <w:rPr>
+                <w:rFonts w:ascii="Courier New" w:hAnsi="Courier New"/>
+                <w:color w:val="E2E8F0"/>
+                <w:sz w:val="17"/>
+              </w:rPr>
+            </w:pPr>
+            <w:r>
+              <w:rPr>
+                <w:rFonts w:ascii="Courier New" w:hAnsi="Courier New"/>
+                <w:color w:val="E2E8F0"/>
+                <w:sz w:val="17"/>
+              </w:rPr>
+              <w:t>| | | * | 12111ff docs(PDF): dev-3 reflection update</w:t>
+            </w:r>
+          </w:p>
+          <w:p>
+            <w:pPr>
+              <w:spacing w:after="0"/>
+              <w:rPr>
+                <w:rFonts w:ascii="Courier New" w:hAnsi="Courier New"/>
+                <w:color w:val="E2E8F0"/>
+                <w:sz w:val="17"/>
+              </w:rPr>
+            </w:pPr>
+            <w:r>
+              <w:rPr>
+                <w:rFonts w:ascii="Courier New" w:hAnsi="Courier New"/>
+                <w:color w:val="E2E8F0"/>
+                <w:sz w:val="17"/>
+              </w:rPr>
+              <w:t>| | | * | 496ecb8 chore: add .code-workspace to .gitignore</w:t>
+            </w:r>
+          </w:p>
+          <w:p>
+            <w:pPr>
+              <w:spacing w:after="0"/>
+              <w:rPr>
+                <w:rFonts w:ascii="Courier New" w:hAnsi="Courier New"/>
+                <w:color w:val="E2E8F0"/>
+                <w:sz w:val="17"/>
+              </w:rPr>
+            </w:pPr>
+            <w:r>
+              <w:rPr>
+                <w:rFonts w:ascii="Courier New" w:hAnsi="Courier New"/>
+                <w:color w:val="E2E8F0"/>
+                <w:sz w:val="17"/>
+              </w:rPr>
+              <w:t>| | | * | b1f74fe chore: Upload screenshots to screenshots folder from section 2 and 3</w:t>
+            </w:r>
+          </w:p>
+          <w:p>
+            <w:pPr>
+              <w:spacing w:after="0"/>
+              <w:rPr>
+                <w:rFonts w:ascii="Courier New" w:hAnsi="Courier New"/>
+                <w:color w:val="E2E8F0"/>
+                <w:sz w:val="17"/>
+              </w:rPr>
+            </w:pPr>
+            <w:r>
+              <w:rPr>
+                <w:rFonts w:ascii="Courier New" w:hAnsi="Courier New"/>
+                <w:color w:val="E2E8F0"/>
+                <w:sz w:val="17"/>
+              </w:rPr>
+              <w:t>| | | * |   abb9e18 initial updates</w:t>
+            </w:r>
+          </w:p>
+          <w:p>
+            <w:pPr>
+              <w:spacing w:after="0"/>
+              <w:rPr>
+                <w:rFonts w:ascii="Courier New" w:hAnsi="Courier New"/>
+                <w:color w:val="E2E8F0"/>
+                <w:sz w:val="17"/>
+              </w:rPr>
+            </w:pPr>
+            <w:r>
+              <w:rPr>
+                <w:rFonts w:ascii="Courier New" w:hAnsi="Courier New"/>
+                <w:color w:val="E2E8F0"/>
+                <w:sz w:val="17"/>
+              </w:rPr>
+              <w:t xml:space="preserve">| | | |\ \  </w:t>
+            </w:r>
+          </w:p>
+          <w:p>
+            <w:pPr>
+              <w:spacing w:after="0"/>
+              <w:rPr>
+                <w:rFonts w:ascii="Courier New" w:hAnsi="Courier New"/>
+                <w:color w:val="E2E8F0"/>
+                <w:sz w:val="17"/>
+              </w:rPr>
+            </w:pPr>
+            <w:r>
+              <w:rPr>
+                <w:rFonts w:ascii="Courier New" w:hAnsi="Courier New"/>
+                <w:color w:val="E2E8F0"/>
+                <w:sz w:val="17"/>
+              </w:rPr>
+              <w:t>| | | * \ \   c04a720 Merge branch 'main' of https://github.com/edborja/Laboratory-Task-Professional-Development-Environment-Setup-Collaborative-Git-Workflow into mymitz</w:t>
+            </w:r>
+          </w:p>
+          <w:p>
+            <w:pPr>
+              <w:spacing w:after="0"/>
+              <w:rPr>
+                <w:rFonts w:ascii="Courier New" w:hAnsi="Courier New"/>
+                <w:color w:val="E2E8F0"/>
+                <w:sz w:val="17"/>
+              </w:rPr>
+            </w:pPr>
+            <w:r>
+              <w:rPr>
+                <w:rFonts w:ascii="Courier New" w:hAnsi="Courier New"/>
+                <w:color w:val="E2E8F0"/>
+                <w:sz w:val="17"/>
+              </w:rPr>
+              <w:t xml:space="preserve">| | | |\ \ \  </w:t>
+            </w:r>
+          </w:p>
+          <w:p>
+            <w:pPr>
+              <w:spacing w:after="0"/>
+              <w:rPr>
+                <w:rFonts w:ascii="Courier New" w:hAnsi="Courier New"/>
+                <w:color w:val="E2E8F0"/>
+                <w:sz w:val="17"/>
+              </w:rPr>
+            </w:pPr>
+            <w:r>
+              <w:rPr>
+                <w:rFonts w:ascii="Courier New" w:hAnsi="Courier New"/>
+                <w:color w:val="E2E8F0"/>
+                <w:sz w:val="17"/>
+              </w:rPr>
+              <w:t xml:space="preserve">| |_|_|/ / /  </w:t>
+            </w:r>
+          </w:p>
+          <w:p>
+            <w:pPr>
+              <w:spacing w:after="0"/>
+              <w:rPr>
+                <w:rFonts w:ascii="Courier New" w:hAnsi="Courier New"/>
+                <w:color w:val="E2E8F0"/>
+                <w:sz w:val="17"/>
+              </w:rPr>
+            </w:pPr>
+            <w:r>
+              <w:rPr>
+                <w:rFonts w:ascii="Courier New" w:hAnsi="Courier New"/>
+                <w:color w:val="E2E8F0"/>
+                <w:sz w:val="17"/>
+              </w:rPr>
+              <w:t xml:space="preserve">|/| | | | |   </w:t>
+            </w:r>
+          </w:p>
+          <w:p>
+            <w:pPr>
+              <w:spacing w:after="0"/>
+              <w:rPr>
+                <w:rFonts w:ascii="Courier New" w:hAnsi="Courier New"/>
+                <w:color w:val="E2E8F0"/>
+                <w:sz w:val="17"/>
+              </w:rPr>
+            </w:pPr>
+            <w:r>
+              <w:rPr>
+                <w:rFonts w:ascii="Courier New" w:hAnsi="Courier New"/>
+                <w:color w:val="E2E8F0"/>
+                <w:sz w:val="17"/>
+              </w:rPr>
+              <w:t>| | | * | | b5502bb Initial update</w:t>
+            </w:r>
+          </w:p>
+          <w:p>
+            <w:pPr>
+              <w:spacing w:after="0"/>
+              <w:rPr>
+                <w:rFonts w:ascii="Courier New" w:hAnsi="Courier New"/>
+                <w:color w:val="E2E8F0"/>
+                <w:sz w:val="17"/>
+              </w:rPr>
+            </w:pPr>
+            <w:r>
+              <w:rPr>
+                <w:rFonts w:ascii="Courier New" w:hAnsi="Courier New"/>
+                <w:color w:val="E2E8F0"/>
+                <w:sz w:val="17"/>
+              </w:rPr>
+              <w:lastRenderedPageBreak/>
+              <w:t xml:space="preserve">| | |/ / /  </w:t>
+            </w:r>
+          </w:p>
+          <w:p>
+            <w:pPr>
+              <w:spacing w:after="0"/>
+              <w:rPr>
+                <w:rFonts w:ascii="Courier New" w:hAnsi="Courier New"/>
+                <w:color w:val="E2E8F0"/>
+                <w:sz w:val="17"/>
+              </w:rPr>
+            </w:pPr>
+            <w:r>
+              <w:rPr>
+                <w:rFonts w:ascii="Courier New" w:hAnsi="Courier New"/>
+                <w:color w:val="E2E8F0"/>
+                <w:sz w:val="17"/>
+              </w:rPr>
+              <w:t xml:space="preserve">| |/| | |   </w:t>
+            </w:r>
+          </w:p>
+          <w:p>
+            <w:pPr>
+              <w:spacing w:after="0"/>
+              <w:rPr>
+                <w:rFonts w:ascii="Courier New" w:hAnsi="Courier New"/>
+                <w:color w:val="E2E8F0"/>
+                <w:sz w:val="17"/>
+              </w:rPr>
+            </w:pPr>
+            <w:r>
+              <w:rPr>
+                <w:rFonts w:ascii="Courier New" w:hAnsi="Courier New"/>
+                <w:color w:val="E2E8F0"/>
+                <w:sz w:val="17"/>
+              </w:rPr>
+              <w:t>| | | | * bdadaf5 docs(PDF): dev-3 reflectios updated)</w:t>
+            </w:r>
+          </w:p>
+          <w:p>
+            <w:pPr>
+              <w:spacing w:after="0"/>
+              <w:rPr>
+                <w:rFonts w:ascii="Courier New" w:hAnsi="Courier New"/>
+                <w:color w:val="E2E8F0"/>
+                <w:sz w:val="17"/>
+              </w:rPr>
+            </w:pPr>
+            <w:r>
+              <w:rPr>
+                <w:rFonts w:ascii="Courier New" w:hAnsi="Courier New"/>
+                <w:color w:val="E2E8F0"/>
+                <w:sz w:val="17"/>
+              </w:rPr>
+              <w:t xml:space="preserve">| | | |/  </w:t>
+            </w:r>
+          </w:p>
+          <w:p>
+            <w:pPr>
+              <w:spacing w:after="0"/>
+              <w:rPr>
+                <w:rFonts w:ascii="Courier New" w:hAnsi="Courier New"/>
+                <w:color w:val="E2E8F0"/>
+                <w:sz w:val="17"/>
+              </w:rPr>
+            </w:pPr>
+            <w:r>
+              <w:rPr>
+                <w:rFonts w:ascii="Courier New" w:hAnsi="Courier New"/>
+                <w:color w:val="E2E8F0"/>
+                <w:sz w:val="17"/>
+              </w:rPr>
+              <w:t>| | | * 06267dc chore: Initial update for appendix</w:t>
+            </w:r>
+          </w:p>
+          <w:p>
+            <w:pPr>
+              <w:spacing w:after="0"/>
+              <w:rPr>
+                <w:rFonts w:ascii="Courier New" w:hAnsi="Courier New"/>
+                <w:color w:val="E2E8F0"/>
+                <w:sz w:val="17"/>
+              </w:rPr>
+            </w:pPr>
+            <w:r>
+              <w:rPr>
+                <w:rFonts w:ascii="Courier New" w:hAnsi="Courier New"/>
+                <w:color w:val="E2E8F0"/>
+                <w:sz w:val="17"/>
+              </w:rPr>
+              <w:t xml:space="preserve">| | |/  </w:t>
+            </w:r>
+          </w:p>
+          <w:p>
+            <w:pPr>
+              <w:spacing w:after="0"/>
+              <w:rPr>
+                <w:rFonts w:ascii="Courier New" w:hAnsi="Courier New"/>
+                <w:color w:val="E2E8F0"/>
+                <w:sz w:val="17"/>
+              </w:rPr>
+            </w:pPr>
+            <w:r>
+              <w:rPr>
+                <w:rFonts w:ascii="Courier New" w:hAnsi="Courier New"/>
+                <w:color w:val="E2E8F0"/>
+                <w:sz w:val="17"/>
+              </w:rPr>
+              <w:t>| | * 43f5e30 chore: delete temporary document from github repo</w:t>
+            </w:r>
+          </w:p>
+          <w:p>
+            <w:pPr>
+              <w:spacing w:after="0"/>
+              <w:rPr>
+                <w:rFonts w:ascii="Courier New" w:hAnsi="Courier New"/>
+                <w:color w:val="E2E8F0"/>
+                <w:sz w:val="17"/>
+              </w:rPr>
+            </w:pPr>
+            <w:r>
+              <w:rPr>
+                <w:rFonts w:ascii="Courier New" w:hAnsi="Courier New"/>
+                <w:color w:val="E2E8F0"/>
+                <w:sz w:val="17"/>
+              </w:rPr>
+              <w:t>| | * b4d074a chore: update .gitignore for temporary documents</w:t>
+            </w:r>
+          </w:p>
+          <w:p>
+            <w:pPr>
+              <w:spacing w:after="0"/>
+              <w:rPr>
+                <w:rFonts w:ascii="Courier New" w:hAnsi="Courier New"/>
+                <w:color w:val="E2E8F0"/>
+                <w:sz w:val="17"/>
+              </w:rPr>
+            </w:pPr>
+            <w:r>
+              <w:rPr>
+                <w:rFonts w:ascii="Courier New" w:hAnsi="Courier New"/>
+                <w:color w:val="E2E8F0"/>
+                <w:sz w:val="17"/>
+              </w:rPr>
+              <w:t xml:space="preserve">| |/  </w:t>
+            </w:r>
+          </w:p>
+          <w:p>
+            <w:pPr>
+              <w:spacing w:after="0"/>
+              <w:rPr>
+                <w:rFonts w:ascii="Courier New" w:hAnsi="Courier New"/>
+                <w:color w:val="E2E8F0"/>
+                <w:sz w:val="17"/>
+              </w:rPr>
+            </w:pPr>
+            <w:r>
+              <w:rPr>
+                <w:rFonts w:ascii="Courier New" w:hAnsi="Courier New"/>
+                <w:color w:val="E2E8F0"/>
+                <w:sz w:val="17"/>
+              </w:rPr>
+              <w:t xml:space="preserve">|/|   </w:t>
+            </w:r>
+          </w:p>
+          <w:p>
+            <w:pPr>
+              <w:spacing w:after="0"/>
+              <w:rPr>
+                <w:rFonts w:ascii="Courier New" w:hAnsi="Courier New"/>
+                <w:color w:val="E2E8F0"/>
+                <w:sz w:val="17"/>
+              </w:rPr>
+            </w:pPr>
+            <w:r>
+              <w:rPr>
+                <w:rFonts w:ascii="Courier New" w:hAnsi="Courier New"/>
+                <w:color w:val="E2E8F0"/>
+                <w:sz w:val="17"/>
+              </w:rPr>
+              <w:t>* | e8d6880 docx(PDF): Reformat document and update dev-1 reflection</w:t>
+            </w:r>
+          </w:p>
+          <w:p>
+            <w:pPr>
+              <w:spacing w:after="0"/>
+              <w:rPr>
+                <w:rFonts w:ascii="Courier New" w:hAnsi="Courier New"/>
+                <w:color w:val="E2E8F0"/>
+                <w:sz w:val="17"/>
+              </w:rPr>
+            </w:pPr>
+            <w:r>
+              <w:rPr>
+                <w:rFonts w:ascii="Courier New" w:hAnsi="Courier New"/>
+                <w:color w:val="E2E8F0"/>
+                <w:sz w:val="17"/>
+              </w:rPr>
+              <w:t>* | 61d7554 Delete ~$CS106_Lab01_Report_Barandon_Borja_Musa.docx</w:t>
+            </w:r>
+          </w:p>
+          <w:p>
+            <w:pPr>
+              <w:spacing w:after="0"/>
+              <w:rPr>
+                <w:rFonts w:ascii="Courier New" w:hAnsi="Courier New"/>
+                <w:color w:val="E2E8F0"/>
+                <w:sz w:val="17"/>
+              </w:rPr>
+            </w:pPr>
+            <w:r>
+              <w:rPr>
+                <w:rFonts w:ascii="Courier New" w:hAnsi="Courier New"/>
+                <w:color w:val="E2E8F0"/>
+                <w:sz w:val="17"/>
+              </w:rPr>
+              <w:t>* | 1b7062a docs(pdf): Reformat document and update dev-1 reflection</w:t>
+            </w:r>
+          </w:p>
+          <w:p>
+            <w:pPr>
+              <w:spacing w:after="0"/>
+              <w:rPr>
+                <w:rFonts w:ascii="Courier New" w:hAnsi="Courier New"/>
+                <w:color w:val="E2E8F0"/>
+                <w:sz w:val="17"/>
+              </w:rPr>
+            </w:pPr>
+            <w:r>
+              <w:rPr>
+                <w:rFonts w:ascii="Courier New" w:hAnsi="Courier New"/>
+                <w:color w:val="E2E8F0"/>
+                <w:sz w:val="17"/>
+              </w:rPr>
+              <w:t>* | 8fd02bc Delete ~$CS106_Lab01_Report_Barandon_Borja_Musa.docx</w:t>
+            </w:r>
+          </w:p>
+          <w:p>
+            <w:pPr>
+              <w:spacing w:after="0"/>
+              <w:rPr>
+                <w:rFonts w:ascii="Courier New" w:hAnsi="Courier New"/>
+                <w:color w:val="E2E8F0"/>
+                <w:sz w:val="17"/>
+              </w:rPr>
+            </w:pPr>
+            <w:r>
+              <w:rPr>
+                <w:rFonts w:ascii="Courier New" w:hAnsi="Courier New"/>
+                <w:color w:val="E2E8F0"/>
+                <w:sz w:val="17"/>
+              </w:rPr>
+              <w:t>* | 22160dc docs(pdf): Reformat document and update dev-1 reflection</w:t>
             </w:r>
           </w:p>
           <w:p>
@@ -3373,6 +4032,456 @@
                 <w:color w:val="E2E8F0"/>
                 <w:sz w:val="17"/>
               </w:rPr>
+              <w:t>* edaa510 Delete temporary Word lock file from GitHub</w:t>
+            </w:r>
+          </w:p>
+          <w:p>
+            <w:pPr>
+              <w:spacing w:after="0"/>
+              <w:rPr>
+                <w:rFonts w:ascii="Courier New" w:hAnsi="Courier New"/>
+                <w:color w:val="E2E8F0"/>
+                <w:sz w:val="17"/>
+              </w:rPr>
+            </w:pPr>
+            <w:r>
+              <w:rPr>
+                <w:rFonts w:ascii="Courier New" w:hAnsi="Courier New"/>
+                <w:color w:val="E2E8F0"/>
+                <w:sz w:val="17"/>
+              </w:rPr>
+              <w:t>*   2366542 -</w:t>
+            </w:r>
+          </w:p>
+          <w:p>
+            <w:pPr>
+              <w:spacing w:after="0"/>
+              <w:rPr>
+                <w:rFonts w:ascii="Courier New" w:hAnsi="Courier New"/>
+                <w:color w:val="E2E8F0"/>
+                <w:sz w:val="17"/>
+              </w:rPr>
+            </w:pPr>
+            <w:r>
+              <w:rPr>
+                <w:rFonts w:ascii="Courier New" w:hAnsi="Courier New"/>
+                <w:color w:val="E2E8F0"/>
+                <w:sz w:val="17"/>
+              </w:rPr>
+              <w:t xml:space="preserve">|\  </w:t>
+            </w:r>
+          </w:p>
+          <w:p>
+            <w:pPr>
+              <w:spacing w:after="0"/>
+              <w:rPr>
+                <w:rFonts w:ascii="Courier New" w:hAnsi="Courier New"/>
+                <w:color w:val="E2E8F0"/>
+                <w:sz w:val="17"/>
+              </w:rPr>
+            </w:pPr>
+            <w:r>
+              <w:rPr>
+                <w:rFonts w:ascii="Courier New" w:hAnsi="Courier New"/>
+                <w:color w:val="E2E8F0"/>
+                <w:sz w:val="17"/>
+              </w:rPr>
+              <w:t>| * 53a5377 Reflection</w:t>
+            </w:r>
+          </w:p>
+          <w:p>
+            <w:pPr>
+              <w:spacing w:after="0"/>
+              <w:rPr>
+                <w:rFonts w:ascii="Courier New" w:hAnsi="Courier New"/>
+                <w:color w:val="E2E8F0"/>
+                <w:sz w:val="17"/>
+              </w:rPr>
+            </w:pPr>
+            <w:r>
+              <w:rPr>
+                <w:rFonts w:ascii="Courier New" w:hAnsi="Courier New"/>
+                <w:color w:val="E2E8F0"/>
+                <w:sz w:val="17"/>
+              </w:rPr>
+              <w:t>* | bfea81c Branch name, Images, Reflection</w:t>
+            </w:r>
+          </w:p>
+          <w:p>
+            <w:pPr>
+              <w:spacing w:after="0"/>
+              <w:rPr>
+                <w:rFonts w:ascii="Courier New" w:hAnsi="Courier New"/>
+                <w:color w:val="E2E8F0"/>
+                <w:sz w:val="17"/>
+              </w:rPr>
+            </w:pPr>
+            <w:r>
+              <w:rPr>
+                <w:rFonts w:ascii="Courier New" w:hAnsi="Courier New"/>
+                <w:color w:val="E2E8F0"/>
+                <w:sz w:val="17"/>
+              </w:rPr>
+              <w:t>* | 69514ff Merge branch 'main' of https://github.com/edborja/Laboratory-Task-Professional-Development-Environment-Setup-Collaborative-Git-Workflow</w:t>
+            </w:r>
+          </w:p>
+          <w:p>
+            <w:pPr>
+              <w:spacing w:after="0"/>
+              <w:rPr>
+                <w:rFonts w:ascii="Courier New" w:hAnsi="Courier New"/>
+                <w:color w:val="E2E8F0"/>
+                <w:sz w:val="17"/>
+              </w:rPr>
+            </w:pPr>
+            <w:r>
+              <w:rPr>
+                <w:rFonts w:ascii="Courier New" w:hAnsi="Courier New"/>
+                <w:color w:val="E2E8F0"/>
+                <w:sz w:val="17"/>
+              </w:rPr>
+              <w:t xml:space="preserve">|\| </w:t>
+            </w:r>
+          </w:p>
+          <w:p>
+            <w:pPr>
+              <w:spacing w:after="0"/>
+              <w:rPr>
+                <w:rFonts w:ascii="Courier New" w:hAnsi="Courier New"/>
+                <w:color w:val="E2E8F0"/>
+                <w:sz w:val="17"/>
+              </w:rPr>
+            </w:pPr>
+            <w:r>
+              <w:rPr>
+                <w:rFonts w:ascii="Courier New" w:hAnsi="Courier New"/>
+                <w:color w:val="E2E8F0"/>
+                <w:sz w:val="17"/>
+              </w:rPr>
+              <w:t>| * 873a2b1 Remove temporary Word lock file</w:t>
+            </w:r>
+          </w:p>
+          <w:p>
+            <w:pPr>
+              <w:spacing w:after="0"/>
+              <w:rPr>
+                <w:rFonts w:ascii="Courier New" w:hAnsi="Courier New"/>
+                <w:color w:val="E2E8F0"/>
+                <w:sz w:val="17"/>
+              </w:rPr>
+            </w:pPr>
+            <w:r>
+              <w:rPr>
+                <w:rFonts w:ascii="Courier New" w:hAnsi="Courier New"/>
+                <w:color w:val="E2E8F0"/>
+                <w:sz w:val="17"/>
+              </w:rPr>
+              <w:t>* | 3c167b8 Merge branch 'main' of https://github.com/edborja/Laboratory-Task-Professional-Development-Environment-Setup-Collaborative-Git-Workflow</w:t>
+            </w:r>
+          </w:p>
+          <w:p>
+            <w:pPr>
+              <w:spacing w:after="0"/>
+              <w:rPr>
+                <w:rFonts w:ascii="Courier New" w:hAnsi="Courier New"/>
+                <w:color w:val="E2E8F0"/>
+                <w:sz w:val="17"/>
+              </w:rPr>
+            </w:pPr>
+            <w:r>
+              <w:rPr>
+                <w:rFonts w:ascii="Courier New" w:hAnsi="Courier New"/>
+                <w:color w:val="E2E8F0"/>
+                <w:sz w:val="17"/>
+              </w:rPr>
+              <w:t xml:space="preserve">|\| </w:t>
+            </w:r>
+          </w:p>
+          <w:p>
+            <w:pPr>
+              <w:spacing w:after="0"/>
+              <w:rPr>
+                <w:rFonts w:ascii="Courier New" w:hAnsi="Courier New"/>
+                <w:color w:val="E2E8F0"/>
+                <w:sz w:val="17"/>
+              </w:rPr>
+            </w:pPr>
+            <w:r>
+              <w:rPr>
+                <w:rFonts w:ascii="Courier New" w:hAnsi="Courier New"/>
+                <w:color w:val="E2E8F0"/>
+                <w:sz w:val="17"/>
+              </w:rPr>
+              <w:t>| *   6436231 Resolve Word doc conflict</w:t>
+            </w:r>
+          </w:p>
+          <w:p>
+            <w:pPr>
+              <w:spacing w:after="0"/>
+              <w:rPr>
+                <w:rFonts w:ascii="Courier New" w:hAnsi="Courier New"/>
+                <w:color w:val="E2E8F0"/>
+                <w:sz w:val="17"/>
+              </w:rPr>
+            </w:pPr>
+            <w:r>
+              <w:rPr>
+                <w:rFonts w:ascii="Courier New" w:hAnsi="Courier New"/>
+                <w:color w:val="E2E8F0"/>
+                <w:sz w:val="17"/>
+              </w:rPr>
+              <w:t xml:space="preserve">| |\  </w:t>
+            </w:r>
+          </w:p>
+          <w:p>
+            <w:pPr>
+              <w:spacing w:after="0"/>
+              <w:rPr>
+                <w:rFonts w:ascii="Courier New" w:hAnsi="Courier New"/>
+                <w:color w:val="E2E8F0"/>
+                <w:sz w:val="17"/>
+              </w:rPr>
+            </w:pPr>
+            <w:r>
+              <w:rPr>
+                <w:rFonts w:ascii="Courier New" w:hAnsi="Courier New"/>
+                <w:color w:val="E2E8F0"/>
+                <w:sz w:val="17"/>
+              </w:rPr>
+              <w:t>| * | 12d6e12 Initial commit</w:t>
+            </w:r>
+          </w:p>
+          <w:p>
+            <w:pPr>
+              <w:spacing w:after="0"/>
+              <w:rPr>
+                <w:rFonts w:ascii="Courier New" w:hAnsi="Courier New"/>
+                <w:color w:val="E2E8F0"/>
+                <w:sz w:val="17"/>
+              </w:rPr>
+            </w:pPr>
+            <w:r>
+              <w:rPr>
+                <w:rFonts w:ascii="Courier New" w:hAnsi="Courier New"/>
+                <w:color w:val="E2E8F0"/>
+                <w:sz w:val="17"/>
+              </w:rPr>
+              <w:t>* | | f6b9514 docs(pdf): Update appendix</w:t>
+            </w:r>
+          </w:p>
+          <w:p>
+            <w:pPr>
+              <w:spacing w:after="0"/>
+              <w:rPr>
+                <w:rFonts w:ascii="Courier New" w:hAnsi="Courier New"/>
+                <w:color w:val="E2E8F0"/>
+                <w:sz w:val="17"/>
+              </w:rPr>
+            </w:pPr>
+            <w:r>
+              <w:rPr>
+                <w:rFonts w:ascii="Courier New" w:hAnsi="Courier New"/>
+                <w:color w:val="E2E8F0"/>
+                <w:sz w:val="17"/>
+              </w:rPr>
+              <w:t>* | |   d242a8f Merge branch 'mymitz' Update documents</w:t>
+            </w:r>
+          </w:p>
+          <w:p>
+            <w:pPr>
+              <w:spacing w:after="0"/>
+              <w:rPr>
+                <w:rFonts w:ascii="Courier New" w:hAnsi="Courier New"/>
+                <w:color w:val="E2E8F0"/>
+                <w:sz w:val="17"/>
+              </w:rPr>
+            </w:pPr>
+            <w:r>
+              <w:rPr>
+                <w:rFonts w:ascii="Courier New" w:hAnsi="Courier New"/>
+                <w:color w:val="E2E8F0"/>
+                <w:sz w:val="17"/>
+              </w:rPr>
+              <w:t xml:space="preserve">|\ \ \  </w:t>
+            </w:r>
+          </w:p>
+          <w:p>
+            <w:pPr>
+              <w:spacing w:after="0"/>
+              <w:rPr>
+                <w:rFonts w:ascii="Courier New" w:hAnsi="Courier New"/>
+                <w:color w:val="E2E8F0"/>
+                <w:sz w:val="17"/>
+              </w:rPr>
+            </w:pPr>
+            <w:r>
+              <w:rPr>
+                <w:rFonts w:ascii="Courier New" w:hAnsi="Courier New"/>
+                <w:color w:val="E2E8F0"/>
+                <w:sz w:val="17"/>
+              </w:rPr>
+              <w:t>| * | | 6ce1b08 docs(pdf): Initial update on contributions in section 5</w:t>
+            </w:r>
+          </w:p>
+          <w:p>
+            <w:pPr>
+              <w:spacing w:after="0"/>
+              <w:rPr>
+                <w:rFonts w:ascii="Courier New" w:hAnsi="Courier New"/>
+                <w:color w:val="E2E8F0"/>
+                <w:sz w:val="17"/>
+              </w:rPr>
+            </w:pPr>
+            <w:r>
+              <w:rPr>
+                <w:rFonts w:ascii="Courier New" w:hAnsi="Courier New"/>
+                <w:color w:val="E2E8F0"/>
+                <w:sz w:val="17"/>
+              </w:rPr>
+              <w:t>| * | | 1e38b80 docs(pdf): Initial update on Appendix</w:t>
+            </w:r>
+          </w:p>
+          <w:p>
+            <w:pPr>
+              <w:spacing w:after="0"/>
+              <w:rPr>
+                <w:rFonts w:ascii="Courier New" w:hAnsi="Courier New"/>
+                <w:color w:val="E2E8F0"/>
+                <w:sz w:val="17"/>
+              </w:rPr>
+            </w:pPr>
+            <w:r>
+              <w:rPr>
+                <w:rFonts w:ascii="Courier New" w:hAnsi="Courier New"/>
+                <w:color w:val="E2E8F0"/>
+                <w:sz w:val="17"/>
+              </w:rPr>
+              <w:t>| * | | 75e0006 docs(pdf): Update screenshots on Section 1-3</w:t>
+            </w:r>
+          </w:p>
+          <w:p>
+            <w:pPr>
+              <w:spacing w:after="0"/>
+              <w:rPr>
+                <w:rFonts w:ascii="Courier New" w:hAnsi="Courier New"/>
+                <w:color w:val="E2E8F0"/>
+                <w:sz w:val="17"/>
+              </w:rPr>
+            </w:pPr>
+            <w:r>
+              <w:rPr>
+                <w:rFonts w:ascii="Courier New" w:hAnsi="Courier New"/>
+                <w:color w:val="E2E8F0"/>
+                <w:sz w:val="17"/>
+              </w:rPr>
+              <w:t xml:space="preserve">| |/ /  </w:t>
+            </w:r>
+          </w:p>
+          <w:p>
+            <w:pPr>
+              <w:spacing w:after="0"/>
+              <w:rPr>
+                <w:rFonts w:ascii="Courier New" w:hAnsi="Courier New"/>
+                <w:color w:val="E2E8F0"/>
+                <w:sz w:val="17"/>
+              </w:rPr>
+            </w:pPr>
+            <w:r>
+              <w:rPr>
+                <w:rFonts w:ascii="Courier New" w:hAnsi="Courier New"/>
+                <w:color w:val="E2E8F0"/>
+                <w:sz w:val="17"/>
+              </w:rPr>
+              <w:t>* | / 132d036 docs(pdf): Update on contribution in section 5</w:t>
+            </w:r>
+          </w:p>
+          <w:p>
+            <w:pPr>
+              <w:spacing w:after="0"/>
+              <w:rPr>
+                <w:rFonts w:ascii="Courier New" w:hAnsi="Courier New"/>
+                <w:color w:val="E2E8F0"/>
+                <w:sz w:val="17"/>
+              </w:rPr>
+            </w:pPr>
+            <w:r>
+              <w:rPr>
+                <w:rFonts w:ascii="Courier New" w:hAnsi="Courier New"/>
+                <w:color w:val="E2E8F0"/>
+                <w:sz w:val="17"/>
+              </w:rPr>
+              <w:t xml:space="preserve">| |/  </w:t>
+            </w:r>
+          </w:p>
+          <w:p>
+            <w:pPr>
+              <w:spacing w:after="0"/>
+              <w:rPr>
+                <w:rFonts w:ascii="Courier New" w:hAnsi="Courier New"/>
+                <w:color w:val="E2E8F0"/>
+                <w:sz w:val="17"/>
+              </w:rPr>
+            </w:pPr>
+            <w:r>
+              <w:rPr>
+                <w:rFonts w:ascii="Courier New" w:hAnsi="Courier New"/>
+                <w:color w:val="E2E8F0"/>
+                <w:sz w:val="17"/>
+              </w:rPr>
+              <w:t xml:space="preserve">|/|   </w:t>
+            </w:r>
+          </w:p>
+          <w:p>
+            <w:pPr>
+              <w:spacing w:after="0"/>
+              <w:rPr>
+                <w:rFonts w:ascii="Courier New" w:hAnsi="Courier New"/>
+                <w:color w:val="E2E8F0"/>
+                <w:sz w:val="17"/>
+              </w:rPr>
+            </w:pPr>
+            <w:r>
+              <w:rPr>
+                <w:rFonts w:ascii="Courier New" w:hAnsi="Courier New"/>
+                <w:color w:val="E2E8F0"/>
+                <w:sz w:val="17"/>
+              </w:rPr>
+              <w:t>* | 5f1dcee docs(pdf): Update screenshots on Section 1-3</w:t>
+            </w:r>
+          </w:p>
+          <w:p>
+            <w:pPr>
+              <w:spacing w:after="0"/>
+              <w:rPr>
+                <w:rFonts w:ascii="Courier New" w:hAnsi="Courier New"/>
+                <w:color w:val="E2E8F0"/>
+                <w:sz w:val="17"/>
+              </w:rPr>
+            </w:pPr>
+            <w:r>
+              <w:rPr>
+                <w:rFonts w:ascii="Courier New" w:hAnsi="Courier New"/>
+                <w:color w:val="E2E8F0"/>
+                <w:sz w:val="17"/>
+              </w:rPr>
+              <w:t xml:space="preserve">|/  </w:t>
+            </w:r>
+          </w:p>
+          <w:p>
+            <w:pPr>
+              <w:spacing w:after="0"/>
+              <w:rPr>
+                <w:rFonts w:ascii="Courier New" w:hAnsi="Courier New"/>
+                <w:color w:val="E2E8F0"/>
+                <w:sz w:val="17"/>
+              </w:rPr>
+            </w:pPr>
+            <w:r>
+              <w:rPr>
+                <w:rFonts w:ascii="Courier New" w:hAnsi="Courier New"/>
+                <w:color w:val="E2E8F0"/>
+                <w:sz w:val="17"/>
+              </w:rPr>
               <w:t>* ee577a8 docs(pdf): Update on initial documents</w:t>
             </w:r>
           </w:p>
@@ -3391,18 +4500,8 @@
                 <w:color w:val="E2E8F0"/>
                 <w:sz w:val="17"/>
               </w:rPr>
-              <w:t xml:space="preserve">* 8a11075 </w:t>
-            </w:r>
-            <w:proofErr w:type="spellStart"/>
-            <w:r>
-              <w:rPr>
-                <w:rFonts w:ascii="Courier New" w:hAnsi="Courier New"/>
-                <w:color w:val="E2E8F0"/>
-                <w:sz w:val="17"/>
-              </w:rPr>
-              <w:t>pfp</w:t>
-            </w:r>
-            <w:proofErr w:type="spellEnd"/>
+              <w:t>* 8a11075 pfp</w:t>
+            </w:r>
           </w:p>
           <w:p>
             <w:pPr>
@@ -3437,61 +4536,25 @@
                 <w:color w:val="E2E8F0"/>
                 <w:sz w:val="17"/>
               </w:rPr>
-              <w:t>* 65b1dc5 Create Ni-</w:t>
-            </w:r>
-            <w:proofErr w:type="spellStart"/>
-            <w:r>
-              <w:rPr>
-                <w:rFonts w:ascii="Courier New" w:hAnsi="Courier New"/>
-                <w:color w:val="E2E8F0"/>
-                <w:sz w:val="17"/>
-              </w:rPr>
-              <w:t>Git.code</w:t>
-            </w:r>
-            <w:proofErr w:type="spellEnd"/>
-            <w:r>
-              <w:rPr>
-                <w:rFonts w:ascii="Courier New" w:hAnsi="Courier New"/>
-                <w:color w:val="E2E8F0"/>
-                <w:sz w:val="17"/>
-              </w:rPr>
-              <w:t>-workspace</w:t>
-            </w:r>
-          </w:p>
-          <w:p>
-            <w:pPr>
-              <w:spacing w:after="0"/>
-              <w:rPr>
-                <w:rFonts w:ascii="Courier New" w:hAnsi="Courier New"/>
-                <w:color w:val="E2E8F0"/>
-                <w:sz w:val="17"/>
-              </w:rPr>
-            </w:pPr>
-            <w:r>
-              <w:rPr>
-                <w:rFonts w:ascii="Courier New" w:hAnsi="Courier New"/>
-                <w:color w:val="E2E8F0"/>
-                <w:sz w:val="17"/>
-              </w:rPr>
-              <w:t xml:space="preserve">* c0cf354 </w:t>
-            </w:r>
-            <w:proofErr w:type="gramStart"/>
-            <w:r>
-              <w:rPr>
-                <w:rFonts w:ascii="Courier New" w:hAnsi="Courier New"/>
-                <w:color w:val="E2E8F0"/>
-                <w:sz w:val="17"/>
-              </w:rPr>
-              <w:t>Small</w:t>
-            </w:r>
-            <w:proofErr w:type="gramEnd"/>
-            <w:r>
-              <w:rPr>
-                <w:rFonts w:ascii="Courier New" w:hAnsi="Courier New"/>
-                <w:color w:val="E2E8F0"/>
-                <w:sz w:val="17"/>
-              </w:rPr>
-              <w:t xml:space="preserve"> change and update of my profile, no major changes yet</w:t>
+              <w:t>* 65b1dc5 Create Ni-Git.code-workspace</w:t>
+            </w:r>
+          </w:p>
+          <w:p>
+            <w:pPr>
+              <w:spacing w:after="0"/>
+              <w:rPr>
+                <w:rFonts w:ascii="Courier New" w:hAnsi="Courier New"/>
+                <w:color w:val="E2E8F0"/>
+                <w:sz w:val="17"/>
+              </w:rPr>
+            </w:pPr>
+            <w:r>
+              <w:rPr>
+                <w:rFonts w:ascii="Courier New" w:hAnsi="Courier New"/>
+                <w:color w:val="E2E8F0"/>
+                <w:sz w:val="17"/>
+              </w:rPr>
+              <w:t>* c0cf354 Small change and update of my profile, no major changes yet</w:t>
             </w:r>
           </w:p>
           <w:p>

</xml_diff>